<commit_message>
Fill agreement drafts from VQ-BOO commercial proposal
Update EN/RU service agreements with aircraft VQ-BOO, CFM56-3/APS2000
scope, USD 24,000 price breakdown, 3-day timeline, Istanbul address,
and attach the Commercial Proposal PDF as Annex source.

Co-authored-by: alexanderp-cell <alexanderp-cell@users.noreply.github.com>
</commit_message>
<xml_diff>
--- a/agreements/Dogovor_JT-BSI-2026_RU.docx
+++ b/agreements/Dogovor_JT-BSI-2026_RU.docx
@@ -4,7 +4,7 @@
   <w:body>
     <w:p>
       <w:pPr>
-        <w:spacing w:before="0" w:after="40" w:line="259" w:lineRule="auto"/>
+        <w:spacing w:before="0" w:after="20" w:line="252" w:lineRule="auto"/>
         <w:jc w:val="center"/>
       </w:pPr>
       <w:r>
@@ -18,7 +18,7 @@
     </w:p>
     <w:p>
       <w:pPr>
-        <w:spacing w:before="0" w:after="120" w:line="259" w:lineRule="auto"/>
+        <w:spacing w:before="0" w:after="40" w:line="252" w:lineRule="auto"/>
         <w:jc w:val="center"/>
       </w:pPr>
       <w:r>
@@ -32,21 +32,35 @@
     </w:p>
     <w:p>
       <w:pPr>
-        <w:spacing w:before="0" w:after="160" w:line="259" w:lineRule="auto"/>
+        <w:spacing w:before="0" w:after="80" w:line="252" w:lineRule="auto"/>
+        <w:jc w:val="center"/>
+      </w:pPr>
+      <w:r>
+        <w:rPr>
+          <w:rFonts w:ascii="Times New Roman" w:hAnsi="Times New Roman" w:eastAsia="Times New Roman"/>
+          <w:b/>
+          <w:sz w:val="20"/>
+        </w:rPr>
+        <w:t>Воздушное судно: Boeing 737-500, регистрационный знак VQ-BOO</w:t>
+      </w:r>
+    </w:p>
+    <w:p>
+      <w:pPr>
+        <w:spacing w:before="0" w:after="120" w:line="252" w:lineRule="auto"/>
         <w:jc w:val="center"/>
       </w:pPr>
       <w:r>
         <w:rPr>
           <w:rFonts w:ascii="Times New Roman" w:hAnsi="Times New Roman" w:eastAsia="Times New Roman"/>
           <w:b w:val="0"/>
-          <w:sz w:val="20"/>
+          <w:sz w:val="19"/>
         </w:rPr>
         <w:t>Место заключения: ________________    Дата: «____» ____________ 2026 г.</w:t>
       </w:r>
     </w:p>
     <w:p>
       <w:pPr>
-        <w:spacing w:before="0" w:after="120" w:line="259" w:lineRule="auto"/>
+        <w:spacing w:before="0" w:after="80" w:line="252" w:lineRule="auto"/>
         <w:jc w:val="both"/>
       </w:pPr>
       <w:r>
@@ -63,7 +77,7 @@
           <w:b w:val="0"/>
           <w:sz w:val="20"/>
         </w:rPr>
-        <w:t xml:space="preserve"> ([полное фирменное наименование согласно карточке компании], адрес: [адрес], ОГРН/регистрационный номер / ИНН: [●], далее — «</w:t>
+        <w:t xml:space="preserve"> (адрес: Egitim Mahallesi, Fahrettin Kerim Gokay Caddesi, Ortaklar Ishani, No. 71/57, Kadikoy, 34722, Istanbul, Turkey; email: sales@jetechnic.com; регистрационный / налоговый номер: [● — согласно карточке компании], далее — «</w:t>
       </w:r>
       <w:r>
         <w:rPr>
@@ -84,7 +98,7 @@
     </w:p>
     <w:p>
       <w:pPr>
-        <w:spacing w:before="0" w:after="80" w:line="259" w:lineRule="auto"/>
+        <w:spacing w:before="0" w:after="60" w:line="252" w:lineRule="auto"/>
         <w:jc w:val="both"/>
       </w:pPr>
       <w:r>
@@ -101,7 +115,7 @@
           <w:b w:val="0"/>
           <w:sz w:val="20"/>
         </w:rPr>
-        <w:t xml:space="preserve"> (адрес: [адрес], регистрационный номер / налоговый идентификатор: [●], далее — «</w:t>
+        <w:t xml:space="preserve"> (адрес: [●], регистрационный / налоговый номер: [●], далее — «</w:t>
       </w:r>
       <w:r>
         <w:rPr>
@@ -122,7 +136,7 @@
     </w:p>
     <w:p>
       <w:pPr>
-        <w:spacing w:before="0" w:after="120" w:line="259" w:lineRule="auto"/>
+        <w:spacing w:before="0" w:after="100" w:line="252" w:lineRule="auto"/>
         <w:jc w:val="both"/>
       </w:pPr>
       <w:r>
@@ -131,12 +145,12 @@
           <w:b w:val="0"/>
           <w:sz w:val="20"/>
         </w:rPr>
-        <w:t>совместно именуемые «Стороны», а по отдельности — «Сторона», заключили настоящий Договор возмездного оказания услуг (далее — «Договор») о нижеследующем:</w:t>
+        <w:t>совместно именуемые «Стороны», заключили настоящий Договор возмездного оказания услуг (далее — «Договор») о нижеследующем:</w:t>
       </w:r>
     </w:p>
     <w:p>
       <w:pPr>
-        <w:spacing w:before="40" w:after="60" w:line="259" w:lineRule="auto"/>
+        <w:spacing w:before="20" w:after="40" w:line="252" w:lineRule="auto"/>
       </w:pPr>
       <w:r>
         <w:rPr>
@@ -149,7 +163,7 @@
     </w:p>
     <w:p>
       <w:pPr>
-        <w:spacing w:before="0" w:after="80" w:line="259" w:lineRule="auto"/>
+        <w:spacing w:before="0" w:after="60" w:line="252" w:lineRule="auto"/>
         <w:jc w:val="both"/>
       </w:pPr>
       <w:r>
@@ -158,12 +172,12 @@
           <w:b w:val="0"/>
           <w:sz w:val="20"/>
         </w:rPr>
-        <w:t>1.1. Исполнитель обязуется оказать, а Заказчик обязуется принять и оплатить следующие услуги (далее — «Услуги»):</w:t>
+        <w:t>1.1. Исполнитель обязуется оказать, а Заказчик обязуется принять и оплатить следующие услуги в отношении Boeing 737-500, регистрационный знак VQ-BOO (далее — «ВС») (далее — «Услуги»):</w:t>
       </w:r>
     </w:p>
     <w:p>
       <w:pPr>
-        <w:spacing w:before="0" w:after="80" w:line="259" w:lineRule="auto"/>
+        <w:spacing w:before="0" w:after="60" w:line="252" w:lineRule="auto"/>
         <w:jc w:val="both"/>
       </w:pPr>
       <w:r>
@@ -172,12 +186,12 @@
           <w:b w:val="0"/>
           <w:sz w:val="20"/>
         </w:rPr>
-        <w:t>(a) инспекцию воздушного судна (планер / визуальная / техническая инспекция в объёме, указанном в Коммерческом предложении);</w:t>
+        <w:t>(a) бороскопическую инспекцию (BSI) двух (2) двигателей CFM56-3 (объём работ уточняется / согласно КП);</w:t>
       </w:r>
     </w:p>
     <w:p>
       <w:pPr>
-        <w:spacing w:before="0" w:after="80" w:line="259" w:lineRule="auto"/>
+        <w:spacing w:before="0" w:after="60" w:line="252" w:lineRule="auto"/>
         <w:jc w:val="both"/>
       </w:pPr>
       <w:r>
@@ -186,12 +200,12 @@
           <w:b w:val="0"/>
           <w:sz w:val="20"/>
         </w:rPr>
-        <w:t>(b) бороскопическую инспекцию (BSI) двигателей воздушного судна; и</w:t>
+        <w:t>(b) бороскопическую инспекцию (BSI) ВСУ APS2000;</w:t>
       </w:r>
     </w:p>
     <w:p>
       <w:pPr>
-        <w:spacing w:before="0" w:after="80" w:line="259" w:lineRule="auto"/>
+        <w:spacing w:before="0" w:after="60" w:line="252" w:lineRule="auto"/>
         <w:jc w:val="both"/>
       </w:pPr>
       <w:r>
@@ -200,12 +214,12 @@
           <w:b w:val="0"/>
           <w:sz w:val="20"/>
         </w:rPr>
-        <w:t>(c) бороскопическую инспекцию (BSI) вспомогательной силовой установки (ВСУ / APU).</w:t>
+        <w:t>(c) общую визуальную инспекцию (GVI) ВС, включая шасси, кабину пассажиров и отсек авионики;</w:t>
       </w:r>
     </w:p>
     <w:p>
       <w:pPr>
-        <w:spacing w:before="0" w:after="80" w:line="259" w:lineRule="auto"/>
+        <w:spacing w:before="0" w:after="60" w:line="252" w:lineRule="auto"/>
         <w:jc w:val="both"/>
       </w:pPr>
       <w:r>
@@ -214,12 +228,12 @@
           <w:b w:val="0"/>
           <w:sz w:val="20"/>
         </w:rPr>
-        <w:t>1.2. Детальный объём, методика, результаты, исключения, стоимость и сроки определены в Коммерческом предложении «BSI JT» от 06.08.2026 (далее — «КП»), являющемся неотъемлемым Приложением № 1 к Договору. При противоречиях приоритет имеет текст Договора, за исключением технического объёма и цены, по которым приоритет имеет КП.</w:t>
+        <w:t>(d) проверку документации по двигателям и ВСУ; и</w:t>
       </w:r>
     </w:p>
     <w:p>
       <w:pPr>
-        <w:spacing w:before="0" w:after="80" w:line="259" w:lineRule="auto"/>
+        <w:spacing w:before="0" w:after="60" w:line="252" w:lineRule="auto"/>
         <w:jc w:val="both"/>
       </w:pPr>
       <w:r>
@@ -228,12 +242,12 @@
           <w:b w:val="0"/>
           <w:sz w:val="20"/>
         </w:rPr>
-        <w:t>1.3. Идентификация ВС (заполняется / по мере наличия данных): Тип / модель: [●]; MSN: [●]; Регистрационный номер: [●]; Двигатели: [тип / ESN ●]; ВСУ: [тип / S/N ●].</w:t>
+        <w:t>(e) связанные транспортные расходы и проживание персонала Исполнителя в объёме, включённом в Цену.</w:t>
       </w:r>
     </w:p>
     <w:p>
       <w:pPr>
-        <w:spacing w:before="0" w:after="80" w:line="259" w:lineRule="auto"/>
+        <w:spacing w:before="0" w:after="60" w:line="252" w:lineRule="auto"/>
         <w:jc w:val="both"/>
       </w:pPr>
       <w:r>
@@ -242,12 +256,40 @@
           <w:b w:val="0"/>
           <w:sz w:val="20"/>
         </w:rPr>
-        <w:t>1.4. Место оказания Услуг: аэропорт Белграда (BEG), Республика Сербия; воздушное судно находится на хранении в ангаре организации JAT Tehnika. Доступ к ВС и ангару обеспечивается Заказчиком и/или с привлечением JAT Tehnika.</w:t>
+        <w:t>1.2. Коммерческое предложение «VQ-BOO BSI and Inspection» / «BSI JT» от 06 августа 2026 г. (далее — «КП») является неотъемлемым Приложением № 1. Технический объём и Цена определяются КП; в остальном приоритет имеет Договор.</w:t>
       </w:r>
     </w:p>
     <w:p>
       <w:pPr>
-        <w:spacing w:before="80" w:after="60" w:line="259" w:lineRule="auto"/>
+        <w:spacing w:before="0" w:after="60" w:line="252" w:lineRule="auto"/>
+        <w:jc w:val="both"/>
+      </w:pPr>
+      <w:r>
+        <w:rPr>
+          <w:rFonts w:ascii="Times New Roman" w:hAnsi="Times New Roman" w:eastAsia="Times New Roman"/>
+          <w:b w:val="0"/>
+          <w:sz w:val="20"/>
+        </w:rPr>
+        <w:t>1.3. Место оказания Услуг: JAT Tehnika, Белград, Республика Сербия (зона аэропорта Белграда). Доступ в зону аэропорта и к ВС обеспечивает Заказчик.</w:t>
+      </w:r>
+    </w:p>
+    <w:p>
+      <w:pPr>
+        <w:spacing w:before="0" w:after="60" w:line="252" w:lineRule="auto"/>
+        <w:jc w:val="both"/>
+      </w:pPr>
+      <w:r>
+        <w:rPr>
+          <w:rFonts w:ascii="Times New Roman" w:hAnsi="Times New Roman" w:eastAsia="Times New Roman"/>
+          <w:b w:val="0"/>
+          <w:sz w:val="20"/>
+        </w:rPr>
+        <w:t>1.4. BSI выполняется сертифицированным инженером. Результат: отчёт(ы) об инспекции / BSI и видеоматериалы по BSI.</w:t>
+      </w:r>
+    </w:p>
+    <w:p>
+      <w:pPr>
+        <w:spacing w:before="60" w:after="40" w:line="252" w:lineRule="auto"/>
       </w:pPr>
       <w:r>
         <w:rPr>
@@ -260,7 +302,7 @@
     </w:p>
     <w:p>
       <w:pPr>
-        <w:spacing w:before="0" w:after="80" w:line="259" w:lineRule="auto"/>
+        <w:spacing w:before="0" w:after="60" w:line="252" w:lineRule="auto"/>
         <w:jc w:val="both"/>
       </w:pPr>
       <w:r>
@@ -269,12 +311,12 @@
           <w:b w:val="0"/>
           <w:sz w:val="20"/>
         </w:rPr>
-        <w:t>2.1. Услуги оказываются в течение [●] рабочих дней с даты наступления более позднего из событий: (i) вступления Договора в силу; (ii) поступления аванса (если применимо); (iii) предоставления Заказчиком / JAT Tehnika доступа к ВС, слота в ангаре и необходимой документации.</w:t>
+        <w:t>2.1. Ориентировочный срок оказания Услуг — 3 (три) дня, начиная с более поздней из дат: (i) вступления Договора в силу; (ii) поступления аванса (при наличии); (iii) предоставления Заказчиком доступа к аэропорту / ВС и необходимой документации.</w:t>
       </w:r>
     </w:p>
     <w:p>
       <w:pPr>
-        <w:spacing w:before="0" w:after="80" w:line="259" w:lineRule="auto"/>
+        <w:spacing w:before="0" w:after="60" w:line="252" w:lineRule="auto"/>
         <w:jc w:val="both"/>
       </w:pPr>
       <w:r>
@@ -283,12 +325,12 @@
           <w:b w:val="0"/>
           <w:sz w:val="20"/>
         </w:rPr>
-        <w:t>2.2. По завершении Исполнитель передаёт письменный отчёт об инспекции / BSI (допускается электронная форма, если иное не согласовано). Заказчик в течение 5 (пяти) рабочих дней подтверждает приёмку либо направляет мотивированные возражения; при молчании Услуги считаются принятыми.</w:t>
+        <w:t>2.2. Заказчик в течение 5 (пяти) рабочих дней подтверждает приёмку отчёта(ов) либо направляет мотивированные возражения; иначе Услуги считаются принятыми.</w:t>
       </w:r>
     </w:p>
     <w:p>
       <w:pPr>
-        <w:spacing w:before="80" w:after="60" w:line="259" w:lineRule="auto"/>
+        <w:spacing w:before="60" w:after="40" w:line="252" w:lineRule="auto"/>
       </w:pPr>
       <w:r>
         <w:rPr>
@@ -301,7 +343,7 @@
     </w:p>
     <w:p>
       <w:pPr>
-        <w:spacing w:before="0" w:after="80" w:line="259" w:lineRule="auto"/>
+        <w:spacing w:before="0" w:after="60" w:line="252" w:lineRule="auto"/>
         <w:jc w:val="both"/>
       </w:pPr>
       <w:r>
@@ -310,12 +352,12 @@
           <w:b w:val="0"/>
           <w:sz w:val="20"/>
         </w:rPr>
-        <w:t>3.1. Общая цена Услуг составляет [сумма цифрами и прописью] [USD / EUR] (далее — «Цена») согласно КП, [без учёта / с учётом] НДС (в соответствии с применимым правом).</w:t>
+        <w:t>3.1. Общая Цена составляет USD 24 000,00 (двадцать четыре тысячи долларов США) без учёта применимых налогов и сборов, в том числе:</w:t>
       </w:r>
     </w:p>
     <w:p>
       <w:pPr>
-        <w:spacing w:before="0" w:after="80" w:line="259" w:lineRule="auto"/>
+        <w:spacing w:before="0" w:after="60" w:line="252" w:lineRule="auto"/>
         <w:jc w:val="both"/>
       </w:pPr>
       <w:r>
@@ -324,12 +366,12 @@
           <w:b w:val="0"/>
           <w:sz w:val="20"/>
         </w:rPr>
-        <w:t>3.2. Порядок оплаты: [например, 100% предоплата / 50% аванс в течение 3 банковских дней с даты счёта и 50% в течение 5 банковских дней после передачи отчёта] путём банковского перевода на счёт Исполнителя, указанный в разделе 10 / карточке компании / счёте.</w:t>
+        <w:t>• BSI CFM56-3 — 2 двигателя (объём TBD) — USD 9 500,00;</w:t>
       </w:r>
     </w:p>
     <w:p>
       <w:pPr>
-        <w:spacing w:before="0" w:after="80" w:line="259" w:lineRule="auto"/>
+        <w:spacing w:before="0" w:after="60" w:line="252" w:lineRule="auto"/>
         <w:jc w:val="both"/>
       </w:pPr>
       <w:r>
@@ -338,12 +380,12 @@
           <w:b w:val="0"/>
           <w:sz w:val="20"/>
         </w:rPr>
-        <w:t>3.3. Работы вне объёма КП (включая дополнительные человеко-часы из-за задержки доступа, неготовности ВС или изменения запросов Заказчика) согласовываются письменно и оплачиваются по ставкам КП либо иным согласованным тарифам.</w:t>
+        <w:t>• BSI ВСУ APS2000 — USD 4 000,00;</w:t>
       </w:r>
     </w:p>
     <w:p>
       <w:pPr>
-        <w:spacing w:before="0" w:after="80" w:line="259" w:lineRule="auto"/>
+        <w:spacing w:before="0" w:after="60" w:line="252" w:lineRule="auto"/>
         <w:jc w:val="both"/>
       </w:pPr>
       <w:r>
@@ -352,12 +394,68 @@
           <w:b w:val="0"/>
           <w:sz w:val="20"/>
         </w:rPr>
-        <w:t>3.4. Командировочные, визовые, локальный транспорт, сборы JAT Tehnika за доступ к ангару / MRO, аэропортовые пропуска и аналогичные расходы третьих лиц [включены в Цену / оплачиваются Заказчиком отдельно по подтверждающим документам] — согласно КП.</w:t>
+        <w:t>• GVI ВС (шасси, кабина, отсек авионики) — USD 3 000,00;</w:t>
       </w:r>
     </w:p>
     <w:p>
       <w:pPr>
-        <w:spacing w:before="80" w:after="60" w:line="259" w:lineRule="auto"/>
+        <w:spacing w:before="0" w:after="60" w:line="252" w:lineRule="auto"/>
+        <w:jc w:val="both"/>
+      </w:pPr>
+      <w:r>
+        <w:rPr>
+          <w:rFonts w:ascii="Times New Roman" w:hAnsi="Times New Roman" w:eastAsia="Times New Roman"/>
+          <w:b w:val="0"/>
+          <w:sz w:val="20"/>
+        </w:rPr>
+        <w:t>• проверка документации (двигатели, ВСУ) — USD 3 500,00;</w:t>
+      </w:r>
+    </w:p>
+    <w:p>
+      <w:pPr>
+        <w:spacing w:before="0" w:after="60" w:line="252" w:lineRule="auto"/>
+        <w:jc w:val="both"/>
+      </w:pPr>
+      <w:r>
+        <w:rPr>
+          <w:rFonts w:ascii="Times New Roman" w:hAnsi="Times New Roman" w:eastAsia="Times New Roman"/>
+          <w:b w:val="0"/>
+          <w:sz w:val="20"/>
+        </w:rPr>
+        <w:t>• транспорт и проживание — USD 4 000,00.</w:t>
+      </w:r>
+    </w:p>
+    <w:p>
+      <w:pPr>
+        <w:spacing w:before="0" w:after="60" w:line="252" w:lineRule="auto"/>
+        <w:jc w:val="both"/>
+      </w:pPr>
+      <w:r>
+        <w:rPr>
+          <w:rFonts w:ascii="Times New Roman" w:hAnsi="Times New Roman" w:eastAsia="Times New Roman"/>
+          <w:b w:val="0"/>
+          <w:sz w:val="20"/>
+        </w:rPr>
+        <w:t>3.2. Оплата: [100% предоплата / 50% аванс в течение 3 банковских дней с даты счёта и 50% в течение 5 банковских дней после передачи отчёта(ов)] банковским переводом на счёт Исполнителя (раздел 10 / счёт). Валюта: USD.</w:t>
+      </w:r>
+    </w:p>
+    <w:p>
+      <w:pPr>
+        <w:spacing w:before="0" w:after="60" w:line="252" w:lineRule="auto"/>
+        <w:jc w:val="both"/>
+      </w:pPr>
+      <w:r>
+        <w:rPr>
+          <w:rFonts w:ascii="Times New Roman" w:hAnsi="Times New Roman" w:eastAsia="Times New Roman"/>
+          <w:b w:val="0"/>
+          <w:sz w:val="20"/>
+        </w:rPr>
+        <w:t>3.3. Работы вне объёма КП (включая доп. время из-за задержки доступа или неготовности ВС) согласовываются письменно и оплачиваются отдельно.</w:t>
+      </w:r>
+    </w:p>
+    <w:p>
+      <w:pPr>
+        <w:spacing w:before="60" w:after="40" w:line="252" w:lineRule="auto"/>
       </w:pPr>
       <w:r>
         <w:rPr>
@@ -370,7 +468,7 @@
     </w:p>
     <w:p>
       <w:pPr>
-        <w:spacing w:before="0" w:after="80" w:line="259" w:lineRule="auto"/>
+        <w:spacing w:before="0" w:after="60" w:line="252" w:lineRule="auto"/>
         <w:jc w:val="both"/>
       </w:pPr>
       <w:r>
@@ -379,12 +477,12 @@
           <w:b w:val="0"/>
           <w:sz w:val="20"/>
         </w:rPr>
-        <w:t>4.1. Исполнитель обязуется: (a) оказать Услуги профессионально, силами квалифицированного персонала и с использованием надлежащего оборудования; (b) соблюдать правила техники безопасности и процедуры ангара JAT Tehnika; (c) передать отчёт в согласованный срок; (d) соблюдать конфиденциальность сведений Заказчика.</w:t>
+        <w:t>4.1. Исполнитель оказывает Услуги профессионально, соблюдает ТБ и процедуры JAT Tehnika, передаёт отчёт(ы) и видеоматериалы BSI.</w:t>
       </w:r>
     </w:p>
     <w:p>
       <w:pPr>
-        <w:spacing w:before="0" w:after="80" w:line="259" w:lineRule="auto"/>
+        <w:spacing w:before="0" w:after="60" w:line="252" w:lineRule="auto"/>
         <w:jc w:val="both"/>
       </w:pPr>
       <w:r>
@@ -393,12 +491,12 @@
           <w:b w:val="0"/>
           <w:sz w:val="20"/>
         </w:rPr>
-        <w:t>4.2. Заказчик обязуется: (a) своевременно обеспечить доступ к ВС, координацию с JAT Tehnika и предоставление технической документации (статус, последние инспекции, данные по двигателям/ВСУ, разрешения); (b) гарантировать полномочия лиц, предоставляющих доступ; (c) оплатить Цену; (d) назначить контактное лицо для оперативной координации.</w:t>
+        <w:t>4.2. Заказчик своевременно обеспечивает доступ в аэропорт и к ВС, координацию с JAT Tehnika, разрешения и необходимую документацию, оплачивает Цену и назначает контактное лицо.</w:t>
       </w:r>
     </w:p>
     <w:p>
       <w:pPr>
-        <w:spacing w:before="0" w:after="80" w:line="259" w:lineRule="auto"/>
+        <w:spacing w:before="0" w:after="60" w:line="252" w:lineRule="auto"/>
         <w:jc w:val="both"/>
       </w:pPr>
       <w:r>
@@ -407,12 +505,12 @@
           <w:b w:val="0"/>
           <w:sz w:val="20"/>
         </w:rPr>
-        <w:t>4.3. Услуги носят инспекционный / диагностический характер и не включают ремонт, устранение неисправностей, подтверждение лётной годности или допуск к эксплуатации, если иное прямо не согласовано письменно. Выводы отчёта основаны на состоянии, наблюдаемом на момент инспекции, и доступном объёме осмотра.</w:t>
+        <w:t>4.3. Услуги носят инспекционный / диагностический характер и не включают ремонт, устранение дефектов, подтверждение лётной годности или допуск к эксплуатации, если иное не согласовано письменно. Выводы основаны на состоянии и доступе на момент инспекции. Объём BSI двигателей подлежит уточнению («TBD»), как указано в КП.</w:t>
       </w:r>
     </w:p>
     <w:p>
       <w:pPr>
-        <w:spacing w:before="80" w:after="60" w:line="259" w:lineRule="auto"/>
+        <w:spacing w:before="60" w:after="40" w:line="252" w:lineRule="auto"/>
       </w:pPr>
       <w:r>
         <w:rPr>
@@ -425,7 +523,7 @@
     </w:p>
     <w:p>
       <w:pPr>
-        <w:spacing w:before="0" w:after="80" w:line="259" w:lineRule="auto"/>
+        <w:spacing w:before="0" w:after="60" w:line="252" w:lineRule="auto"/>
         <w:jc w:val="both"/>
       </w:pPr>
       <w:r>
@@ -434,12 +532,12 @@
           <w:b w:val="0"/>
           <w:sz w:val="20"/>
         </w:rPr>
-        <w:t>5.1. Стороны несут ответственность за нарушение Договора в соответствии с применимым правом с учётом п. 5.2.</w:t>
+        <w:t>5.1. За исключением умысла или грубой неосторожности, совокупная ответственность Исполнителя не превышает фактически уплаченную Цену. Стороны не отвечают за косвенные убытки (включая простой ВС), если иное не вытекает из императивных норм.</w:t>
       </w:r>
     </w:p>
     <w:p>
       <w:pPr>
-        <w:spacing w:before="0" w:after="80" w:line="259" w:lineRule="auto"/>
+        <w:spacing w:before="0" w:after="60" w:line="252" w:lineRule="auto"/>
         <w:jc w:val="both"/>
       </w:pPr>
       <w:r>
@@ -448,26 +546,12 @@
           <w:b w:val="0"/>
           <w:sz w:val="20"/>
         </w:rPr>
-        <w:t>5.2. За исключением умысла или грубой неосторожности, совокупная ответственность Исполнителя по Договору не превышает Цену, фактически уплаченную Заказчиком. Стороны не отвечают за косвенные убытки (включая упущенную выгоду, простой ВС), если иное не вытекает из императивных норм.</w:t>
+        <w:t>5.2. Обстоятельства непреодолимой силы (включая военные действия, санкции, стихийные бедствия, эпидемии, акты органов власти, закрытие аэропорта/ангара) освобождают от ответственности на период их действия при своевременном уведомлении. При продолжении свыше 30 дней любая Сторона вправе расторгнуть Договор без штрафных санкций с оплатой фактически оказанных Услуг.</w:t>
       </w:r>
     </w:p>
     <w:p>
       <w:pPr>
-        <w:spacing w:before="0" w:after="80" w:line="259" w:lineRule="auto"/>
-        <w:jc w:val="both"/>
-      </w:pPr>
-      <w:r>
-        <w:rPr>
-          <w:rFonts w:ascii="Times New Roman" w:hAnsi="Times New Roman" w:eastAsia="Times New Roman"/>
-          <w:b w:val="0"/>
-          <w:sz w:val="20"/>
-        </w:rPr>
-        <w:t>5.3. Сторона освобождается от ответственности на период действия обстоятельств непреодолимой силы (включая военные действия, санкции, препятствующие исполнению, стихийные бедствия, эпидемии, акты органов власти, закрытие аэропорта / ангара) при условии своевременного уведомления. При продолжении более 30 дней любая Сторона вправе расторгнуть Договор письменным уведомлением без штрафных санкций, с оплатой фактически оказанных Услуг.</w:t>
-      </w:r>
-    </w:p>
-    <w:p>
-      <w:pPr>
-        <w:spacing w:before="80" w:after="60" w:line="259" w:lineRule="auto"/>
+        <w:spacing w:before="60" w:after="40" w:line="252" w:lineRule="auto"/>
       </w:pPr>
       <w:r>
         <w:rPr>
@@ -480,7 +564,7 @@
     </w:p>
     <w:p>
       <w:pPr>
-        <w:spacing w:before="0" w:after="80" w:line="259" w:lineRule="auto"/>
+        <w:spacing w:before="0" w:after="60" w:line="252" w:lineRule="auto"/>
         <w:jc w:val="both"/>
       </w:pPr>
       <w:r>
@@ -489,12 +573,12 @@
           <w:b w:val="0"/>
           <w:sz w:val="20"/>
         </w:rPr>
-        <w:t>6.1. Каждая Сторона обязуется не раскрывать конфиденциальную коммерческую и техническую информацию другой Стороны, полученную в связи с Договором, третьим лицам без предварительного письменного согласия, за исключением профессиональных консультантов и случаев, предусмотренных законом. Обязательство действует в течение 3 (трёх) лет после прекращения Договора.</w:t>
+        <w:t>6.1. Стороны сохраняют конфиденциальность непубличной коммерческой и технической информации, полученной по Договору, в течение 3 (трёх) лет после его прекращения, за исключением раскрытия консультантам или по требованию закона.</w:t>
       </w:r>
     </w:p>
     <w:p>
       <w:pPr>
-        <w:spacing w:before="80" w:after="60" w:line="259" w:lineRule="auto"/>
+        <w:spacing w:before="60" w:after="40" w:line="252" w:lineRule="auto"/>
       </w:pPr>
       <w:r>
         <w:rPr>
@@ -507,7 +591,7 @@
     </w:p>
     <w:p>
       <w:pPr>
-        <w:spacing w:before="0" w:after="80" w:line="259" w:lineRule="auto"/>
+        <w:spacing w:before="0" w:after="60" w:line="252" w:lineRule="auto"/>
         <w:jc w:val="both"/>
       </w:pPr>
       <w:r>
@@ -516,12 +600,12 @@
           <w:b w:val="0"/>
           <w:sz w:val="20"/>
         </w:rPr>
-        <w:t>7.1. Договор вступает в силу с даты подписания обеими Сторонами (либо с более поздней даты подписи) и действует до полного исполнения обязательств.</w:t>
+        <w:t>7.1. Договор вступает в силу с даты подписания обеими Сторонами (либо с более поздней даты подписи) и действует до полного исполнения.</w:t>
       </w:r>
     </w:p>
     <w:p>
       <w:pPr>
-        <w:spacing w:before="0" w:after="80" w:line="259" w:lineRule="auto"/>
+        <w:spacing w:before="0" w:after="60" w:line="252" w:lineRule="auto"/>
         <w:jc w:val="both"/>
       </w:pPr>
       <w:r>
@@ -530,12 +614,12 @@
           <w:b w:val="0"/>
           <w:sz w:val="20"/>
         </w:rPr>
-        <w:t>7.2. Любая Сторона вправе расторгнуть Договор письменным уведомлением при существенном нарушении другой Стороной, не устранённом в течение 10 (десяти) рабочих дней. Заказчик вправе отказаться до начала работ с возмещением документально подтверждённых расходов Исполнителя.</w:t>
+        <w:t>7.2. Любая Сторона вправе расторгнуть Договор при существенном нарушении, не устранённом в течение 10 рабочих дней. Заказчик вправе отказаться до начала работ с возмещением документально подтверждённых расходов Исполнителя.</w:t>
       </w:r>
     </w:p>
     <w:p>
       <w:pPr>
-        <w:spacing w:before="0" w:after="80" w:line="259" w:lineRule="auto"/>
+        <w:spacing w:before="0" w:after="60" w:line="252" w:lineRule="auto"/>
         <w:jc w:val="both"/>
       </w:pPr>
       <w:r>
@@ -544,12 +628,12 @@
           <w:b w:val="0"/>
           <w:sz w:val="20"/>
         </w:rPr>
-        <w:t>7.3. Изменения действительны только в письменной форме, подписанной обеими Сторонами (включая обмен подписанными PDF-сканами).</w:t>
+        <w:t>7.3. Изменения действительны только в письменной форме, подписанной обеими Сторонами (включая PDF-сканы).</w:t>
       </w:r>
     </w:p>
     <w:p>
       <w:pPr>
-        <w:spacing w:before="80" w:after="60" w:line="259" w:lineRule="auto"/>
+        <w:spacing w:before="60" w:after="40" w:line="252" w:lineRule="auto"/>
       </w:pPr>
       <w:r>
         <w:rPr>
@@ -562,7 +646,7 @@
     </w:p>
     <w:p>
       <w:pPr>
-        <w:spacing w:before="0" w:after="80" w:line="259" w:lineRule="auto"/>
+        <w:spacing w:before="0" w:after="60" w:line="252" w:lineRule="auto"/>
         <w:jc w:val="both"/>
       </w:pPr>
       <w:r>
@@ -571,12 +655,12 @@
           <w:b w:val="0"/>
           <w:sz w:val="20"/>
         </w:rPr>
-        <w:t>8.1. К Договору применяется право [● — например, Англии и Уэльса / Российской Федерации / Республики Сербия] без учёта коллизионных норм.</w:t>
+        <w:t>8.1. К Договору применяется право [● — рекомендуется: Турецкой Республики / Англии и Уэльса] без учёта коллизионных норм.</w:t>
       </w:r>
     </w:p>
     <w:p>
       <w:pPr>
-        <w:spacing w:before="0" w:after="80" w:line="259" w:lineRule="auto"/>
+        <w:spacing w:before="0" w:after="60" w:line="252" w:lineRule="auto"/>
         <w:jc w:val="both"/>
       </w:pPr>
       <w:r>
@@ -585,12 +669,12 @@
           <w:b w:val="0"/>
           <w:sz w:val="20"/>
         </w:rPr>
-        <w:t>8.2. Стороны стремятся урегулировать споры путём переговоров в течение 15 (пятнадцати) рабочих дней. При недостижении соглашения спор передаётся в [компетентный суд по месту регистрации Исполнителя / арбитраж: ●]. Язык разбирательства — английский, если иное не согласовано.</w:t>
+        <w:t>8.2. Споры, не урегулированные в течение 15 рабочих дней, передаются в [суды Стамбула, Турция / арбитраж: ●]. Язык разбирательства — английский, если иное не согласовано.</w:t>
       </w:r>
     </w:p>
     <w:p>
       <w:pPr>
-        <w:spacing w:before="80" w:after="60" w:line="259" w:lineRule="auto"/>
+        <w:spacing w:before="60" w:after="40" w:line="252" w:lineRule="auto"/>
       </w:pPr>
       <w:r>
         <w:rPr>
@@ -603,7 +687,7 @@
     </w:p>
     <w:p>
       <w:pPr>
-        <w:spacing w:before="0" w:after="80" w:line="259" w:lineRule="auto"/>
+        <w:spacing w:before="0" w:after="60" w:line="252" w:lineRule="auto"/>
         <w:jc w:val="both"/>
       </w:pPr>
       <w:r>
@@ -612,12 +696,12 @@
           <w:b w:val="0"/>
           <w:sz w:val="20"/>
         </w:rPr>
-        <w:t>9.1. Договор составлен на английском и русском языках в двух экземплярах (по одному для каждой Стороны). При расхождении приоритет имеет [английская / русская] версия. Каждый экземпляр (включая PDF-скан подписанного оригинала) имеет равную юридическую силу.</w:t>
+        <w:t>9.1. Договор составлен на английском и русском языках в двух экземплярах. При расхождении приоритет имеет английская версия. PDF-сканы подписанных оригиналов имеют равную силу.</w:t>
       </w:r>
     </w:p>
     <w:p>
       <w:pPr>
-        <w:spacing w:before="0" w:after="80" w:line="259" w:lineRule="auto"/>
+        <w:spacing w:before="0" w:after="60" w:line="252" w:lineRule="auto"/>
         <w:jc w:val="both"/>
       </w:pPr>
       <w:r>
@@ -626,12 +710,12 @@
           <w:b w:val="0"/>
           <w:sz w:val="20"/>
         </w:rPr>
-        <w:t>9.2. Неотъемлемые приложения: Приложение № 1 — Коммерческое предложение «BSI JT» от 06.08.2026; Приложение № 2 — карточка компании Исполнителя / банковские реквизиты (в актуальной редакции).</w:t>
+        <w:t>9.2. Приложения: Приложение № 1 — КП от 06 августа 2026 г.; Приложение № 2 — карточка компании / банковские реквизиты Исполнителя.</w:t>
       </w:r>
     </w:p>
     <w:p>
       <w:pPr>
-        <w:spacing w:before="0" w:after="80" w:line="259" w:lineRule="auto"/>
+        <w:spacing w:before="0" w:after="60" w:line="252" w:lineRule="auto"/>
         <w:jc w:val="both"/>
       </w:pPr>
       <w:r>
@@ -640,12 +724,12 @@
           <w:b w:val="0"/>
           <w:sz w:val="20"/>
         </w:rPr>
-        <w:t>9.3. Уведомления могут направляться по электронной почте на адреса, указанные в разделе 10, с предоставлением оригиналов/сканов по запросу. Уведомление считается полученным на следующий рабочий день после отправки при отсутствии сообщения о недоставке.</w:t>
+        <w:t>9.3. Уведомления по email (раздел 10) считаются полученными на следующий рабочий день при отсутствии сообщения о недоставке.</w:t>
       </w:r>
     </w:p>
     <w:p>
       <w:pPr>
-        <w:spacing w:before="80" w:after="120" w:line="259" w:lineRule="auto"/>
+        <w:spacing w:before="60" w:after="80" w:line="252" w:lineRule="auto"/>
       </w:pPr>
       <w:r>
         <w:rPr>
@@ -662,13 +746,13 @@
         <w:tblLook w:firstColumn="1" w:firstRow="1" w:lastColumn="0" w:lastRow="0" w:noHBand="0" w:noVBand="1" w:val="04A0"/>
       </w:tblPr>
       <w:tblGrid>
-        <w:gridCol w:w="5128"/>
-        <w:gridCol w:w="5128"/>
+        <w:gridCol w:w="5213"/>
+        <w:gridCol w:w="5213"/>
       </w:tblGrid>
       <w:tr>
         <w:tc>
           <w:tcPr>
-            <w:tcW w:type="dxa" w:w="5128"/>
+            <w:tcW w:type="dxa" w:w="5213"/>
           </w:tcPr>
           <w:p>
             <w:r/>
@@ -683,7 +767,7 @@
           </w:p>
           <w:p>
             <w:pPr>
-              <w:spacing w:after="20" w:before="0" w:line="252" w:lineRule="auto"/>
+              <w:spacing w:after="0" w:before="0" w:line="245" w:lineRule="auto"/>
             </w:pPr>
             <w:r>
               <w:rPr>
@@ -691,12 +775,12 @@
                 <w:b w:val="0"/>
                 <w:sz w:val="18"/>
               </w:rPr>
-              <w:t>Полное наименование: [●]</w:t>
+              <w:t>Адрес: Egitim Mahallesi, Fahrettin Kerim</w:t>
             </w:r>
           </w:p>
           <w:p>
             <w:pPr>
-              <w:spacing w:after="20" w:before="0" w:line="252" w:lineRule="auto"/>
+              <w:spacing w:after="0" w:before="0" w:line="245" w:lineRule="auto"/>
             </w:pPr>
             <w:r>
               <w:rPr>
@@ -704,12 +788,12 @@
                 <w:b w:val="0"/>
                 <w:sz w:val="18"/>
               </w:rPr>
-              <w:t>Адрес: [●]</w:t>
+              <w:t>Gokay Caddesi, Ortaklar Ishani, No. 71/57,</w:t>
             </w:r>
           </w:p>
           <w:p>
             <w:pPr>
-              <w:spacing w:after="20" w:before="0" w:line="252" w:lineRule="auto"/>
+              <w:spacing w:after="0" w:before="0" w:line="245" w:lineRule="auto"/>
             </w:pPr>
             <w:r>
               <w:rPr>
@@ -717,12 +801,12 @@
                 <w:b w:val="0"/>
                 <w:sz w:val="18"/>
               </w:rPr>
-              <w:t>ОГРН / рег. номер / ИНН: [●]</w:t>
+              <w:t>Kadikoy, 34722, Istanbul, Turkey</w:t>
             </w:r>
           </w:p>
           <w:p>
             <w:pPr>
-              <w:spacing w:after="20" w:before="0" w:line="252" w:lineRule="auto"/>
+              <w:spacing w:after="0" w:before="0" w:line="245" w:lineRule="auto"/>
             </w:pPr>
             <w:r>
               <w:rPr>
@@ -730,12 +814,12 @@
                 <w:b w:val="0"/>
                 <w:sz w:val="18"/>
               </w:rPr>
-              <w:t>Банк: [●]</w:t>
+              <w:t>Рег. / налог. номер: [●]</w:t>
             </w:r>
           </w:p>
           <w:p>
             <w:pPr>
-              <w:spacing w:after="20" w:before="0" w:line="252" w:lineRule="auto"/>
+              <w:spacing w:after="0" w:before="0" w:line="245" w:lineRule="auto"/>
             </w:pPr>
             <w:r>
               <w:rPr>
@@ -743,12 +827,12 @@
                 <w:b w:val="0"/>
                 <w:sz w:val="18"/>
               </w:rPr>
-              <w:t>Счёт / IBAN: [●]</w:t>
+              <w:t>Банк / IBAN / SWIFT: [●]</w:t>
             </w:r>
           </w:p>
           <w:p>
             <w:pPr>
-              <w:spacing w:after="20" w:before="0" w:line="252" w:lineRule="auto"/>
+              <w:spacing w:after="0" w:before="0" w:line="245" w:lineRule="auto"/>
             </w:pPr>
             <w:r>
               <w:rPr>
@@ -756,26 +840,13 @@
                 <w:b w:val="0"/>
                 <w:sz w:val="18"/>
               </w:rPr>
-              <w:t>SWIFT: [●]</w:t>
-            </w:r>
-          </w:p>
-          <w:p>
-            <w:pPr>
-              <w:spacing w:after="20" w:before="0" w:line="252" w:lineRule="auto"/>
-            </w:pPr>
-            <w:r>
-              <w:rPr>
-                <w:rFonts w:ascii="Times New Roman" w:hAnsi="Times New Roman" w:eastAsia="Times New Roman"/>
-                <w:b w:val="0"/>
-                <w:sz w:val="18"/>
-              </w:rPr>
-              <w:t>Email: [●]   Тел.: [●]</w:t>
+              <w:t>Email: sales@jetechnic.com</w:t>
             </w:r>
           </w:p>
         </w:tc>
         <w:tc>
           <w:tcPr>
-            <w:tcW w:type="dxa" w:w="5128"/>
+            <w:tcW w:type="dxa" w:w="5213"/>
           </w:tcPr>
           <w:p>
             <w:r/>
@@ -790,7 +861,7 @@
           </w:p>
           <w:p>
             <w:pPr>
-              <w:spacing w:after="20" w:before="0" w:line="252" w:lineRule="auto"/>
+              <w:spacing w:after="0" w:before="0" w:line="245" w:lineRule="auto"/>
             </w:pPr>
             <w:r>
               <w:rPr>
@@ -803,7 +874,7 @@
           </w:p>
           <w:p>
             <w:pPr>
-              <w:spacing w:after="20" w:before="0" w:line="252" w:lineRule="auto"/>
+              <w:spacing w:after="0" w:before="0" w:line="245" w:lineRule="auto"/>
             </w:pPr>
             <w:r>
               <w:rPr>
@@ -816,7 +887,7 @@
           </w:p>
           <w:p>
             <w:pPr>
-              <w:spacing w:after="20" w:before="0" w:line="252" w:lineRule="auto"/>
+              <w:spacing w:after="0" w:before="0" w:line="245" w:lineRule="auto"/>
             </w:pPr>
             <w:r>
               <w:rPr>
@@ -824,12 +895,12 @@
                 <w:b w:val="0"/>
                 <w:sz w:val="18"/>
               </w:rPr>
-              <w:t>Рег. номер / налог. ID: [●]</w:t>
+              <w:t>Рег. / налог. номер: [●]</w:t>
             </w:r>
           </w:p>
           <w:p>
             <w:pPr>
-              <w:spacing w:after="20" w:before="0" w:line="252" w:lineRule="auto"/>
+              <w:spacing w:after="0" w:before="0" w:line="245" w:lineRule="auto"/>
             </w:pPr>
             <w:r>
               <w:rPr>
@@ -837,38 +908,12 @@
                 <w:b w:val="0"/>
                 <w:sz w:val="18"/>
               </w:rPr>
-              <w:t>Банк: [●]</w:t>
+              <w:t>Банк / IBAN / SWIFT: [●]</w:t>
             </w:r>
           </w:p>
           <w:p>
             <w:pPr>
-              <w:spacing w:after="20" w:before="0" w:line="252" w:lineRule="auto"/>
-            </w:pPr>
-            <w:r>
-              <w:rPr>
-                <w:rFonts w:ascii="Times New Roman" w:hAnsi="Times New Roman" w:eastAsia="Times New Roman"/>
-                <w:b w:val="0"/>
-                <w:sz w:val="18"/>
-              </w:rPr>
-              <w:t>Счёт / IBAN: [●]</w:t>
-            </w:r>
-          </w:p>
-          <w:p>
-            <w:pPr>
-              <w:spacing w:after="20" w:before="0" w:line="252" w:lineRule="auto"/>
-            </w:pPr>
-            <w:r>
-              <w:rPr>
-                <w:rFonts w:ascii="Times New Roman" w:hAnsi="Times New Roman" w:eastAsia="Times New Roman"/>
-                <w:b w:val="0"/>
-                <w:sz w:val="18"/>
-              </w:rPr>
-              <w:t>SWIFT: [●]</w:t>
-            </w:r>
-          </w:p>
-          <w:p>
-            <w:pPr>
-              <w:spacing w:after="20" w:before="0" w:line="252" w:lineRule="auto"/>
+              <w:spacing w:after="0" w:before="0" w:line="245" w:lineRule="auto"/>
             </w:pPr>
             <w:r>
               <w:rPr>
@@ -879,26 +924,31 @@
               <w:t>Email: [●]   Тел.: [●]</w:t>
             </w:r>
           </w:p>
+          <w:p>
+            <w:pPr>
+              <w:spacing w:after="0" w:before="0" w:line="245" w:lineRule="auto"/>
+            </w:pPr>
+            <w:r>
+              <w:rPr>
+                <w:rFonts w:ascii="Times New Roman" w:hAnsi="Times New Roman" w:eastAsia="Times New Roman"/>
+                <w:b w:val="0"/>
+                <w:sz w:val="18"/>
+              </w:rPr>
+            </w:r>
+          </w:p>
         </w:tc>
       </w:tr>
       <w:tr>
         <w:tc>
           <w:tcPr>
-            <w:tcW w:type="dxa" w:w="5128"/>
+            <w:tcW w:type="dxa" w:w="5213"/>
           </w:tcPr>
           <w:p>
             <w:r/>
-            <w:r>
-              <w:rPr>
-                <w:rFonts w:ascii="Times New Roman" w:hAnsi="Times New Roman" w:eastAsia="Times New Roman"/>
-                <w:b/>
-                <w:sz w:val="20"/>
-              </w:rPr>
-            </w:r>
           </w:p>
           <w:p>
             <w:pPr>
-              <w:spacing w:after="20" w:before="0" w:line="252" w:lineRule="auto"/>
+              <w:spacing w:after="0" w:before="0" w:line="245" w:lineRule="auto"/>
             </w:pPr>
             <w:r>
               <w:rPr>
@@ -910,7 +960,7 @@
           </w:p>
           <w:p>
             <w:pPr>
-              <w:spacing w:after="20" w:before="0" w:line="252" w:lineRule="auto"/>
+              <w:spacing w:after="0" w:before="0" w:line="245" w:lineRule="auto"/>
             </w:pPr>
             <w:r>
               <w:rPr>
@@ -923,7 +973,7 @@
           </w:p>
           <w:p>
             <w:pPr>
-              <w:spacing w:after="20" w:before="0" w:line="252" w:lineRule="auto"/>
+              <w:spacing w:after="0" w:before="0" w:line="245" w:lineRule="auto"/>
             </w:pPr>
             <w:r>
               <w:rPr>
@@ -936,7 +986,7 @@
           </w:p>
           <w:p>
             <w:pPr>
-              <w:spacing w:after="20" w:before="0" w:line="252" w:lineRule="auto"/>
+              <w:spacing w:after="0" w:before="0" w:line="245" w:lineRule="auto"/>
             </w:pPr>
             <w:r>
               <w:rPr>
@@ -950,21 +1000,14 @@
         </w:tc>
         <w:tc>
           <w:tcPr>
-            <w:tcW w:type="dxa" w:w="5128"/>
+            <w:tcW w:type="dxa" w:w="5213"/>
           </w:tcPr>
           <w:p>
             <w:r/>
-            <w:r>
-              <w:rPr>
-                <w:rFonts w:ascii="Times New Roman" w:hAnsi="Times New Roman" w:eastAsia="Times New Roman"/>
-                <w:b/>
-                <w:sz w:val="20"/>
-              </w:rPr>
-            </w:r>
           </w:p>
           <w:p>
             <w:pPr>
-              <w:spacing w:after="20" w:before="0" w:line="252" w:lineRule="auto"/>
+              <w:spacing w:after="0" w:before="0" w:line="245" w:lineRule="auto"/>
             </w:pPr>
             <w:r>
               <w:rPr>
@@ -976,7 +1019,7 @@
           </w:p>
           <w:p>
             <w:pPr>
-              <w:spacing w:after="20" w:before="0" w:line="252" w:lineRule="auto"/>
+              <w:spacing w:after="0" w:before="0" w:line="245" w:lineRule="auto"/>
             </w:pPr>
             <w:r>
               <w:rPr>
@@ -989,7 +1032,7 @@
           </w:p>
           <w:p>
             <w:pPr>
-              <w:spacing w:after="20" w:before="0" w:line="252" w:lineRule="auto"/>
+              <w:spacing w:after="0" w:before="0" w:line="245" w:lineRule="auto"/>
             </w:pPr>
             <w:r>
               <w:rPr>
@@ -1002,7 +1045,7 @@
           </w:p>
           <w:p>
             <w:pPr>
-              <w:spacing w:after="20" w:before="0" w:line="252" w:lineRule="auto"/>
+              <w:spacing w:after="0" w:before="0" w:line="245" w:lineRule="auto"/>
             </w:pPr>
             <w:r>
               <w:rPr>
@@ -1018,7 +1061,7 @@
     </w:tbl>
     <w:p>
       <w:pPr>
-        <w:spacing w:before="0" w:after="40" w:line="259" w:lineRule="auto"/>
+        <w:spacing w:before="0" w:after="20" w:line="252" w:lineRule="auto"/>
         <w:jc w:val="both"/>
       </w:pPr>
       <w:r>
@@ -1031,33 +1074,33 @@
     </w:p>
     <w:p>
       <w:pPr>
-        <w:spacing w:before="0" w:after="40" w:line="259" w:lineRule="auto"/>
+        <w:spacing w:before="0" w:after="20" w:line="252" w:lineRule="auto"/>
       </w:pPr>
       <w:r>
         <w:rPr>
           <w:rFonts w:ascii="Times New Roman" w:hAnsi="Times New Roman" w:eastAsia="Times New Roman"/>
           <w:b w:val="0"/>
-          <w:sz w:val="18"/>
+          <w:sz w:val="17"/>
         </w:rPr>
-        <w:t>Приложение № 1 — Коммерческое предложение «BSI JT» от 06.08.2026 (прилагается).</w:t>
+        <w:t>Приложение № 1 — Коммерческое предложение «VQ-BOO BSI and Inspection» от 06 августа 2026 г. (прилагается).</w:t>
       </w:r>
     </w:p>
     <w:p>
       <w:pPr>
-        <w:spacing w:before="0" w:after="40" w:line="259" w:lineRule="auto"/>
+        <w:spacing w:before="0" w:after="20" w:line="252" w:lineRule="auto"/>
       </w:pPr>
       <w:r>
         <w:rPr>
           <w:rFonts w:ascii="Times New Roman" w:hAnsi="Times New Roman" w:eastAsia="Times New Roman"/>
           <w:b w:val="0"/>
-          <w:sz w:val="18"/>
+          <w:sz w:val="17"/>
         </w:rPr>
         <w:t>Приложение № 2 — Карточка компании JET Technic / платёжные реквизиты (прилагается).</w:t>
       </w:r>
     </w:p>
     <w:p>
       <w:pPr>
-        <w:spacing w:before="120" w:after="80" w:line="259" w:lineRule="auto"/>
+        <w:spacing w:before="80" w:after="60" w:line="252" w:lineRule="auto"/>
       </w:pPr>
       <w:r>
         <w:rPr>
@@ -1065,12 +1108,12 @@
           <w:b w:val="0"/>
           <w:sz w:val="16"/>
         </w:rPr>
-        <w:t>ЧЕРНОВИК — для внутренней проверки. Не подписанный договор. Плейсхолдеры «[●]» заполняются по карточке компании, КП и данным Заказчика.</w:t>
+        <w:t>ЧЕРНОВИК для внутренней проверки. Данные Заказчика и банковские/регистрационные реквизиты Исполнителя ещё не заполнены. Не является юридической консультацией.</w:t>
       </w:r>
     </w:p>
     <w:sectPr>
       <w:pgSz w:w="12240" w:h="15840"/>
-      <w:pgMar w:top="850" w:right="850" w:bottom="850" w:left="1134" w:header="720" w:footer="720" w:gutter="0"/>
+      <w:pgMar w:top="794" w:right="794" w:bottom="794" w:left="1020" w:header="720" w:footer="720" w:gutter="0"/>
       <w:cols w:space="720"/>
       <w:docGrid w:linePitch="360"/>
     </w:sectPr>

</xml_diff>

<commit_message>
Fill contractor details from JET TECHNIC company card
Add legal name, Company/Tax numbers, Director General Serdar Guler,
Yapi Kredi IBANs (USD/EUR/TRY), SWIFT, and attach Company Card PDF
as Annex No. 2; set governing law to Türkiye / Istanbul courts.

Co-authored-by: alexanderp-cell <alexanderp-cell@users.noreply.github.com>
</commit_message>
<xml_diff>
--- a/agreements/Dogovor_JT-BSI-2026_RU.docx
+++ b/agreements/Dogovor_JT-BSI-2026_RU.docx
@@ -18,21 +18,21 @@
     </w:p>
     <w:p>
       <w:pPr>
-        <w:spacing w:before="0" w:after="40" w:line="252" w:lineRule="auto"/>
+        <w:spacing w:before="0" w:after="20" w:line="252" w:lineRule="auto"/>
         <w:jc w:val="center"/>
       </w:pPr>
       <w:r>
         <w:rPr>
           <w:rFonts w:ascii="Times New Roman" w:hAnsi="Times New Roman" w:eastAsia="Times New Roman"/>
           <w:b/>
-          <w:sz w:val="22"/>
+          <w:sz w:val="21"/>
         </w:rPr>
         <w:t>на инспекцию воздушного судна и бороскопическую инспекцию двигателей и ВСУ</w:t>
       </w:r>
     </w:p>
     <w:p>
       <w:pPr>
-        <w:spacing w:before="0" w:after="80" w:line="252" w:lineRule="auto"/>
+        <w:spacing w:before="0" w:after="60" w:line="252" w:lineRule="auto"/>
         <w:jc w:val="center"/>
       </w:pPr>
       <w:r>
@@ -46,7 +46,7 @@
     </w:p>
     <w:p>
       <w:pPr>
-        <w:spacing w:before="0" w:after="120" w:line="252" w:lineRule="auto"/>
+        <w:spacing w:before="0" w:after="100" w:line="252" w:lineRule="auto"/>
         <w:jc w:val="center"/>
       </w:pPr>
       <w:r>
@@ -69,7 +69,7 @@
           <w:b/>
           <w:sz w:val="20"/>
         </w:rPr>
-        <w:t>JET Technic</w:t>
+        <w:t>JET TECHNIC / Hava Araclari Lojistik Sanayi ve Ticaret Anonim</w:t>
       </w:r>
       <w:r>
         <w:rPr>
@@ -77,7 +77,7 @@
           <w:b w:val="0"/>
           <w:sz w:val="20"/>
         </w:rPr>
-        <w:t xml:space="preserve"> (адрес: Egitim Mahallesi, Fahrettin Kerim Gokay Caddesi, Ortaklar Ishani, No. 71/57, Kadikoy, 34722, Istanbul, Turkey; email: sales@jetechnic.com; регистрационный / налоговый номер: [● — согласно карточке компании], далее — «</w:t>
+        <w:t xml:space="preserve"> (юридический адрес: Egitim Mahallesi, Fahrettin Kerim Gokay Caddesi, Ortaklar Is Merkezi, No: 71/57, Kadikoy, Istanbul, Turkiye; Company No. 389609-5; Tax No. 484 212 4015; тел. +90 533 736 84 00; email: sales@jetechnic.com; далее — «</w:t>
       </w:r>
       <w:r>
         <w:rPr>
@@ -93,7 +93,7 @@
           <w:b w:val="0"/>
           <w:sz w:val="20"/>
         </w:rPr>
-        <w:t>»), в лице [ФИО, должность], действующего на основании [Устава / доверенности № ● от ●], с одной стороны, и</w:t>
+        <w:t>»), в лице Генерального директора Serdar Guler, действующего на основании устава / полномочий Генерального директора, с одной стороны, и</w:t>
       </w:r>
     </w:p>
     <w:p>
@@ -136,7 +136,7 @@
     </w:p>
     <w:p>
       <w:pPr>
-        <w:spacing w:before="0" w:after="100" w:line="252" w:lineRule="auto"/>
+        <w:spacing w:before="0" w:after="80" w:line="252" w:lineRule="auto"/>
         <w:jc w:val="both"/>
       </w:pPr>
       <w:r>
@@ -256,7 +256,7 @@
           <w:b w:val="0"/>
           <w:sz w:val="20"/>
         </w:rPr>
-        <w:t>1.2. Коммерческое предложение «VQ-BOO BSI and Inspection» / «BSI JT» от 06 августа 2026 г. (далее — «КП») является неотъемлемым Приложением № 1. Технический объём и Цена определяются КП; в остальном приоритет имеет Договор.</w:t>
+        <w:t>1.2. Коммерческое предложение «VQ-BOO BSI and Inspection» от 06 августа 2026 г. (далее — «КП») является неотъемлемым Приложением № 1. Технический объём и Цена определяются КП; в остальном приоритет имеет Договор.</w:t>
       </w:r>
     </w:p>
     <w:p>
@@ -270,7 +270,7 @@
           <w:b w:val="0"/>
           <w:sz w:val="20"/>
         </w:rPr>
-        <w:t>1.3. Место оказания Услуг: JAT Tehnika, Белград, Республика Сербия (зона аэропорта Белграда). Доступ в зону аэропорта и к ВС обеспечивает Заказчик.</w:t>
+        <w:t>1.3. Место оказания Услуг: JAT Tehnika, Белград, Республика Сербия. Доступ в зону аэропорта и к ВС обеспечивает Заказчик.</w:t>
       </w:r>
     </w:p>
     <w:p>
@@ -311,7 +311,7 @@
           <w:b w:val="0"/>
           <w:sz w:val="20"/>
         </w:rPr>
-        <w:t>2.1. Ориентировочный срок оказания Услуг — 3 (три) дня, начиная с более поздней из дат: (i) вступления Договора в силу; (ii) поступления аванса (при наличии); (iii) предоставления Заказчиком доступа к аэропорту / ВС и необходимой документации.</w:t>
+        <w:t>2.1. Ориентировочный срок — 3 (три) дня с более поздней из дат: (i) вступления Договора в силу; (ii) поступления аванса (при наличии); (iii) предоставления Заказчиком доступа к аэропорту / ВС и необходимой документации.</w:t>
       </w:r>
     </w:p>
     <w:p>
@@ -352,7 +352,7 @@
           <w:b w:val="0"/>
           <w:sz w:val="20"/>
         </w:rPr>
-        <w:t>3.1. Общая Цена составляет USD 24 000,00 (двадцать четыре тысячи долларов США) без учёта применимых налогов и сборов, в том числе:</w:t>
+        <w:t>3.1. Общая Цена составляет USD 24 000,00 (двадцать четыре тысячи долларов США) без учёта применимых налогов и сборов:</w:t>
       </w:r>
     </w:p>
     <w:p>
@@ -366,7 +366,7 @@
           <w:b w:val="0"/>
           <w:sz w:val="20"/>
         </w:rPr>
-        <w:t>• BSI CFM56-3 — 2 двигателя (объём TBD) — USD 9 500,00;</w:t>
+        <w:t>• BSI CFM56-3 — 2 двигателя (объём TBD) — USD 9 500,00;  • BSI ВСУ APS2000 — USD 4 000,00;</w:t>
       </w:r>
     </w:p>
     <w:p>
@@ -380,7 +380,7 @@
           <w:b w:val="0"/>
           <w:sz w:val="20"/>
         </w:rPr>
-        <w:t>• BSI ВСУ APS2000 — USD 4 000,00;</w:t>
+        <w:t>• GVI ВС — USD 3 000,00;  • проверка документации (двигатели, ВСУ) — USD 3 500,00;  • транспорт и проживание — USD 4 000,00.</w:t>
       </w:r>
     </w:p>
     <w:p>
@@ -394,49 +394,7 @@
           <w:b w:val="0"/>
           <w:sz w:val="20"/>
         </w:rPr>
-        <w:t>• GVI ВС (шасси, кабина, отсек авионики) — USD 3 000,00;</w:t>
-      </w:r>
-    </w:p>
-    <w:p>
-      <w:pPr>
-        <w:spacing w:before="0" w:after="60" w:line="252" w:lineRule="auto"/>
-        <w:jc w:val="both"/>
-      </w:pPr>
-      <w:r>
-        <w:rPr>
-          <w:rFonts w:ascii="Times New Roman" w:hAnsi="Times New Roman" w:eastAsia="Times New Roman"/>
-          <w:b w:val="0"/>
-          <w:sz w:val="20"/>
-        </w:rPr>
-        <w:t>• проверка документации (двигатели, ВСУ) — USD 3 500,00;</w:t>
-      </w:r>
-    </w:p>
-    <w:p>
-      <w:pPr>
-        <w:spacing w:before="0" w:after="60" w:line="252" w:lineRule="auto"/>
-        <w:jc w:val="both"/>
-      </w:pPr>
-      <w:r>
-        <w:rPr>
-          <w:rFonts w:ascii="Times New Roman" w:hAnsi="Times New Roman" w:eastAsia="Times New Roman"/>
-          <w:b w:val="0"/>
-          <w:sz w:val="20"/>
-        </w:rPr>
-        <w:t>• транспорт и проживание — USD 4 000,00.</w:t>
-      </w:r>
-    </w:p>
-    <w:p>
-      <w:pPr>
-        <w:spacing w:before="0" w:after="60" w:line="252" w:lineRule="auto"/>
-        <w:jc w:val="both"/>
-      </w:pPr>
-      <w:r>
-        <w:rPr>
-          <w:rFonts w:ascii="Times New Roman" w:hAnsi="Times New Roman" w:eastAsia="Times New Roman"/>
-          <w:b w:val="0"/>
-          <w:sz w:val="20"/>
-        </w:rPr>
-        <w:t>3.2. Оплата: [100% предоплата / 50% аванс в течение 3 банковских дней с даты счёта и 50% в течение 5 банковских дней после передачи отчёта(ов)] банковским переводом на счёт Исполнителя (раздел 10 / счёт). Валюта: USD.</w:t>
+        <w:t>3.2. Оплата: [100% предоплата / 50% аванс в течение 3 банковских дней с даты счёта и 50% в течение 5 банковских дней после передачи отчёта(ов)] в USD банковским переводом на USD-счёт Исполнителя (раздел 10). Банковские комиссии банка-отправителя — за счёт Заказчика.</w:t>
       </w:r>
     </w:p>
     <w:p>
@@ -655,7 +613,7 @@
           <w:b w:val="0"/>
           <w:sz w:val="20"/>
         </w:rPr>
-        <w:t>8.1. К Договору применяется право [● — рекомендуется: Турецкой Республики / Англии и Уэльса] без учёта коллизионных норм.</w:t>
+        <w:t>8.1. К Договору применяется право Турецкой Республики без учёта коллизионных норм.</w:t>
       </w:r>
     </w:p>
     <w:p>
@@ -669,7 +627,7 @@
           <w:b w:val="0"/>
           <w:sz w:val="20"/>
         </w:rPr>
-        <w:t>8.2. Споры, не урегулированные в течение 15 рабочих дней, передаются в [суды Стамбула, Турция / арбитраж: ●]. Язык разбирательства — английский, если иное не согласовано.</w:t>
+        <w:t>8.2. Споры, не урегулированные в течение 15 рабочих дней, передаются в компетентные суды Стамбула, Турция. Язык разбирательства — английский, если иное не согласовано.</w:t>
       </w:r>
     </w:p>
     <w:p>
@@ -710,7 +668,7 @@
           <w:b w:val="0"/>
           <w:sz w:val="20"/>
         </w:rPr>
-        <w:t>9.2. Приложения: Приложение № 1 — КП от 06 августа 2026 г.; Приложение № 2 — карточка компании / банковские реквизиты Исполнителя.</w:t>
+        <w:t>9.2. Приложения: Приложение № 1 — КП от 06 августа 2026 г.; Приложение № 2 — карточка компании Исполнителя.</w:t>
       </w:r>
     </w:p>
     <w:p>
@@ -729,7 +687,7 @@
     </w:p>
     <w:p>
       <w:pPr>
-        <w:spacing w:before="60" w:after="80" w:line="252" w:lineRule="auto"/>
+        <w:spacing w:before="60" w:after="60" w:line="252" w:lineRule="auto"/>
       </w:pPr>
       <w:r>
         <w:rPr>
@@ -746,13 +704,13 @@
         <w:tblLook w:firstColumn="1" w:firstRow="1" w:lastColumn="0" w:lastRow="0" w:noHBand="0" w:noVBand="1" w:val="04A0"/>
       </w:tblPr>
       <w:tblGrid>
-        <w:gridCol w:w="5213"/>
-        <w:gridCol w:w="5213"/>
+        <w:gridCol w:w="5227"/>
+        <w:gridCol w:w="5227"/>
       </w:tblGrid>
       <w:tr>
         <w:tc>
           <w:tcPr>
-            <w:tcW w:type="dxa" w:w="5213"/>
+            <w:tcW w:type="dxa" w:w="5227"/>
           </w:tcPr>
           <w:p>
             <w:r/>
@@ -760,9 +718,9 @@
               <w:rPr>
                 <w:rFonts w:ascii="Times New Roman" w:hAnsi="Times New Roman" w:eastAsia="Times New Roman"/>
                 <w:b/>
-                <w:sz w:val="20"/>
+                <w:sz w:val="19"/>
               </w:rPr>
-              <w:t>ИСПОЛНИТЕЛЬ: JET Technic</w:t>
+              <w:t>ИСПОЛНИТЕЛЬ: JET TECHNIC</w:t>
             </w:r>
           </w:p>
           <w:p>
@@ -773,9 +731,9 @@
               <w:rPr>
                 <w:rFonts w:ascii="Times New Roman" w:hAnsi="Times New Roman" w:eastAsia="Times New Roman"/>
                 <w:b w:val="0"/>
-                <w:sz w:val="18"/>
+                <w:sz w:val="17"/>
               </w:rPr>
-              <w:t>Адрес: Egitim Mahallesi, Fahrettin Kerim</w:t>
+              <w:t>Юр. наименование: Hava Araclari Lojistik Sanayi ve Ticaret Anonim</w:t>
             </w:r>
           </w:p>
           <w:p>
@@ -786,9 +744,9 @@
               <w:rPr>
                 <w:rFonts w:ascii="Times New Roman" w:hAnsi="Times New Roman" w:eastAsia="Times New Roman"/>
                 <w:b w:val="0"/>
-                <w:sz w:val="18"/>
+                <w:sz w:val="17"/>
               </w:rPr>
-              <w:t>Gokay Caddesi, Ortaklar Ishani, No. 71/57,</w:t>
+              <w:t>Адрес: Egitim Mahallesi, Fahrettin Kerim Gokay Caddesi, Ortaklar Is Merkezi, No: 71/57, Kadikoy, Istanbul, Turkiye</w:t>
             </w:r>
           </w:p>
           <w:p>
@@ -799,9 +757,9 @@
               <w:rPr>
                 <w:rFonts w:ascii="Times New Roman" w:hAnsi="Times New Roman" w:eastAsia="Times New Roman"/>
                 <w:b w:val="0"/>
-                <w:sz w:val="18"/>
+                <w:sz w:val="17"/>
               </w:rPr>
-              <w:t>Kadikoy, 34722, Istanbul, Turkey</w:t>
+              <w:t>Company No.: 389609-5   Tax No.: 484 212 4015</w:t>
             </w:r>
           </w:p>
           <w:p>
@@ -812,7 +770,140 @@
               <w:rPr>
                 <w:rFonts w:ascii="Times New Roman" w:hAnsi="Times New Roman" w:eastAsia="Times New Roman"/>
                 <w:b w:val="0"/>
-                <w:sz w:val="18"/>
+                <w:sz w:val="17"/>
+              </w:rPr>
+              <w:t>Банк: YAPI KREDI BANK</w:t>
+            </w:r>
+          </w:p>
+          <w:p>
+            <w:pPr>
+              <w:spacing w:after="0" w:before="0" w:line="245" w:lineRule="auto"/>
+            </w:pPr>
+            <w:r>
+              <w:rPr>
+                <w:rFonts w:ascii="Times New Roman" w:hAnsi="Times New Roman" w:eastAsia="Times New Roman"/>
+                <w:b w:val="0"/>
+                <w:sz w:val="17"/>
+              </w:rPr>
+              <w:t>IBAN (USD): TR850006701000000015176740</w:t>
+            </w:r>
+          </w:p>
+          <w:p>
+            <w:pPr>
+              <w:spacing w:after="0" w:before="0" w:line="245" w:lineRule="auto"/>
+            </w:pPr>
+            <w:r>
+              <w:rPr>
+                <w:rFonts w:ascii="Times New Roman" w:hAnsi="Times New Roman" w:eastAsia="Times New Roman"/>
+                <w:b w:val="0"/>
+                <w:sz w:val="17"/>
+              </w:rPr>
+              <w:t>IBAN (EUR): TR430006701000000015213968</w:t>
+            </w:r>
+          </w:p>
+          <w:p>
+            <w:pPr>
+              <w:spacing w:after="0" w:before="0" w:line="245" w:lineRule="auto"/>
+            </w:pPr>
+            <w:r>
+              <w:rPr>
+                <w:rFonts w:ascii="Times New Roman" w:hAnsi="Times New Roman" w:eastAsia="Times New Roman"/>
+                <w:b w:val="0"/>
+                <w:sz w:val="17"/>
+              </w:rPr>
+              <w:t>IBAN (TRY): TR260006701000000015208357</w:t>
+            </w:r>
+          </w:p>
+          <w:p>
+            <w:pPr>
+              <w:spacing w:after="0" w:before="0" w:line="245" w:lineRule="auto"/>
+            </w:pPr>
+            <w:r>
+              <w:rPr>
+                <w:rFonts w:ascii="Times New Roman" w:hAnsi="Times New Roman" w:eastAsia="Times New Roman"/>
+                <w:b w:val="0"/>
+                <w:sz w:val="17"/>
+              </w:rPr>
+              <w:t>SWIFT: YAPITRISXXX</w:t>
+            </w:r>
+          </w:p>
+          <w:p>
+            <w:pPr>
+              <w:spacing w:after="0" w:before="0" w:line="245" w:lineRule="auto"/>
+            </w:pPr>
+            <w:r>
+              <w:rPr>
+                <w:rFonts w:ascii="Times New Roman" w:hAnsi="Times New Roman" w:eastAsia="Times New Roman"/>
+                <w:b w:val="0"/>
+                <w:sz w:val="17"/>
+              </w:rPr>
+              <w:t>Тел.: +90 533 736 84 00   Email: sales@jetechnic.com</w:t>
+            </w:r>
+          </w:p>
+          <w:p>
+            <w:pPr>
+              <w:spacing w:after="0" w:before="0" w:line="245" w:lineRule="auto"/>
+            </w:pPr>
+            <w:r>
+              <w:rPr>
+                <w:rFonts w:ascii="Times New Roman" w:hAnsi="Times New Roman" w:eastAsia="Times New Roman"/>
+                <w:b w:val="0"/>
+                <w:sz w:val="17"/>
+              </w:rPr>
+              <w:t>Web: jetechnic.com</w:t>
+            </w:r>
+          </w:p>
+        </w:tc>
+        <w:tc>
+          <w:tcPr>
+            <w:tcW w:type="dxa" w:w="5227"/>
+          </w:tcPr>
+          <w:p>
+            <w:r/>
+            <w:r>
+              <w:rPr>
+                <w:rFonts w:ascii="Times New Roman" w:hAnsi="Times New Roman" w:eastAsia="Times New Roman"/>
+                <w:b/>
+                <w:sz w:val="19"/>
+              </w:rPr>
+              <w:t>ЗАКАЗЧИК: [●]</w:t>
+            </w:r>
+          </w:p>
+          <w:p>
+            <w:pPr>
+              <w:spacing w:after="0" w:before="0" w:line="245" w:lineRule="auto"/>
+            </w:pPr>
+            <w:r>
+              <w:rPr>
+                <w:rFonts w:ascii="Times New Roman" w:hAnsi="Times New Roman" w:eastAsia="Times New Roman"/>
+                <w:b w:val="0"/>
+                <w:sz w:val="17"/>
+              </w:rPr>
+              <w:t>Полное наименование: [●]</w:t>
+            </w:r>
+          </w:p>
+          <w:p>
+            <w:pPr>
+              <w:spacing w:after="0" w:before="0" w:line="245" w:lineRule="auto"/>
+            </w:pPr>
+            <w:r>
+              <w:rPr>
+                <w:rFonts w:ascii="Times New Roman" w:hAnsi="Times New Roman" w:eastAsia="Times New Roman"/>
+                <w:b w:val="0"/>
+                <w:sz w:val="17"/>
+              </w:rPr>
+              <w:t>Адрес: [●]</w:t>
+            </w:r>
+          </w:p>
+          <w:p>
+            <w:pPr>
+              <w:spacing w:after="0" w:before="0" w:line="245" w:lineRule="auto"/>
+            </w:pPr>
+            <w:r>
+              <w:rPr>
+                <w:rFonts w:ascii="Times New Roman" w:hAnsi="Times New Roman" w:eastAsia="Times New Roman"/>
+                <w:b w:val="0"/>
+                <w:sz w:val="17"/>
               </w:rPr>
               <w:t>Рег. / налог. номер: [●]</w:t>
             </w:r>
@@ -825,7 +916,7 @@
               <w:rPr>
                 <w:rFonts w:ascii="Times New Roman" w:hAnsi="Times New Roman" w:eastAsia="Times New Roman"/>
                 <w:b w:val="0"/>
-                <w:sz w:val="18"/>
+                <w:sz w:val="17"/>
               </w:rPr>
               <w:t>Банк / IBAN / SWIFT: [●]</w:t>
             </w:r>
@@ -838,88 +929,7 @@
               <w:rPr>
                 <w:rFonts w:ascii="Times New Roman" w:hAnsi="Times New Roman" w:eastAsia="Times New Roman"/>
                 <w:b w:val="0"/>
-                <w:sz w:val="18"/>
-              </w:rPr>
-              <w:t>Email: sales@jetechnic.com</w:t>
-            </w:r>
-          </w:p>
-        </w:tc>
-        <w:tc>
-          <w:tcPr>
-            <w:tcW w:type="dxa" w:w="5213"/>
-          </w:tcPr>
-          <w:p>
-            <w:r/>
-            <w:r>
-              <w:rPr>
-                <w:rFonts w:ascii="Times New Roman" w:hAnsi="Times New Roman" w:eastAsia="Times New Roman"/>
-                <w:b/>
-                <w:sz w:val="20"/>
-              </w:rPr>
-              <w:t>ЗАКАЗЧИК: [●]</w:t>
-            </w:r>
-          </w:p>
-          <w:p>
-            <w:pPr>
-              <w:spacing w:after="0" w:before="0" w:line="245" w:lineRule="auto"/>
-            </w:pPr>
-            <w:r>
-              <w:rPr>
-                <w:rFonts w:ascii="Times New Roman" w:hAnsi="Times New Roman" w:eastAsia="Times New Roman"/>
-                <w:b w:val="0"/>
-                <w:sz w:val="18"/>
-              </w:rPr>
-              <w:t>Полное наименование: [●]</w:t>
-            </w:r>
-          </w:p>
-          <w:p>
-            <w:pPr>
-              <w:spacing w:after="0" w:before="0" w:line="245" w:lineRule="auto"/>
-            </w:pPr>
-            <w:r>
-              <w:rPr>
-                <w:rFonts w:ascii="Times New Roman" w:hAnsi="Times New Roman" w:eastAsia="Times New Roman"/>
-                <w:b w:val="0"/>
-                <w:sz w:val="18"/>
-              </w:rPr>
-              <w:t>Адрес: [●]</w:t>
-            </w:r>
-          </w:p>
-          <w:p>
-            <w:pPr>
-              <w:spacing w:after="0" w:before="0" w:line="245" w:lineRule="auto"/>
-            </w:pPr>
-            <w:r>
-              <w:rPr>
-                <w:rFonts w:ascii="Times New Roman" w:hAnsi="Times New Roman" w:eastAsia="Times New Roman"/>
-                <w:b w:val="0"/>
-                <w:sz w:val="18"/>
-              </w:rPr>
-              <w:t>Рег. / налог. номер: [●]</w:t>
-            </w:r>
-          </w:p>
-          <w:p>
-            <w:pPr>
-              <w:spacing w:after="0" w:before="0" w:line="245" w:lineRule="auto"/>
-            </w:pPr>
-            <w:r>
-              <w:rPr>
-                <w:rFonts w:ascii="Times New Roman" w:hAnsi="Times New Roman" w:eastAsia="Times New Roman"/>
-                <w:b w:val="0"/>
-                <w:sz w:val="18"/>
-              </w:rPr>
-              <w:t>Банк / IBAN / SWIFT: [●]</w:t>
-            </w:r>
-          </w:p>
-          <w:p>
-            <w:pPr>
-              <w:spacing w:after="0" w:before="0" w:line="245" w:lineRule="auto"/>
-            </w:pPr>
-            <w:r>
-              <w:rPr>
-                <w:rFonts w:ascii="Times New Roman" w:hAnsi="Times New Roman" w:eastAsia="Times New Roman"/>
-                <w:b w:val="0"/>
-                <w:sz w:val="18"/>
+                <w:sz w:val="17"/>
               </w:rPr>
               <w:t>Email: [●]   Тел.: [●]</w:t>
             </w:r>
@@ -932,7 +942,55 @@
               <w:rPr>
                 <w:rFonts w:ascii="Times New Roman" w:hAnsi="Times New Roman" w:eastAsia="Times New Roman"/>
                 <w:b w:val="0"/>
-                <w:sz w:val="18"/>
+                <w:sz w:val="17"/>
+              </w:rPr>
+            </w:r>
+          </w:p>
+          <w:p>
+            <w:pPr>
+              <w:spacing w:after="0" w:before="0" w:line="245" w:lineRule="auto"/>
+            </w:pPr>
+            <w:r>
+              <w:rPr>
+                <w:rFonts w:ascii="Times New Roman" w:hAnsi="Times New Roman" w:eastAsia="Times New Roman"/>
+                <w:b w:val="0"/>
+                <w:sz w:val="17"/>
+              </w:rPr>
+            </w:r>
+          </w:p>
+          <w:p>
+            <w:pPr>
+              <w:spacing w:after="0" w:before="0" w:line="245" w:lineRule="auto"/>
+            </w:pPr>
+            <w:r>
+              <w:rPr>
+                <w:rFonts w:ascii="Times New Roman" w:hAnsi="Times New Roman" w:eastAsia="Times New Roman"/>
+                <w:b w:val="0"/>
+                <w:sz w:val="17"/>
+              </w:rPr>
+            </w:r>
+          </w:p>
+          <w:p>
+            <w:pPr>
+              <w:spacing w:after="0" w:before="0" w:line="245" w:lineRule="auto"/>
+            </w:pPr>
+            <w:r>
+              <w:rPr>
+                <w:rFonts w:ascii="Times New Roman" w:hAnsi="Times New Roman" w:eastAsia="Times New Roman"/>
+                <w:b w:val="0"/>
+                <w:sz w:val="17"/>
+              </w:rPr>
+            </w:r>
+          </w:p>
+          <w:p>
+            <w:pPr>
+              <w:spacing w:after="0" w:before="0" w:line="245" w:lineRule="auto"/>
+            </w:pPr>
+            <w:r>
+              <w:rPr>
+                <w:rFonts w:ascii="Times New Roman" w:hAnsi="Times New Roman" w:eastAsia="Times New Roman"/>
+                <w:b w:val="0"/>
+                <w:sz w:val="17"/>
               </w:rPr>
             </w:r>
           </w:p>
@@ -941,7 +999,7 @@
       <w:tr>
         <w:tc>
           <w:tcPr>
-            <w:tcW w:type="dxa" w:w="5213"/>
+            <w:tcW w:type="dxa" w:w="5227"/>
           </w:tcPr>
           <w:p>
             <w:r/>
@@ -954,7 +1012,7 @@
               <w:rPr>
                 <w:rFonts w:ascii="Times New Roman" w:hAnsi="Times New Roman" w:eastAsia="Times New Roman"/>
                 <w:b w:val="0"/>
-                <w:sz w:val="18"/>
+                <w:sz w:val="17"/>
               </w:rPr>
             </w:r>
           </w:p>
@@ -966,7 +1024,66 @@
               <w:rPr>
                 <w:rFonts w:ascii="Times New Roman" w:hAnsi="Times New Roman" w:eastAsia="Times New Roman"/>
                 <w:b w:val="0"/>
-                <w:sz w:val="18"/>
+                <w:sz w:val="17"/>
+              </w:rPr>
+              <w:t>________________ / Serdar Guler /</w:t>
+            </w:r>
+          </w:p>
+          <w:p>
+            <w:pPr>
+              <w:spacing w:after="0" w:before="0" w:line="245" w:lineRule="auto"/>
+            </w:pPr>
+            <w:r>
+              <w:rPr>
+                <w:rFonts w:ascii="Times New Roman" w:hAnsi="Times New Roman" w:eastAsia="Times New Roman"/>
+                <w:b w:val="0"/>
+                <w:sz w:val="17"/>
+              </w:rPr>
+              <w:t>Генеральный директор</w:t>
+            </w:r>
+          </w:p>
+          <w:p>
+            <w:pPr>
+              <w:spacing w:after="0" w:before="0" w:line="245" w:lineRule="auto"/>
+            </w:pPr>
+            <w:r>
+              <w:rPr>
+                <w:rFonts w:ascii="Times New Roman" w:hAnsi="Times New Roman" w:eastAsia="Times New Roman"/>
+                <w:b w:val="0"/>
+                <w:sz w:val="17"/>
+              </w:rPr>
+              <w:t>М.П.</w:t>
+            </w:r>
+          </w:p>
+        </w:tc>
+        <w:tc>
+          <w:tcPr>
+            <w:tcW w:type="dxa" w:w="5227"/>
+          </w:tcPr>
+          <w:p>
+            <w:r/>
+          </w:p>
+          <w:p>
+            <w:pPr>
+              <w:spacing w:after="0" w:before="0" w:line="245" w:lineRule="auto"/>
+            </w:pPr>
+            <w:r>
+              <w:rPr>
+                <w:rFonts w:ascii="Times New Roman" w:hAnsi="Times New Roman" w:eastAsia="Times New Roman"/>
+                <w:b w:val="0"/>
+                <w:sz w:val="17"/>
+              </w:rPr>
+            </w:r>
+          </w:p>
+          <w:p>
+            <w:pPr>
+              <w:spacing w:after="0" w:before="0" w:line="245" w:lineRule="auto"/>
+            </w:pPr>
+            <w:r>
+              <w:rPr>
+                <w:rFonts w:ascii="Times New Roman" w:hAnsi="Times New Roman" w:eastAsia="Times New Roman"/>
+                <w:b w:val="0"/>
+                <w:sz w:val="17"/>
               </w:rPr>
               <w:t>________________ / [ФИО] /</w:t>
             </w:r>
@@ -979,7 +1096,7 @@
               <w:rPr>
                 <w:rFonts w:ascii="Times New Roman" w:hAnsi="Times New Roman" w:eastAsia="Times New Roman"/>
                 <w:b w:val="0"/>
-                <w:sz w:val="18"/>
+                <w:sz w:val="17"/>
               </w:rPr>
               <w:t>Должность: [●]</w:t>
             </w:r>
@@ -992,66 +1109,7 @@
               <w:rPr>
                 <w:rFonts w:ascii="Times New Roman" w:hAnsi="Times New Roman" w:eastAsia="Times New Roman"/>
                 <w:b w:val="0"/>
-                <w:sz w:val="18"/>
-              </w:rPr>
-              <w:t>М.П.</w:t>
-            </w:r>
-          </w:p>
-        </w:tc>
-        <w:tc>
-          <w:tcPr>
-            <w:tcW w:type="dxa" w:w="5213"/>
-          </w:tcPr>
-          <w:p>
-            <w:r/>
-          </w:p>
-          <w:p>
-            <w:pPr>
-              <w:spacing w:after="0" w:before="0" w:line="245" w:lineRule="auto"/>
-            </w:pPr>
-            <w:r>
-              <w:rPr>
-                <w:rFonts w:ascii="Times New Roman" w:hAnsi="Times New Roman" w:eastAsia="Times New Roman"/>
-                <w:b w:val="0"/>
-                <w:sz w:val="18"/>
-              </w:rPr>
-            </w:r>
-          </w:p>
-          <w:p>
-            <w:pPr>
-              <w:spacing w:after="0" w:before="0" w:line="245" w:lineRule="auto"/>
-            </w:pPr>
-            <w:r>
-              <w:rPr>
-                <w:rFonts w:ascii="Times New Roman" w:hAnsi="Times New Roman" w:eastAsia="Times New Roman"/>
-                <w:b w:val="0"/>
-                <w:sz w:val="18"/>
-              </w:rPr>
-              <w:t>________________ / [ФИО] /</w:t>
-            </w:r>
-          </w:p>
-          <w:p>
-            <w:pPr>
-              <w:spacing w:after="0" w:before="0" w:line="245" w:lineRule="auto"/>
-            </w:pPr>
-            <w:r>
-              <w:rPr>
-                <w:rFonts w:ascii="Times New Roman" w:hAnsi="Times New Roman" w:eastAsia="Times New Roman"/>
-                <w:b w:val="0"/>
-                <w:sz w:val="18"/>
-              </w:rPr>
-              <w:t>Должность: [●]</w:t>
-            </w:r>
-          </w:p>
-          <w:p>
-            <w:pPr>
-              <w:spacing w:after="0" w:before="0" w:line="245" w:lineRule="auto"/>
-            </w:pPr>
-            <w:r>
-              <w:rPr>
-                <w:rFonts w:ascii="Times New Roman" w:hAnsi="Times New Roman" w:eastAsia="Times New Roman"/>
-                <w:b w:val="0"/>
-                <w:sz w:val="18"/>
+                <w:sz w:val="17"/>
               </w:rPr>
               <w:t>М.П.</w:t>
             </w:r>
@@ -1095,12 +1153,12 @@
           <w:b w:val="0"/>
           <w:sz w:val="17"/>
         </w:rPr>
-        <w:t>Приложение № 2 — Карточка компании JET Technic / платёжные реквизиты (прилагается).</w:t>
+        <w:t>Приложение № 2 — Карточка компании JET TECHNIC (прилагается).</w:t>
       </w:r>
     </w:p>
     <w:p>
       <w:pPr>
-        <w:spacing w:before="80" w:after="60" w:line="252" w:lineRule="auto"/>
+        <w:spacing w:before="60" w:after="60" w:line="252" w:lineRule="auto"/>
       </w:pPr>
       <w:r>
         <w:rPr>
@@ -1108,12 +1166,12 @@
           <w:b w:val="0"/>
           <w:sz w:val="16"/>
         </w:rPr>
-        <w:t>ЧЕРНОВИК для внутренней проверки. Данные Заказчика и банковские/регистрационные реквизиты Исполнителя ещё не заполнены. Не является юридической консультацией.</w:t>
+        <w:t>ЧЕРНОВИК для внутренней проверки. Данные Заказчика и схема оплаты ещё не заполнены. Не является юридической консультацией.</w:t>
       </w:r>
     </w:p>
     <w:sectPr>
       <w:pgSz w:w="12240" w:h="15840"/>
-      <w:pgMar w:top="794" w:right="794" w:bottom="794" w:left="1020" w:header="720" w:footer="720" w:gutter="0"/>
+      <w:pgMar w:top="765" w:right="765" w:bottom="765" w:left="1020" w:header="720" w:footer="720" w:gutter="0"/>
       <w:cols w:space="720"/>
       <w:docGrid w:linePitch="360"/>
     </w:sectPr>

</xml_diff>

<commit_message>
Revise agreements: letterhead, post-pay, Appendix No. 1
Brand docs with JET Technic logo from KP; default 100% post-payment
with 50/50 and advance options; list price items line-by-line; replace
external KP/card annex references with embedded Appendix No. 1
(list of services and prices); regenerate .doc/.docx.

Co-authored-by: alexanderp-cell <alexanderp-cell@users.noreply.github.com>
</commit_message>
<xml_diff>
--- a/agreements/Dogovor_JT-BSI-2026_RU.docx
+++ b/agreements/Dogovor_JT-BSI-2026_RU.docx
@@ -60,7 +60,7 @@
     </w:p>
     <w:p>
       <w:pPr>
-        <w:spacing w:before="0" w:after="80" w:line="252" w:lineRule="auto"/>
+        <w:spacing w:after="80" w:before="0" w:line="252" w:lineRule="auto"/>
         <w:jc w:val="both"/>
       </w:pPr>
       <w:r>
@@ -77,7 +77,7 @@
           <w:b w:val="0"/>
           <w:sz w:val="20"/>
         </w:rPr>
-        <w:t xml:space="preserve"> (юридический адрес: Egitim Mahallesi, Fahrettin Kerim Gokay Caddesi, Ortaklar Is Merkezi, No: 71/57, Kadikoy, Istanbul, Turkiye; Company No. 389609-5; Tax No. 484 212 4015; тел. +90 533 736 84 00; email: sales@jetechnic.com; далее — «</w:t>
+        <w:t xml:space="preserve"> (юридический адрес: Egitim Mahallesi, Fahrettin Kerim Gokay Caddesi, Ortaklar Is Merkezi, No: 71/57, Kadikoy, Istanbul, Turkey; Company No. 389609-5; Tax No. 484 212 4015; тел. +90 533 736 84 00; email: sales@jetechnic.com; далее — «</w:t>
       </w:r>
       <w:r>
         <w:rPr>
@@ -98,7 +98,7 @@
     </w:p>
     <w:p>
       <w:pPr>
-        <w:spacing w:before="0" w:after="60" w:line="252" w:lineRule="auto"/>
+        <w:spacing w:after="60" w:before="0" w:line="252" w:lineRule="auto"/>
         <w:jc w:val="both"/>
       </w:pPr>
       <w:r>
@@ -151,6 +151,7 @@
     <w:p>
       <w:pPr>
         <w:spacing w:before="20" w:after="40" w:line="252" w:lineRule="auto"/>
+        <w:jc w:val="left"/>
       </w:pPr>
       <w:r>
         <w:rPr>
@@ -172,7 +173,7 @@
           <w:b w:val="0"/>
           <w:sz w:val="20"/>
         </w:rPr>
-        <w:t>1.1. Исполнитель обязуется оказать, а Заказчик обязуется принять и оплатить следующие услуги в отношении Boeing 737-500, регистрационный знак VQ-BOO (далее — «ВС») (далее — «Услуги»):</w:t>
+        <w:t>1.1. Исполнитель обязуется оказать, а Заказчик обязуется принять и оплатить услуги в отношении Boeing 737-500, регистрационный знак VQ-BOO (далее — «ВС»), перечень которых приведён в Приложении № 1 к настоящему Договору (далее — «Услуги»).</w:t>
       </w:r>
     </w:p>
     <w:p>
@@ -186,7 +187,7 @@
           <w:b w:val="0"/>
           <w:sz w:val="20"/>
         </w:rPr>
-        <w:t>(a) бороскопическую инспекцию (BSI) двух (2) двигателей CFM56-3 (объём работ уточняется / согласно КП);</w:t>
+        <w:t>1.2. В объём Услуг входит:</w:t>
       </w:r>
     </w:p>
     <w:p>
@@ -200,7 +201,7 @@
           <w:b w:val="0"/>
           <w:sz w:val="20"/>
         </w:rPr>
-        <w:t>(b) бороскопическую инспекцию (BSI) ВСУ APS2000;</w:t>
+        <w:t>(a) бороскопическая инспекция (BSI) двух (2) двигателей CFM56-3 (объём работ уточняется);</w:t>
       </w:r>
     </w:p>
     <w:p>
@@ -214,7 +215,7 @@
           <w:b w:val="0"/>
           <w:sz w:val="20"/>
         </w:rPr>
-        <w:t>(c) общую визуальную инспекцию (GVI) ВС, включая шасси, кабину пассажиров и отсек авионики;</w:t>
+        <w:t>(b) бороскопическая инспекция (BSI) ВСУ APS2000;</w:t>
       </w:r>
     </w:p>
     <w:p>
@@ -228,7 +229,7 @@
           <w:b w:val="0"/>
           <w:sz w:val="20"/>
         </w:rPr>
-        <w:t>(d) проверку документации по двигателям и ВСУ; и</w:t>
+        <w:t>(c) общая визуальная инспекция (GVI) ВС, включая шасси, пассажирскую кабину и отсек авионики;</w:t>
       </w:r>
     </w:p>
     <w:p>
@@ -242,7 +243,7 @@
           <w:b w:val="0"/>
           <w:sz w:val="20"/>
         </w:rPr>
-        <w:t>(e) связанные транспортные расходы и проживание персонала Исполнителя в объёме, включённом в Цену.</w:t>
+        <w:t>(d) проверка документации по двигателям и ВСУ; и</w:t>
       </w:r>
     </w:p>
     <w:p>
@@ -256,7 +257,7 @@
           <w:b w:val="0"/>
           <w:sz w:val="20"/>
         </w:rPr>
-        <w:t>1.2. Коммерческое предложение «VQ-BOO BSI and Inspection» от 06 августа 2026 г. (далее — «КП») является неотъемлемым Приложением № 1. Технический объём и Цена определяются КП; в остальном приоритет имеет Договор.</w:t>
+        <w:t>(e) транспортные расходы и проживание персонала Исполнителя в объёме, включённом в Цену согласно Приложению № 1.</w:t>
       </w:r>
     </w:p>
     <w:p>
@@ -270,7 +271,7 @@
           <w:b w:val="0"/>
           <w:sz w:val="20"/>
         </w:rPr>
-        <w:t>1.3. Место оказания Услуг: JAT Tehnika, Белград, Республика Сербия. Доступ в зону аэропорта и к ВС обеспечивает Заказчик.</w:t>
+        <w:t>1.3. Приложение № 1 (Перечень услуг и цены) является неотъемлемой частью Договора. При противоречии между текстом Договора и Приложением № 1 в части перечня Услуг или Цены приоритет имеет Приложение № 1.</w:t>
       </w:r>
     </w:p>
     <w:p>
@@ -284,12 +285,27 @@
           <w:b w:val="0"/>
           <w:sz w:val="20"/>
         </w:rPr>
-        <w:t>1.4. BSI выполняется сертифицированным инженером. Результат: отчёт(ы) об инспекции / BSI и видеоматериалы по BSI.</w:t>
+        <w:t>1.4. Место оказания Услуг: JAT Tehnika, Белград, Республика Сербия. Доступ в зону аэропорта и к ВС обеспечивает Заказчик.</w:t>
+      </w:r>
+    </w:p>
+    <w:p>
+      <w:pPr>
+        <w:spacing w:before="0" w:after="60" w:line="252" w:lineRule="auto"/>
+        <w:jc w:val="both"/>
+      </w:pPr>
+      <w:r>
+        <w:rPr>
+          <w:rFonts w:ascii="Times New Roman" w:hAnsi="Times New Roman" w:eastAsia="Times New Roman"/>
+          <w:b w:val="0"/>
+          <w:sz w:val="20"/>
+        </w:rPr>
+        <w:t>1.5. BSI выполняется сертифицированным инженером. Результат: отчёт(ы) об инспекции / BSI и видеоматериалы по BSI.</w:t>
       </w:r>
     </w:p>
     <w:p>
       <w:pPr>
         <w:spacing w:before="60" w:after="40" w:line="252" w:lineRule="auto"/>
+        <w:jc w:val="left"/>
       </w:pPr>
       <w:r>
         <w:rPr>
@@ -311,7 +327,7 @@
           <w:b w:val="0"/>
           <w:sz w:val="20"/>
         </w:rPr>
-        <w:t>2.1. Ориентировочный срок — 3 (три) дня с более поздней из дат: (i) вступления Договора в силу; (ii) поступления аванса (при наличии); (iii) предоставления Заказчиком доступа к аэропорту / ВС и необходимой документации.</w:t>
+        <w:t>2.1. Ориентировочный срок оказания Услуг — 3 (три) дня, начиная с более поздней из дат: (i) вступления Договора в силу; (ii) предоставления Заказчиком доступа к аэропорту / ВС и документации, разумно необходимой для оказания Услуг.</w:t>
       </w:r>
     </w:p>
     <w:p>
@@ -325,12 +341,13 @@
           <w:b w:val="0"/>
           <w:sz w:val="20"/>
         </w:rPr>
-        <w:t>2.2. Заказчик в течение 5 (пяти) рабочих дней подтверждает приёмку отчёта(ов) либо направляет мотивированные возражения; иначе Услуги считаются принятыми.</w:t>
+        <w:t>2.2. Заказчик в течение 5 (пяти) рабочих дней с даты получения отчёта(ов) подтверждает приёмку либо направляет мотивированные письменные возражения; в противном случае Услуги считаются принятыми.</w:t>
       </w:r>
     </w:p>
     <w:p>
       <w:pPr>
         <w:spacing w:before="60" w:after="40" w:line="252" w:lineRule="auto"/>
+        <w:jc w:val="left"/>
       </w:pPr>
       <w:r>
         <w:rPr>
@@ -352,7 +369,91 @@
           <w:b w:val="0"/>
           <w:sz w:val="20"/>
         </w:rPr>
-        <w:t>3.1. Общая Цена составляет USD 24 000,00 (двадцать четыре тысячи долларов США) без учёта применимых налогов и сборов:</w:t>
+        <w:t>3.1. Общая цена Услуг составляет USD 24 000,00 (двадцать четыре тысячи долларов США) (далее — «Цена») без учёта применимых налогов и сборов, а именно:</w:t>
+      </w:r>
+    </w:p>
+    <w:p>
+      <w:pPr>
+        <w:spacing w:before="0" w:after="20" w:line="252" w:lineRule="auto"/>
+        <w:jc w:val="left"/>
+      </w:pPr>
+      <w:r>
+        <w:rPr>
+          <w:rFonts w:ascii="Times New Roman" w:hAnsi="Times New Roman" w:eastAsia="Times New Roman"/>
+          <w:b w:val="0"/>
+          <w:sz w:val="20"/>
+        </w:rPr>
+        <w:t>• BSI CFM56-3 — 2 двигателя (объём работ уточняется) — USD 9 500,00</w:t>
+      </w:r>
+    </w:p>
+    <w:p>
+      <w:pPr>
+        <w:spacing w:before="0" w:after="20" w:line="252" w:lineRule="auto"/>
+        <w:jc w:val="left"/>
+      </w:pPr>
+      <w:r>
+        <w:rPr>
+          <w:rFonts w:ascii="Times New Roman" w:hAnsi="Times New Roman" w:eastAsia="Times New Roman"/>
+          <w:b w:val="0"/>
+          <w:sz w:val="20"/>
+        </w:rPr>
+        <w:t>• BSI ВСУ APS2000 — USD 4 000,00</w:t>
+      </w:r>
+    </w:p>
+    <w:p>
+      <w:pPr>
+        <w:spacing w:before="0" w:after="20" w:line="252" w:lineRule="auto"/>
+        <w:jc w:val="left"/>
+      </w:pPr>
+      <w:r>
+        <w:rPr>
+          <w:rFonts w:ascii="Times New Roman" w:hAnsi="Times New Roman" w:eastAsia="Times New Roman"/>
+          <w:b w:val="0"/>
+          <w:sz w:val="20"/>
+        </w:rPr>
+        <w:t>• GVI воздушного судна (включая шасси, пассажирскую кабину, отсек авионики) — USD 3 000,00</w:t>
+      </w:r>
+    </w:p>
+    <w:p>
+      <w:pPr>
+        <w:spacing w:before="0" w:after="20" w:line="252" w:lineRule="auto"/>
+        <w:jc w:val="left"/>
+      </w:pPr>
+      <w:r>
+        <w:rPr>
+          <w:rFonts w:ascii="Times New Roman" w:hAnsi="Times New Roman" w:eastAsia="Times New Roman"/>
+          <w:b w:val="0"/>
+          <w:sz w:val="20"/>
+        </w:rPr>
+        <w:t>• Проверка документации (двигатели, ВСУ) — USD 3 500,00</w:t>
+      </w:r>
+    </w:p>
+    <w:p>
+      <w:pPr>
+        <w:spacing w:before="0" w:after="20" w:line="252" w:lineRule="auto"/>
+        <w:jc w:val="left"/>
+      </w:pPr>
+      <w:r>
+        <w:rPr>
+          <w:rFonts w:ascii="Times New Roman" w:hAnsi="Times New Roman" w:eastAsia="Times New Roman"/>
+          <w:b w:val="0"/>
+          <w:sz w:val="20"/>
+        </w:rPr>
+        <w:t>• Транспортные расходы и проживание — USD 4 000,00</w:t>
+      </w:r>
+    </w:p>
+    <w:p>
+      <w:pPr>
+        <w:spacing w:before="40" w:after="60" w:line="252" w:lineRule="auto"/>
+        <w:jc w:val="left"/>
+      </w:pPr>
+      <w:r>
+        <w:rPr>
+          <w:rFonts w:ascii="Times New Roman" w:hAnsi="Times New Roman" w:eastAsia="Times New Roman"/>
+          <w:b/>
+          <w:sz w:val="20"/>
+        </w:rPr>
+        <w:t>Итого: USD 24 000,00.</w:t>
       </w:r>
     </w:p>
     <w:p>
@@ -366,7 +467,7 @@
           <w:b w:val="0"/>
           <w:sz w:val="20"/>
         </w:rPr>
-        <w:t>• BSI CFM56-3 — 2 двигателя (объём TBD) — USD 9 500,00;  • BSI ВСУ APS2000 — USD 4 000,00;</w:t>
+        <w:t>3.2. Варианты оплаты (Стороны выбирают один вариант путём отметки / вычёркивания неприменимого):</w:t>
       </w:r>
     </w:p>
     <w:p>
@@ -380,7 +481,7 @@
           <w:b w:val="0"/>
           <w:sz w:val="20"/>
         </w:rPr>
-        <w:t>• GVI ВС — USD 3 000,00;  • проверка документации (двигатели, ВСУ) — USD 3 500,00;  • транспорт и проживание — USD 4 000,00.</w:t>
+        <w:t>(A) 100% постоплата: Заказчик оплачивает 100% Цены в течение 5 (пяти) банковских дней после приёмки Услуг (или после признания Услуг принятыми по п. 2.2);</w:t>
       </w:r>
     </w:p>
     <w:p>
@@ -394,7 +495,7 @@
           <w:b w:val="0"/>
           <w:sz w:val="20"/>
         </w:rPr>
-        <w:t>3.2. Оплата: [100% предоплата / 50% аванс в течение 3 банковских дней с даты счёта и 50% в течение 5 банковских дней после передачи отчёта(ов)] в USD банковским переводом на USD-счёт Исполнителя (раздел 10). Банковские комиссии банка-отправителя — за счёт Заказчика.</w:t>
+        <w:t>(B) 50% / 50%: 50% Цены в течение 3 (трёх) банковских дней с даты счёта и 50% в течение 5 (пяти) банковских дней после приёмки Услуг; либо</w:t>
       </w:r>
     </w:p>
     <w:p>
@@ -408,12 +509,55 @@
           <w:b w:val="0"/>
           <w:sz w:val="20"/>
         </w:rPr>
-        <w:t>3.3. Работы вне объёма КП (включая доп. время из-за задержки доступа или неготовности ВС) согласовываются письменно и оплачиваются отдельно.</w:t>
+        <w:t>(C) 100% предоплата: Заказчик оплачивает 100% Цены в течение 3 (трёх) банковских дней с даты счёта / даты вступления Договора в силу.</w:t>
+      </w:r>
+    </w:p>
+    <w:p>
+      <w:pPr>
+        <w:spacing w:before="0" w:after="60" w:line="252" w:lineRule="auto"/>
+        <w:jc w:val="both"/>
+      </w:pPr>
+      <w:r>
+        <w:rPr>
+          <w:rFonts w:ascii="Times New Roman" w:hAnsi="Times New Roman" w:eastAsia="Times New Roman"/>
+          <w:b w:val="0"/>
+          <w:sz w:val="20"/>
+        </w:rPr>
+        <w:t>Если иной вариант прямо не выбран письменно, применяется вариант (A) (100% постоплата).</w:t>
+      </w:r>
+    </w:p>
+    <w:p>
+      <w:pPr>
+        <w:spacing w:before="0" w:after="60" w:line="252" w:lineRule="auto"/>
+        <w:jc w:val="both"/>
+      </w:pPr>
+      <w:r>
+        <w:rPr>
+          <w:rFonts w:ascii="Times New Roman" w:hAnsi="Times New Roman" w:eastAsia="Times New Roman"/>
+          <w:b w:val="0"/>
+          <w:sz w:val="20"/>
+        </w:rPr>
+        <w:t>3.3. Оплата производится в USD банковским переводом на USD-счёт Исполнителя, указанный в разделе 10. Комиссии банка-отправителя несёт Заказчик.</w:t>
+      </w:r>
+    </w:p>
+    <w:p>
+      <w:pPr>
+        <w:spacing w:before="0" w:after="60" w:line="252" w:lineRule="auto"/>
+        <w:jc w:val="both"/>
+      </w:pPr>
+      <w:r>
+        <w:rPr>
+          <w:rFonts w:ascii="Times New Roman" w:hAnsi="Times New Roman" w:eastAsia="Times New Roman"/>
+          <w:b w:val="0"/>
+          <w:sz w:val="20"/>
+        </w:rPr>
+        <w:t>3.4. Работы вне объёма Приложения № 1 (включая дополнительное время из-за задержки доступа или неготовности ВС) согласовываются письменно и оплачиваются отдельно.</w:t>
       </w:r>
     </w:p>
     <w:p>
       <w:pPr>
         <w:spacing w:before="60" w:after="40" w:line="252" w:lineRule="auto"/>
+        <w:jc w:val="left"/>
       </w:pPr>
       <w:r>
         <w:rPr>
@@ -435,7 +579,7 @@
           <w:b w:val="0"/>
           <w:sz w:val="20"/>
         </w:rPr>
-        <w:t>4.1. Исполнитель оказывает Услуги профессионально, соблюдает ТБ и процедуры JAT Tehnika, передаёт отчёт(ы) и видеоматериалы BSI.</w:t>
+        <w:t>4.1. Исполнитель оказывает Услуги профессионально, соблюдает применимые правила техники безопасности и процедуры ангара JAT Tehnika, передаёт отчёт(ы) и видеоматериалы BSI.</w:t>
       </w:r>
     </w:p>
     <w:p>
@@ -449,7 +593,7 @@
           <w:b w:val="0"/>
           <w:sz w:val="20"/>
         </w:rPr>
-        <w:t>4.2. Заказчик своевременно обеспечивает доступ в аэропорт и к ВС, координацию с JAT Tehnika, разрешения и необходимую документацию, оплачивает Цену и назначает контактное лицо.</w:t>
+        <w:t>4.2. Заказчик своевременно обеспечивает доступ в аэропорт и к ВС, координацию с JAT Tehnika, разрешения и техническую документацию, разумно необходимую для оказания Услуг, оплачивает Цену и назначает контактное лицо для оперативной координации.</w:t>
       </w:r>
     </w:p>
     <w:p>
@@ -463,12 +607,13 @@
           <w:b w:val="0"/>
           <w:sz w:val="20"/>
         </w:rPr>
-        <w:t>4.3. Услуги носят инспекционный / диагностический характер и не включают ремонт, устранение дефектов, подтверждение лётной годности или допуск к эксплуатации, если иное не согласовано письменно. Выводы основаны на состоянии и доступе на момент инспекции. Объём BSI двигателей подлежит уточнению («TBD»), как указано в КП.</w:t>
+        <w:t>4.3. Услуги носят инспекционный / диагностический характер и не включают ремонт, устранение дефектов, подтверждение лётной годности или допуск к эксплуатации, если иное прямо не согласовано письменно. Выводы отчёта основаны на состоянии и доступе на момент инспекции. Детальный объём BSI двигателей подлежит уточнению, как указано в Приложении № 1.</w:t>
       </w:r>
     </w:p>
     <w:p>
       <w:pPr>
         <w:spacing w:before="60" w:after="40" w:line="252" w:lineRule="auto"/>
+        <w:jc w:val="left"/>
       </w:pPr>
       <w:r>
         <w:rPr>
@@ -490,7 +635,7 @@
           <w:b w:val="0"/>
           <w:sz w:val="20"/>
         </w:rPr>
-        <w:t>5.1. За исключением умысла или грубой неосторожности, совокупная ответственность Исполнителя не превышает фактически уплаченную Цену. Стороны не отвечают за косвенные убытки (включая простой ВС), если иное не вытекает из императивных норм.</w:t>
+        <w:t>5.1. За исключением случаев умысла или грубой неосторожности, совокупная ответственность Исполнителя по Договору не превышает Цену, фактически уплаченную Заказчиком. Стороны не отвечают за косвенные убытки (включая упущенную выгоду и простой ВС), если иное не вытекает из императивных норм права.</w:t>
       </w:r>
     </w:p>
     <w:p>
@@ -504,12 +649,13 @@
           <w:b w:val="0"/>
           <w:sz w:val="20"/>
         </w:rPr>
-        <w:t>5.2. Обстоятельства непреодолимой силы (включая военные действия, санкции, стихийные бедствия, эпидемии, акты органов власти, закрытие аэропорта/ангара) освобождают от ответственности на период их действия при своевременном уведомлении. При продолжении свыше 30 дней любая Сторона вправе расторгнуть Договор без штрафных санкций с оплатой фактически оказанных Услуг.</w:t>
+        <w:t>5.2. Сторона освобождается от ответственности на период действия обстоятельств непреодолимой силы (включая военные действия, санкции, препятствующие исполнению, стихийные бедствия, эпидемии, акты органов власти, закрытие аэропорта или ангара) при условии своевременного письменного уведомления. При продолжении таких обстоятельств более 30 (тридцати) дней любая Сторона вправе расторгнуть Договор письменным уведомлением без штрафных санкций с оплатой фактически оказанных Услуг.</w:t>
       </w:r>
     </w:p>
     <w:p>
       <w:pPr>
         <w:spacing w:before="60" w:after="40" w:line="252" w:lineRule="auto"/>
+        <w:jc w:val="left"/>
       </w:pPr>
       <w:r>
         <w:rPr>
@@ -531,12 +677,13 @@
           <w:b w:val="0"/>
           <w:sz w:val="20"/>
         </w:rPr>
-        <w:t>6.1. Стороны сохраняют конфиденциальность непубличной коммерческой и технической информации, полученной по Договору, в течение 3 (трёх) лет после его прекращения, за исключением раскрытия консультантам или по требованию закона.</w:t>
+        <w:t>6.1. Каждая Сторона обязуется не раскрывать конфиденциальную коммерческую и техническую информацию другой Стороны, полученную в связи с Договором, третьим лицам без предварительного письменного согласия, за исключением профессиональных консультантов и случаев, предусмотренных законом. Обязательство действует в течение 3 (трёх) лет после прекращения Договора.</w:t>
       </w:r>
     </w:p>
     <w:p>
       <w:pPr>
         <w:spacing w:before="60" w:after="40" w:line="252" w:lineRule="auto"/>
+        <w:jc w:val="left"/>
       </w:pPr>
       <w:r>
         <w:rPr>
@@ -558,7 +705,7 @@
           <w:b w:val="0"/>
           <w:sz w:val="20"/>
         </w:rPr>
-        <w:t>7.1. Договор вступает в силу с даты подписания обеими Сторонами (либо с более поздней даты подписи) и действует до полного исполнения.</w:t>
+        <w:t>7.1. Договор вступает в силу с даты подписания обеими Сторонами (либо с более поздней даты подписи) и действует до полного исполнения обязательств Сторон.</w:t>
       </w:r>
     </w:p>
     <w:p>
@@ -572,7 +719,7 @@
           <w:b w:val="0"/>
           <w:sz w:val="20"/>
         </w:rPr>
-        <w:t>7.2. Любая Сторона вправе расторгнуть Договор при существенном нарушении, не устранённом в течение 10 рабочих дней. Заказчик вправе отказаться до начала работ с возмещением документально подтверждённых расходов Исполнителя.</w:t>
+        <w:t>7.2. Любая Сторона вправе расторгнуть Договор письменным уведомлением при существенном нарушении другой Стороной, не устранённом в течение 10 (десяти) рабочих дней с даты уведомления. Заказчик вправе отказаться от Услуг до их начала с возмещением документально подтверждённых расходов Исполнителя.</w:t>
       </w:r>
     </w:p>
     <w:p>
@@ -586,12 +733,13 @@
           <w:b w:val="0"/>
           <w:sz w:val="20"/>
         </w:rPr>
-        <w:t>7.3. Изменения действительны только в письменной форме, подписанной обеими Сторонами (включая PDF-сканы).</w:t>
+        <w:t>7.3. Изменения действительны только в письменной форме, подписанной обеими Сторонами (включая обмен подписанными PDF-сканами).</w:t>
       </w:r>
     </w:p>
     <w:p>
       <w:pPr>
         <w:spacing w:before="60" w:after="40" w:line="252" w:lineRule="auto"/>
+        <w:jc w:val="left"/>
       </w:pPr>
       <w:r>
         <w:rPr>
@@ -627,12 +775,13 @@
           <w:b w:val="0"/>
           <w:sz w:val="20"/>
         </w:rPr>
-        <w:t>8.2. Споры, не урегулированные в течение 15 рабочих дней, передаются в компетентные суды Стамбула, Турция. Язык разбирательства — английский, если иное не согласовано.</w:t>
+        <w:t>8.2. Споры, не урегулированные путём переговоров в течение 15 (пятнадцати) рабочих дней, передаются в компетентные суды Стамбула, Турция. Язык разбирательства — английский, если иное не согласовано.</w:t>
       </w:r>
     </w:p>
     <w:p>
       <w:pPr>
         <w:spacing w:before="60" w:after="40" w:line="252" w:lineRule="auto"/>
+        <w:jc w:val="left"/>
       </w:pPr>
       <w:r>
         <w:rPr>
@@ -654,7 +803,7 @@
           <w:b w:val="0"/>
           <w:sz w:val="20"/>
         </w:rPr>
-        <w:t>9.1. Договор составлен на английском и русском языках в двух экземплярах. При расхождении приоритет имеет английская версия. PDF-сканы подписанных оригиналов имеют равную силу.</w:t>
+        <w:t>9.1. Договор составлен на английском и русском языках в двух экземплярах (по одному для каждой Стороны). При расхождении между языковыми версиями приоритет имеет английская версия. Каждый экземпляр (включая PDF-скан подписанного оригинала) имеет равную юридическую силу.</w:t>
       </w:r>
     </w:p>
     <w:p>
@@ -668,7 +817,7 @@
           <w:b w:val="0"/>
           <w:sz w:val="20"/>
         </w:rPr>
-        <w:t>9.2. Приложения: Приложение № 1 — КП от 06 августа 2026 г.; Приложение № 2 — карточка компании Исполнителя.</w:t>
+        <w:t>9.2. Приложение № 1 (Перечень услуг и цены) является неотъемлемой частью настоящего Договора.</w:t>
       </w:r>
     </w:p>
     <w:p>
@@ -682,12 +831,13 @@
           <w:b w:val="0"/>
           <w:sz w:val="20"/>
         </w:rPr>
-        <w:t>9.3. Уведомления по email (раздел 10) считаются полученными на следующий рабочий день при отсутствии сообщения о недоставке.</w:t>
+        <w:t>9.3. Уведомления могут направляться по электронной почте на адреса, указанные в разделе 10, и считаются полученными на следующий рабочий день после отправки при отсутствии сообщения о недоставке.</w:t>
       </w:r>
     </w:p>
     <w:p>
       <w:pPr>
         <w:spacing w:before="60" w:after="60" w:line="252" w:lineRule="auto"/>
+        <w:jc w:val="left"/>
       </w:pPr>
       <w:r>
         <w:rPr>
@@ -704,13 +854,13 @@
         <w:tblLook w:firstColumn="1" w:firstRow="1" w:lastColumn="0" w:lastRow="0" w:noHBand="0" w:noVBand="1" w:val="04A0"/>
       </w:tblPr>
       <w:tblGrid>
-        <w:gridCol w:w="5227"/>
-        <w:gridCol w:w="5227"/>
+        <w:gridCol w:w="5185"/>
+        <w:gridCol w:w="5185"/>
       </w:tblGrid>
       <w:tr>
         <w:tc>
           <w:tcPr>
-            <w:tcW w:type="dxa" w:w="5227"/>
+            <w:tcW w:type="dxa" w:w="5185"/>
           </w:tcPr>
           <w:p>
             <w:r/>
@@ -746,7 +896,7 @@
                 <w:b w:val="0"/>
                 <w:sz w:val="17"/>
               </w:rPr>
-              <w:t>Адрес: Egitim Mahallesi, Fahrettin Kerim Gokay Caddesi, Ortaklar Is Merkezi, No: 71/57, Kadikoy, Istanbul, Turkiye</w:t>
+              <w:t>Адрес: Egitim Mahallesi, Fahrettin Kerim Gokay Caddesi, Ortaklar Is Merkezi, No: 71/57, Kadikoy, Istanbul, Turkey</w:t>
             </w:r>
           </w:p>
           <w:p>
@@ -856,7 +1006,7 @@
         </w:tc>
         <w:tc>
           <w:tcPr>
-            <w:tcW w:type="dxa" w:w="5227"/>
+            <w:tcW w:type="dxa" w:w="5185"/>
           </w:tcPr>
           <w:p>
             <w:r/>
@@ -999,7 +1149,7 @@
       <w:tr>
         <w:tc>
           <w:tcPr>
-            <w:tcW w:type="dxa" w:w="5227"/>
+            <w:tcW w:type="dxa" w:w="5185"/>
           </w:tcPr>
           <w:p>
             <w:r/>
@@ -1058,7 +1208,7 @@
         </w:tc>
         <w:tc>
           <w:tcPr>
-            <w:tcW w:type="dxa" w:w="5227"/>
+            <w:tcW w:type="dxa" w:w="5185"/>
           </w:tcPr>
           <w:p>
             <w:r/>
@@ -1118,8 +1268,293 @@
       </w:tr>
     </w:tbl>
     <w:p>
+      <w:r>
+        <w:br w:type="page"/>
+      </w:r>
+    </w:p>
+    <w:p>
+      <w:pPr>
+        <w:spacing w:before="0" w:after="40" w:line="252" w:lineRule="auto"/>
+        <w:jc w:val="center"/>
+      </w:pPr>
+      <w:r>
+        <w:rPr>
+          <w:rFonts w:ascii="Times New Roman" w:hAnsi="Times New Roman" w:eastAsia="Times New Roman"/>
+          <w:b/>
+          <w:sz w:val="24"/>
+        </w:rPr>
+        <w:t>ПРИЛОЖЕНИЕ № 1</w:t>
+      </w:r>
+    </w:p>
+    <w:p>
+      <w:pPr>
+        <w:spacing w:before="0" w:after="40" w:line="252" w:lineRule="auto"/>
+        <w:jc w:val="center"/>
+      </w:pPr>
+      <w:r>
+        <w:rPr>
+          <w:rFonts w:ascii="Times New Roman" w:hAnsi="Times New Roman" w:eastAsia="Times New Roman"/>
+          <w:b/>
+          <w:sz w:val="20"/>
+        </w:rPr>
+        <w:t>к Договору возмездного оказания услуг № ____ / JT-BSI-2026</w:t>
+      </w:r>
+    </w:p>
+    <w:p>
+      <w:pPr>
+        <w:spacing w:before="0" w:after="80" w:line="252" w:lineRule="auto"/>
+        <w:jc w:val="center"/>
+      </w:pPr>
+      <w:r>
+        <w:rPr>
+          <w:rFonts w:ascii="Times New Roman" w:hAnsi="Times New Roman" w:eastAsia="Times New Roman"/>
+          <w:b/>
+          <w:sz w:val="22"/>
+        </w:rPr>
+        <w:t>ПЕРЕЧЕНЬ УСЛУГ И ЦЕНЫ</w:t>
+      </w:r>
+    </w:p>
+    <w:p>
       <w:pPr>
         <w:spacing w:before="0" w:after="20" w:line="252" w:lineRule="auto"/>
+        <w:jc w:val="center"/>
+      </w:pPr>
+      <w:r>
+        <w:rPr>
+          <w:rFonts w:ascii="Times New Roman" w:hAnsi="Times New Roman" w:eastAsia="Times New Roman"/>
+          <w:b w:val="0"/>
+          <w:sz w:val="20"/>
+        </w:rPr>
+        <w:t>Воздушное судно: Boeing 737-500, регистрационный знак VQ-BOO</w:t>
+      </w:r>
+    </w:p>
+    <w:p>
+      <w:pPr>
+        <w:spacing w:before="0" w:after="20" w:line="252" w:lineRule="auto"/>
+        <w:jc w:val="center"/>
+      </w:pPr>
+      <w:r>
+        <w:rPr>
+          <w:rFonts w:ascii="Times New Roman" w:hAnsi="Times New Roman" w:eastAsia="Times New Roman"/>
+          <w:b w:val="0"/>
+          <w:sz w:val="20"/>
+        </w:rPr>
+        <w:t>Место оказания услуг: JAT Tehnika, Белград, Республика Сербия</w:t>
+      </w:r>
+    </w:p>
+    <w:p>
+      <w:pPr>
+        <w:spacing w:before="0" w:after="120" w:line="252" w:lineRule="auto"/>
+        <w:jc w:val="center"/>
+      </w:pPr>
+      <w:r>
+        <w:rPr>
+          <w:rFonts w:ascii="Times New Roman" w:hAnsi="Times New Roman" w:eastAsia="Times New Roman"/>
+          <w:b w:val="0"/>
+          <w:sz w:val="20"/>
+        </w:rPr>
+        <w:t>Ориентировочный срок: 3 (три) дня</w:t>
+      </w:r>
+    </w:p>
+    <w:p>
+      <w:pPr>
+        <w:spacing w:before="0" w:after="60" w:line="252" w:lineRule="auto"/>
+        <w:jc w:val="left"/>
+      </w:pPr>
+      <w:r>
+        <w:rPr>
+          <w:rFonts w:ascii="Times New Roman" w:hAnsi="Times New Roman" w:eastAsia="Times New Roman"/>
+          <w:b/>
+          <w:sz w:val="20"/>
+        </w:rPr>
+        <w:t>1. Перечень услуг (компонентов):</w:t>
+      </w:r>
+    </w:p>
+    <w:p>
+      <w:pPr>
+        <w:spacing w:before="0" w:after="60" w:line="252" w:lineRule="auto"/>
+        <w:jc w:val="left"/>
+      </w:pPr>
+      <w:r>
+        <w:rPr>
+          <w:rFonts w:ascii="Times New Roman" w:hAnsi="Times New Roman" w:eastAsia="Times New Roman"/>
+          <w:b w:val="0"/>
+          <w:sz w:val="20"/>
+        </w:rPr>
+        <w:t>1.1. BSI двух (2) двигателей CFM56-3 (объём работ уточняется).</w:t>
+      </w:r>
+    </w:p>
+    <w:p>
+      <w:pPr>
+        <w:spacing w:before="0" w:after="60" w:line="252" w:lineRule="auto"/>
+        <w:jc w:val="left"/>
+      </w:pPr>
+      <w:r>
+        <w:rPr>
+          <w:rFonts w:ascii="Times New Roman" w:hAnsi="Times New Roman" w:eastAsia="Times New Roman"/>
+          <w:b w:val="0"/>
+          <w:sz w:val="20"/>
+        </w:rPr>
+        <w:t>1.2. BSI ВСУ APS2000.</w:t>
+      </w:r>
+    </w:p>
+    <w:p>
+      <w:pPr>
+        <w:spacing w:before="0" w:after="60" w:line="252" w:lineRule="auto"/>
+        <w:jc w:val="left"/>
+      </w:pPr>
+      <w:r>
+        <w:rPr>
+          <w:rFonts w:ascii="Times New Roman" w:hAnsi="Times New Roman" w:eastAsia="Times New Roman"/>
+          <w:b w:val="0"/>
+          <w:sz w:val="20"/>
+        </w:rPr>
+        <w:t>1.3. GVI воздушного судна, включая шасси, пассажирскую кабину и отсек авионики.</w:t>
+      </w:r>
+    </w:p>
+    <w:p>
+      <w:pPr>
+        <w:spacing w:before="0" w:after="60" w:line="252" w:lineRule="auto"/>
+        <w:jc w:val="left"/>
+      </w:pPr>
+      <w:r>
+        <w:rPr>
+          <w:rFonts w:ascii="Times New Roman" w:hAnsi="Times New Roman" w:eastAsia="Times New Roman"/>
+          <w:b w:val="0"/>
+          <w:sz w:val="20"/>
+        </w:rPr>
+        <w:t>1.4. Проверка документации (двигатели, ВСУ).</w:t>
+      </w:r>
+    </w:p>
+    <w:p>
+      <w:pPr>
+        <w:spacing w:before="0" w:after="80" w:line="252" w:lineRule="auto"/>
+        <w:jc w:val="left"/>
+      </w:pPr>
+      <w:r>
+        <w:rPr>
+          <w:rFonts w:ascii="Times New Roman" w:hAnsi="Times New Roman" w:eastAsia="Times New Roman"/>
+          <w:b w:val="0"/>
+          <w:sz w:val="20"/>
+        </w:rPr>
+        <w:t>1.5. Транспортные расходы и проживание, связанные с оказанием Услуг.</w:t>
+      </w:r>
+    </w:p>
+    <w:p>
+      <w:pPr>
+        <w:spacing w:before="0" w:after="60" w:line="252" w:lineRule="auto"/>
+        <w:jc w:val="left"/>
+      </w:pPr>
+      <w:r>
+        <w:rPr>
+          <w:rFonts w:ascii="Times New Roman" w:hAnsi="Times New Roman" w:eastAsia="Times New Roman"/>
+          <w:b/>
+          <w:sz w:val="20"/>
+        </w:rPr>
+        <w:t>2. Цены (USD, без учёта применимых налогов и сборов):</w:t>
+      </w:r>
+    </w:p>
+    <w:p>
+      <w:pPr>
+        <w:spacing w:before="0" w:after="20" w:line="252" w:lineRule="auto"/>
+        <w:jc w:val="left"/>
+      </w:pPr>
+      <w:r>
+        <w:rPr>
+          <w:rFonts w:ascii="Times New Roman" w:hAnsi="Times New Roman" w:eastAsia="Times New Roman"/>
+          <w:b w:val="0"/>
+          <w:sz w:val="20"/>
+        </w:rPr>
+        <w:t>• BSI CFM56-3 — 2 двигателя (объём работ уточняется) — USD 9 500,00</w:t>
+      </w:r>
+    </w:p>
+    <w:p>
+      <w:pPr>
+        <w:spacing w:before="0" w:after="20" w:line="252" w:lineRule="auto"/>
+        <w:jc w:val="left"/>
+      </w:pPr>
+      <w:r>
+        <w:rPr>
+          <w:rFonts w:ascii="Times New Roman" w:hAnsi="Times New Roman" w:eastAsia="Times New Roman"/>
+          <w:b w:val="0"/>
+          <w:sz w:val="20"/>
+        </w:rPr>
+        <w:t>• BSI ВСУ APS2000 — USD 4 000,00</w:t>
+      </w:r>
+    </w:p>
+    <w:p>
+      <w:pPr>
+        <w:spacing w:before="0" w:after="20" w:line="252" w:lineRule="auto"/>
+        <w:jc w:val="left"/>
+      </w:pPr>
+      <w:r>
+        <w:rPr>
+          <w:rFonts w:ascii="Times New Roman" w:hAnsi="Times New Roman" w:eastAsia="Times New Roman"/>
+          <w:b w:val="0"/>
+          <w:sz w:val="20"/>
+        </w:rPr>
+        <w:t>• GVI воздушного судна (включая шасси, пассажирскую кабину, отсек авионики) — USD 3 000,00</w:t>
+      </w:r>
+    </w:p>
+    <w:p>
+      <w:pPr>
+        <w:spacing w:before="0" w:after="20" w:line="252" w:lineRule="auto"/>
+        <w:jc w:val="left"/>
+      </w:pPr>
+      <w:r>
+        <w:rPr>
+          <w:rFonts w:ascii="Times New Roman" w:hAnsi="Times New Roman" w:eastAsia="Times New Roman"/>
+          <w:b w:val="0"/>
+          <w:sz w:val="20"/>
+        </w:rPr>
+        <w:t>• Проверка документации (двигатели, ВСУ) — USD 3 500,00</w:t>
+      </w:r>
+    </w:p>
+    <w:p>
+      <w:pPr>
+        <w:spacing w:before="0" w:after="20" w:line="252" w:lineRule="auto"/>
+        <w:jc w:val="left"/>
+      </w:pPr>
+      <w:r>
+        <w:rPr>
+          <w:rFonts w:ascii="Times New Roman" w:hAnsi="Times New Roman" w:eastAsia="Times New Roman"/>
+          <w:b w:val="0"/>
+          <w:sz w:val="20"/>
+        </w:rPr>
+        <w:t>• Транспортные расходы и проживание — USD 4 000,00</w:t>
+      </w:r>
+    </w:p>
+    <w:p>
+      <w:pPr>
+        <w:spacing w:before="60" w:after="80" w:line="252" w:lineRule="auto"/>
+        <w:jc w:val="left"/>
+      </w:pPr>
+      <w:r>
+        <w:rPr>
+          <w:rFonts w:ascii="Times New Roman" w:hAnsi="Times New Roman" w:eastAsia="Times New Roman"/>
+          <w:b/>
+          <w:sz w:val="20"/>
+        </w:rPr>
+        <w:t>ИТОГО: USD 24 000,00 (двадцать четыре тысячи долларов США).</w:t>
+      </w:r>
+    </w:p>
+    <w:p>
+      <w:pPr>
+        <w:spacing w:before="0" w:after="40" w:line="252" w:lineRule="auto"/>
+        <w:jc w:val="left"/>
+      </w:pPr>
+      <w:r>
+        <w:rPr>
+          <w:rFonts w:ascii="Times New Roman" w:hAnsi="Times New Roman" w:eastAsia="Times New Roman"/>
+          <w:b/>
+          <w:sz w:val="20"/>
+        </w:rPr>
+        <w:t>3. Примечания:</w:t>
+      </w:r>
+    </w:p>
+    <w:p>
+      <w:pPr>
+        <w:spacing w:before="0" w:after="60" w:line="252" w:lineRule="auto"/>
         <w:jc w:val="both"/>
       </w:pPr>
       <w:r>
@@ -1128,37 +1563,83 @@
           <w:b w:val="0"/>
           <w:sz w:val="20"/>
         </w:rPr>
+        <w:t>3.1. Цена не включает применимые налоги и сборы.</w:t>
       </w:r>
     </w:p>
     <w:p>
       <w:pPr>
-        <w:spacing w:before="0" w:after="20" w:line="252" w:lineRule="auto"/>
+        <w:spacing w:before="0" w:after="60" w:line="252" w:lineRule="auto"/>
+        <w:jc w:val="both"/>
       </w:pPr>
       <w:r>
         <w:rPr>
           <w:rFonts w:ascii="Times New Roman" w:hAnsi="Times New Roman" w:eastAsia="Times New Roman"/>
           <w:b w:val="0"/>
-          <w:sz w:val="17"/>
+          <w:sz w:val="20"/>
         </w:rPr>
-        <w:t>Приложение № 1 — Коммерческое предложение «VQ-BOO BSI and Inspection» от 06 августа 2026 г. (прилагается).</w:t>
+        <w:t>3.2. Доступ в зону аэропорта и к ВС обеспечивает Заказчик.</w:t>
       </w:r>
     </w:p>
     <w:p>
       <w:pPr>
-        <w:spacing w:before="0" w:after="20" w:line="252" w:lineRule="auto"/>
+        <w:spacing w:before="0" w:after="60" w:line="252" w:lineRule="auto"/>
+        <w:jc w:val="both"/>
       </w:pPr>
       <w:r>
         <w:rPr>
           <w:rFonts w:ascii="Times New Roman" w:hAnsi="Times New Roman" w:eastAsia="Times New Roman"/>
           <w:b w:val="0"/>
-          <w:sz w:val="17"/>
+          <w:sz w:val="20"/>
         </w:rPr>
-        <w:t>Приложение № 2 — Карточка компании JET TECHNIC (прилагается).</w:t>
+        <w:t>3.3. BSI выполняется сертифицированным инженером с выдачей отчёта BSI и видеоматериалов.</w:t>
       </w:r>
     </w:p>
     <w:p>
       <w:pPr>
-        <w:spacing w:before="60" w:after="60" w:line="252" w:lineRule="auto"/>
+        <w:spacing w:before="0" w:after="160" w:line="252" w:lineRule="auto"/>
+        <w:jc w:val="both"/>
+      </w:pPr>
+      <w:r>
+        <w:rPr>
+          <w:rFonts w:ascii="Times New Roman" w:hAnsi="Times New Roman" w:eastAsia="Times New Roman"/>
+          <w:b w:val="0"/>
+          <w:sz w:val="20"/>
+        </w:rPr>
+        <w:t>3.4. Настоящее Приложение № 1 является неотъемлемой частью Договора.</w:t>
+      </w:r>
+    </w:p>
+    <w:p>
+      <w:pPr>
+        <w:spacing w:before="0" w:after="40" w:line="252" w:lineRule="auto"/>
+        <w:jc w:val="left"/>
+      </w:pPr>
+      <w:r>
+        <w:rPr>
+          <w:rFonts w:ascii="Times New Roman" w:hAnsi="Times New Roman" w:eastAsia="Times New Roman"/>
+          <w:b w:val="0"/>
+          <w:sz w:val="20"/>
+        </w:rPr>
+        <w:t>ИСПОЛНИТЕЛЬ: ________________ / Serdar Guler /</w:t>
+      </w:r>
+    </w:p>
+    <w:p>
+      <w:pPr>
+        <w:spacing w:before="0" w:after="120" w:line="252" w:lineRule="auto"/>
+        <w:jc w:val="left"/>
+      </w:pPr>
+      <w:r>
+        <w:rPr>
+          <w:rFonts w:ascii="Times New Roman" w:hAnsi="Times New Roman" w:eastAsia="Times New Roman"/>
+          <w:b w:val="0"/>
+          <w:sz w:val="20"/>
+        </w:rPr>
+        <w:t>ЗАКАЗЧИК:    ________________ / [ФИО] /</w:t>
+      </w:r>
+    </w:p>
+    <w:p>
+      <w:pPr>
+        <w:spacing w:before="0" w:after="60" w:line="252" w:lineRule="auto"/>
+        <w:jc w:val="left"/>
       </w:pPr>
       <w:r>
         <w:rPr>
@@ -1166,17 +1647,85 @@
           <w:b w:val="0"/>
           <w:sz w:val="16"/>
         </w:rPr>
-        <w:t>ЧЕРНОВИК для внутренней проверки. Данные Заказчика и схема оплаты ещё не заполнены. Не является юридической консультацией.</w:t>
+        <w:t>ЧЕРНОВИК — для внутренней проверки. Данные Заказчика ещё не заполнены. Не является юридической консультацией.</w:t>
       </w:r>
     </w:p>
     <w:sectPr>
+      <w:headerReference w:type="default" r:id="rId9"/>
+      <w:footerReference w:type="default" r:id="rId10"/>
       <w:pgSz w:w="12240" w:h="15840"/>
-      <w:pgMar w:top="765" w:right="765" w:bottom="765" w:left="1020" w:header="720" w:footer="720" w:gutter="0"/>
+      <w:pgMar w:top="680" w:right="850" w:bottom="907" w:left="1020" w:header="283" w:footer="283" w:gutter="0"/>
       <w:cols w:space="720"/>
       <w:docGrid w:linePitch="360"/>
     </w:sectPr>
   </w:body>
 </w:document>
+</file>
+
+<file path=word/footer1.xml><?xml version="1.0" encoding="utf-8"?>
+<w:ftr xmlns:m="http://schemas.openxmlformats.org/officeDocument/2006/math" xmlns:mc="http://schemas.openxmlformats.org/markup-compatibility/2006" xmlns:mo="http://schemas.microsoft.com/office/mac/office/2008/main" xmlns:mv="urn:schemas-microsoft-com:mac:vml" xmlns:o="urn:schemas-microsoft-com:office:office" xmlns:r="http://schemas.openxmlformats.org/officeDocument/2006/relationships" xmlns:v="urn:schemas-microsoft-com:vml" xmlns:w10="urn:schemas-microsoft-com:office:word" xmlns:w14="http://schemas.microsoft.com/office/word/2010/wordml" xmlns:w="http://schemas.openxmlformats.org/wordprocessingml/2006/main" xmlns:wne="http://schemas.microsoft.com/office/word/2006/wordml" xmlns:wp14="http://schemas.microsoft.com/office/word/2010/wordprocessingDrawing" xmlns:wp="http://schemas.openxmlformats.org/drawingml/2006/wordprocessingDrawing" xmlns:wpc="http://schemas.microsoft.com/office/word/2010/wordprocessingCanvas" xmlns:wpg="http://schemas.microsoft.com/office/word/2010/wordprocessingGroup" xmlns:wpi="http://schemas.microsoft.com/office/word/2010/wordprocessingInk" xmlns:wps="http://schemas.microsoft.com/office/word/2010/wordprocessingShape" mc:Ignorable="w14 wp14">
+  <w:p>
+    <w:pPr>
+      <w:pStyle w:val="Footer"/>
+      <w:jc w:val="center"/>
+    </w:pPr>
+    <w:r>
+      <w:rPr>
+        <w:rFonts w:ascii="Times New Roman" w:hAnsi="Times New Roman" w:eastAsia="Times New Roman"/>
+        <w:b w:val="0"/>
+        <w:color w:val="555555"/>
+        <w:sz w:val="15"/>
+      </w:rPr>
+      <w:t>Egitim Mahallesi, Fahrettin Kerim Gokay Caddesi, Ortaklar Ishani, N: 71/57, Kadikoy, 34722, Istanbul, Turkey  |  sales@jetechnic.com  |  jetechnic.com</w:t>
+    </w:r>
+  </w:p>
+</w:ftr>
+</file>
+
+<file path=word/header1.xml><?xml version="1.0" encoding="utf-8"?>
+<w:hdr xmlns:m="http://schemas.openxmlformats.org/officeDocument/2006/math" xmlns:mc="http://schemas.openxmlformats.org/markup-compatibility/2006" xmlns:mo="http://schemas.microsoft.com/office/mac/office/2008/main" xmlns:mv="urn:schemas-microsoft-com:mac:vml" xmlns:o="urn:schemas-microsoft-com:office:office" xmlns:r="http://schemas.openxmlformats.org/officeDocument/2006/relationships" xmlns:v="urn:schemas-microsoft-com:vml" xmlns:w10="urn:schemas-microsoft-com:office:word" xmlns:w14="http://schemas.microsoft.com/office/word/2010/wordml" xmlns:w="http://schemas.openxmlformats.org/wordprocessingml/2006/main" xmlns:wne="http://schemas.microsoft.com/office/word/2006/wordml" xmlns:wp14="http://schemas.microsoft.com/office/word/2010/wordprocessingDrawing" xmlns:wp="http://schemas.openxmlformats.org/drawingml/2006/wordprocessingDrawing" xmlns:wpc="http://schemas.microsoft.com/office/word/2010/wordprocessingCanvas" xmlns:wpg="http://schemas.microsoft.com/office/word/2010/wordprocessingGroup" xmlns:wpi="http://schemas.microsoft.com/office/word/2010/wordprocessingInk" xmlns:wps="http://schemas.microsoft.com/office/word/2010/wordprocessingShape" mc:Ignorable="w14 wp14">
+  <w:p>
+    <w:pPr>
+      <w:pStyle w:val="Header"/>
+      <w:spacing w:after="40" w:before="0"/>
+      <w:jc w:val="center"/>
+    </w:pPr>
+    <w:r>
+      <w:drawing>
+        <wp:inline xmlns:a="http://schemas.openxmlformats.org/drawingml/2006/main" xmlns:pic="http://schemas.openxmlformats.org/drawingml/2006/picture">
+          <wp:extent cx="3780000" cy="644882"/>
+          <wp:docPr id="1" name="Picture 1"/>
+          <wp:cNvGraphicFramePr>
+            <a:graphicFrameLocks noChangeAspect="1"/>
+          </wp:cNvGraphicFramePr>
+          <a:graphic>
+            <a:graphicData uri="http://schemas.openxmlformats.org/drawingml/2006/picture">
+              <pic:pic>
+                <pic:nvPicPr>
+                  <pic:cNvPr id="0" name="jet_technic_logo.png"/>
+                  <pic:cNvPicPr/>
+                </pic:nvPicPr>
+                <pic:blipFill>
+                  <a:blip r:embed="rId1"/>
+                  <a:stretch>
+                    <a:fillRect/>
+                  </a:stretch>
+                </pic:blipFill>
+                <pic:spPr>
+                  <a:xfrm>
+                    <a:off x="0" y="0"/>
+                    <a:ext cx="3780000" cy="644882"/>
+                  </a:xfrm>
+                  <a:prstGeom prst="rect"/>
+                </pic:spPr>
+              </pic:pic>
+            </a:graphicData>
+          </a:graphic>
+        </wp:inline>
+      </w:drawing>
+    </w:r>
+  </w:p>
+</w:hdr>
 </file>
 
 <file path=word/numbering.xml><?xml version="1.0" encoding="utf-8"?>

</xml_diff>

<commit_message>
Highlight fill-in and choice fields in yellow in agreements
Mark contract placeholders, Customer details, payment options (A/B/C),
and signature blanks with yellow background in EN/RU DOCX and DOC.

Co-authored-by: alexanderp-cell <alexanderp-cell@users.noreply.github.com>
</commit_message>
<xml_diff>
--- a/agreements/Dogovor_JT-BSI-2026_RU.docx
+++ b/agreements/Dogovor_JT-BSI-2026_RU.docx
@@ -13,7 +13,24 @@
           <w:b/>
           <w:sz w:val="24"/>
         </w:rPr>
-        <w:t>ДОГОВОР ВОЗМЕЗДНОГО ОКАЗАНИЯ УСЛУГ № ____ / JT-BSI-2026</w:t>
+        <w:t xml:space="preserve">ДОГОВОР ВОЗМЕЗДНОГО ОКАЗАНИЯ УСЛУГ № </w:t>
+      </w:r>
+      <w:r>
+        <w:rPr>
+          <w:rFonts w:ascii="Times New Roman" w:hAnsi="Times New Roman" w:eastAsia="Times New Roman"/>
+          <w:b/>
+          <w:sz w:val="24"/>
+          <w:highlight w:val="yellow"/>
+        </w:rPr>
+        <w:t>____</w:t>
+      </w:r>
+      <w:r>
+        <w:rPr>
+          <w:rFonts w:ascii="Times New Roman" w:hAnsi="Times New Roman" w:eastAsia="Times New Roman"/>
+          <w:b/>
+          <w:sz w:val="24"/>
+        </w:rPr>
+        <w:t xml:space="preserve"> / JT-BSI-2026</w:t>
       </w:r>
     </w:p>
     <w:p>
@@ -55,7 +72,58 @@
           <w:b w:val="0"/>
           <w:sz w:val="19"/>
         </w:rPr>
-        <w:t>Место заключения: ________________    Дата: «____» ____________ 2026 г.</w:t>
+        <w:t xml:space="preserve">Место заключения: </w:t>
+      </w:r>
+      <w:r>
+        <w:rPr>
+          <w:rFonts w:ascii="Times New Roman" w:hAnsi="Times New Roman" w:eastAsia="Times New Roman"/>
+          <w:b w:val="0"/>
+          <w:sz w:val="19"/>
+          <w:highlight w:val="yellow"/>
+        </w:rPr>
+        <w:t>________________</w:t>
+      </w:r>
+      <w:r>
+        <w:rPr>
+          <w:rFonts w:ascii="Times New Roman" w:hAnsi="Times New Roman" w:eastAsia="Times New Roman"/>
+          <w:b w:val="0"/>
+          <w:sz w:val="19"/>
+        </w:rPr>
+        <w:t xml:space="preserve">    Дата: </w:t>
+      </w:r>
+      <w:r>
+        <w:rPr>
+          <w:rFonts w:ascii="Times New Roman" w:hAnsi="Times New Roman" w:eastAsia="Times New Roman"/>
+          <w:b w:val="0"/>
+          <w:sz w:val="19"/>
+          <w:highlight w:val="yellow"/>
+        </w:rPr>
+        <w:t>«____»</w:t>
+      </w:r>
+      <w:r>
+        <w:rPr>
+          <w:rFonts w:ascii="Times New Roman" w:hAnsi="Times New Roman" w:eastAsia="Times New Roman"/>
+          <w:b w:val="0"/>
+          <w:sz w:val="19"/>
+        </w:rPr>
+        <w:t xml:space="preserve"> </w:t>
+      </w:r>
+      <w:r>
+        <w:rPr>
+          <w:rFonts w:ascii="Times New Roman" w:hAnsi="Times New Roman" w:eastAsia="Times New Roman"/>
+          <w:b w:val="0"/>
+          <w:sz w:val="19"/>
+          <w:highlight w:val="yellow"/>
+        </w:rPr>
+        <w:t>____________</w:t>
+      </w:r>
+      <w:r>
+        <w:rPr>
+          <w:rFonts w:ascii="Times New Roman" w:hAnsi="Times New Roman" w:eastAsia="Times New Roman"/>
+          <w:b w:val="0"/>
+          <w:sz w:val="19"/>
+        </w:rPr>
+        <w:t xml:space="preserve"> 2026 г.</w:t>
       </w:r>
     </w:p>
     <w:p>
@@ -106,16 +174,9 @@
           <w:rFonts w:ascii="Times New Roman" w:hAnsi="Times New Roman" w:eastAsia="Times New Roman"/>
           <w:b/>
           <w:sz w:val="20"/>
+          <w:highlight w:val="yellow"/>
         </w:rPr>
         <w:t>[ПОЛНОЕ НАИМЕНОВАНИЕ ЗАКАЗЧИКА]</w:t>
-      </w:r>
-      <w:r>
-        <w:rPr>
-          <w:rFonts w:ascii="Times New Roman" w:hAnsi="Times New Roman" w:eastAsia="Times New Roman"/>
-          <w:b w:val="0"/>
-          <w:sz w:val="20"/>
-        </w:rPr>
-        <w:t xml:space="preserve"> (адрес: [●], регистрационный / налоговый номер: [●], далее — «</w:t>
       </w:r>
       <w:r>
         <w:rPr>
@@ -123,15 +184,75 @@
           <w:b/>
           <w:sz w:val="20"/>
         </w:rPr>
-        <w:t>Заказчик</w:t>
+        <w:t xml:space="preserve"> (адрес: </w:t>
       </w:r>
       <w:r>
         <w:rPr>
           <w:rFonts w:ascii="Times New Roman" w:hAnsi="Times New Roman" w:eastAsia="Times New Roman"/>
-          <w:b w:val="0"/>
+          <w:b/>
+          <w:sz w:val="20"/>
+          <w:highlight w:val="yellow"/>
+        </w:rPr>
+        <w:t>[●]</w:t>
+      </w:r>
+      <w:r>
+        <w:rPr>
+          <w:rFonts w:ascii="Times New Roman" w:hAnsi="Times New Roman" w:eastAsia="Times New Roman"/>
+          <w:b/>
           <w:sz w:val="20"/>
         </w:rPr>
-        <w:t>»), в лице [ФИО, должность], действующего на основании [Устава / доверенности], с другой стороны,</w:t>
+        <w:t xml:space="preserve">, регистрационный / налоговый номер: </w:t>
+      </w:r>
+      <w:r>
+        <w:rPr>
+          <w:rFonts w:ascii="Times New Roman" w:hAnsi="Times New Roman" w:eastAsia="Times New Roman"/>
+          <w:b/>
+          <w:sz w:val="20"/>
+          <w:highlight w:val="yellow"/>
+        </w:rPr>
+        <w:t>[●]</w:t>
+      </w:r>
+      <w:r>
+        <w:rPr>
+          <w:rFonts w:ascii="Times New Roman" w:hAnsi="Times New Roman" w:eastAsia="Times New Roman"/>
+          <w:b/>
+          <w:sz w:val="20"/>
+        </w:rPr>
+        <w:t xml:space="preserve">, далее — «Заказчик»), в лице </w:t>
+      </w:r>
+      <w:r>
+        <w:rPr>
+          <w:rFonts w:ascii="Times New Roman" w:hAnsi="Times New Roman" w:eastAsia="Times New Roman"/>
+          <w:b/>
+          <w:sz w:val="20"/>
+          <w:highlight w:val="yellow"/>
+        </w:rPr>
+        <w:t>[ФИО, должность]</w:t>
+      </w:r>
+      <w:r>
+        <w:rPr>
+          <w:rFonts w:ascii="Times New Roman" w:hAnsi="Times New Roman" w:eastAsia="Times New Roman"/>
+          <w:b/>
+          <w:sz w:val="20"/>
+        </w:rPr>
+        <w:t xml:space="preserve">, действующего на основании </w:t>
+      </w:r>
+      <w:r>
+        <w:rPr>
+          <w:rFonts w:ascii="Times New Roman" w:hAnsi="Times New Roman" w:eastAsia="Times New Roman"/>
+          <w:b/>
+          <w:sz w:val="20"/>
+          <w:highlight w:val="yellow"/>
+        </w:rPr>
+        <w:t>[Устава / доверенности]</w:t>
+      </w:r>
+      <w:r>
+        <w:rPr>
+          <w:rFonts w:ascii="Times New Roman" w:hAnsi="Times New Roman" w:eastAsia="Times New Roman"/>
+          <w:b/>
+          <w:sz w:val="20"/>
+        </w:rPr>
+        <w:t>, с другой стороны,</w:t>
       </w:r>
     </w:p>
     <w:p>
@@ -466,6 +587,7 @@
           <w:rFonts w:ascii="Times New Roman" w:hAnsi="Times New Roman" w:eastAsia="Times New Roman"/>
           <w:b w:val="0"/>
           <w:sz w:val="20"/>
+          <w:highlight w:val="yellow"/>
         </w:rPr>
         <w:t>3.2. Варианты оплаты (Стороны выбирают один вариант путём отметки / вычёркивания неприменимого):</w:t>
       </w:r>
@@ -480,6 +602,7 @@
           <w:rFonts w:ascii="Times New Roman" w:hAnsi="Times New Roman" w:eastAsia="Times New Roman"/>
           <w:b w:val="0"/>
           <w:sz w:val="20"/>
+          <w:highlight w:val="yellow"/>
         </w:rPr>
         <w:t>(A) 100% постоплата: Заказчик оплачивает 100% Цены в течение 5 (пяти) банковских дней после приёмки Услуг (или после признания Услуг принятыми по п. 2.2);</w:t>
       </w:r>
@@ -494,6 +617,7 @@
           <w:rFonts w:ascii="Times New Roman" w:hAnsi="Times New Roman" w:eastAsia="Times New Roman"/>
           <w:b w:val="0"/>
           <w:sz w:val="20"/>
+          <w:highlight w:val="yellow"/>
         </w:rPr>
         <w:t>(B) 50% / 50%: 50% Цены в течение 3 (трёх) банковских дней с даты счёта и 50% в течение 5 (пяти) банковских дней после приёмки Услуг; либо</w:t>
       </w:r>
@@ -508,6 +632,7 @@
           <w:rFonts w:ascii="Times New Roman" w:hAnsi="Times New Roman" w:eastAsia="Times New Roman"/>
           <w:b w:val="0"/>
           <w:sz w:val="20"/>
+          <w:highlight w:val="yellow"/>
         </w:rPr>
         <w:t>(C) 100% предоплата: Заказчик оплачивает 100% Цены в течение 3 (трёх) банковских дней с даты счёта / даты вступления Договора в силу.</w:t>
       </w:r>
@@ -522,6 +647,7 @@
           <w:rFonts w:ascii="Times New Roman" w:hAnsi="Times New Roman" w:eastAsia="Times New Roman"/>
           <w:b w:val="0"/>
           <w:sz w:val="20"/>
+          <w:highlight w:val="yellow"/>
         </w:rPr>
         <w:t>Если иной вариант прямо не выбран письменно, применяется вариант (A) (100% постоплата).</w:t>
       </w:r>
@@ -1009,14 +1135,18 @@
             <w:tcW w:type="dxa" w:w="5185"/>
           </w:tcPr>
           <w:p>
-            <w:r/>
             <w:r>
               <w:rPr>
-                <w:rFonts w:ascii="Times New Roman" w:hAnsi="Times New Roman" w:eastAsia="Times New Roman"/>
                 <w:b/>
-                <w:sz w:val="19"/>
               </w:rPr>
-              <w:t>ЗАКАЗЧИК: [●]</w:t>
+              <w:t xml:space="preserve">ЗАКАЗЧИК: </w:t>
+            </w:r>
+            <w:r>
+              <w:rPr>
+                <w:b/>
+                <w:highlight w:val="yellow"/>
+              </w:rPr>
+              <w:t>[●]</w:t>
             </w:r>
           </w:p>
           <w:p>
@@ -1029,7 +1159,16 @@
                 <w:b w:val="0"/>
                 <w:sz w:val="17"/>
               </w:rPr>
-              <w:t>Полное наименование: [●]</w:t>
+              <w:t xml:space="preserve">Полное наименование: </w:t>
+            </w:r>
+            <w:r>
+              <w:rPr>
+                <w:rFonts w:ascii="Times New Roman" w:hAnsi="Times New Roman" w:eastAsia="Times New Roman"/>
+                <w:b w:val="0"/>
+                <w:sz w:val="17"/>
+                <w:highlight w:val="yellow"/>
+              </w:rPr>
+              <w:t>[●]</w:t>
             </w:r>
           </w:p>
           <w:p>
@@ -1042,7 +1181,16 @@
                 <w:b w:val="0"/>
                 <w:sz w:val="17"/>
               </w:rPr>
-              <w:t>Адрес: [●]</w:t>
+              <w:t xml:space="preserve">Адрес: </w:t>
+            </w:r>
+            <w:r>
+              <w:rPr>
+                <w:rFonts w:ascii="Times New Roman" w:hAnsi="Times New Roman" w:eastAsia="Times New Roman"/>
+                <w:b w:val="0"/>
+                <w:sz w:val="17"/>
+                <w:highlight w:val="yellow"/>
+              </w:rPr>
+              <w:t>[●]</w:t>
             </w:r>
           </w:p>
           <w:p>
@@ -1055,7 +1203,16 @@
                 <w:b w:val="0"/>
                 <w:sz w:val="17"/>
               </w:rPr>
-              <w:t>Рег. / налог. номер: [●]</w:t>
+              <w:t xml:space="preserve">Рег. / налог. номер: </w:t>
+            </w:r>
+            <w:r>
+              <w:rPr>
+                <w:rFonts w:ascii="Times New Roman" w:hAnsi="Times New Roman" w:eastAsia="Times New Roman"/>
+                <w:b w:val="0"/>
+                <w:sz w:val="17"/>
+                <w:highlight w:val="yellow"/>
+              </w:rPr>
+              <w:t>[●]</w:t>
             </w:r>
           </w:p>
           <w:p>
@@ -1068,7 +1225,16 @@
                 <w:b w:val="0"/>
                 <w:sz w:val="17"/>
               </w:rPr>
-              <w:t>Банк / IBAN / SWIFT: [●]</w:t>
+              <w:t xml:space="preserve">Банк / IBAN / SWIFT: </w:t>
+            </w:r>
+            <w:r>
+              <w:rPr>
+                <w:rFonts w:ascii="Times New Roman" w:hAnsi="Times New Roman" w:eastAsia="Times New Roman"/>
+                <w:b w:val="0"/>
+                <w:sz w:val="17"/>
+                <w:highlight w:val="yellow"/>
+              </w:rPr>
+              <w:t>[●]</w:t>
             </w:r>
           </w:p>
           <w:p>
@@ -1081,7 +1247,33 @@
                 <w:b w:val="0"/>
                 <w:sz w:val="17"/>
               </w:rPr>
-              <w:t>Email: [●]   Тел.: [●]</w:t>
+              <w:t xml:space="preserve">Email: </w:t>
+            </w:r>
+            <w:r>
+              <w:rPr>
+                <w:rFonts w:ascii="Times New Roman" w:hAnsi="Times New Roman" w:eastAsia="Times New Roman"/>
+                <w:b w:val="0"/>
+                <w:sz w:val="17"/>
+                <w:highlight w:val="yellow"/>
+              </w:rPr>
+              <w:t>[●]</w:t>
+            </w:r>
+            <w:r>
+              <w:rPr>
+                <w:rFonts w:ascii="Times New Roman" w:hAnsi="Times New Roman" w:eastAsia="Times New Roman"/>
+                <w:b w:val="0"/>
+                <w:sz w:val="17"/>
+              </w:rPr>
+              <w:t xml:space="preserve">   Тел.: </w:t>
+            </w:r>
+            <w:r>
+              <w:rPr>
+                <w:rFonts w:ascii="Times New Roman" w:hAnsi="Times New Roman" w:eastAsia="Times New Roman"/>
+                <w:b w:val="0"/>
+                <w:sz w:val="17"/>
+                <w:highlight w:val="yellow"/>
+              </w:rPr>
+              <w:t>[●]</w:t>
             </w:r>
           </w:p>
           <w:p>
@@ -1175,8 +1367,17 @@
                 <w:rFonts w:ascii="Times New Roman" w:hAnsi="Times New Roman" w:eastAsia="Times New Roman"/>
                 <w:b w:val="0"/>
                 <w:sz w:val="17"/>
+                <w:highlight w:val="yellow"/>
               </w:rPr>
-              <w:t>________________ / Serdar Guler /</w:t>
+              <w:t>________________</w:t>
+            </w:r>
+            <w:r>
+              <w:rPr>
+                <w:rFonts w:ascii="Times New Roman" w:hAnsi="Times New Roman" w:eastAsia="Times New Roman"/>
+                <w:b w:val="0"/>
+                <w:sz w:val="17"/>
+              </w:rPr>
+              <w:t xml:space="preserve"> / Serdar Guler /</w:t>
             </w:r>
           </w:p>
           <w:p>
@@ -1234,8 +1435,34 @@
                 <w:rFonts w:ascii="Times New Roman" w:hAnsi="Times New Roman" w:eastAsia="Times New Roman"/>
                 <w:b w:val="0"/>
                 <w:sz w:val="17"/>
+                <w:highlight w:val="yellow"/>
               </w:rPr>
-              <w:t>________________ / [ФИО] /</w:t>
+              <w:t>________________</w:t>
+            </w:r>
+            <w:r>
+              <w:rPr>
+                <w:rFonts w:ascii="Times New Roman" w:hAnsi="Times New Roman" w:eastAsia="Times New Roman"/>
+                <w:b w:val="0"/>
+                <w:sz w:val="17"/>
+              </w:rPr>
+              <w:t xml:space="preserve"> / </w:t>
+            </w:r>
+            <w:r>
+              <w:rPr>
+                <w:rFonts w:ascii="Times New Roman" w:hAnsi="Times New Roman" w:eastAsia="Times New Roman"/>
+                <w:b w:val="0"/>
+                <w:sz w:val="17"/>
+                <w:highlight w:val="yellow"/>
+              </w:rPr>
+              <w:t>[ФИО]</w:t>
+            </w:r>
+            <w:r>
+              <w:rPr>
+                <w:rFonts w:ascii="Times New Roman" w:hAnsi="Times New Roman" w:eastAsia="Times New Roman"/>
+                <w:b w:val="0"/>
+                <w:sz w:val="17"/>
+              </w:rPr>
+              <w:t xml:space="preserve"> /</w:t>
             </w:r>
           </w:p>
           <w:p>
@@ -1248,7 +1475,16 @@
                 <w:b w:val="0"/>
                 <w:sz w:val="17"/>
               </w:rPr>
-              <w:t>Должность: [●]</w:t>
+              <w:t xml:space="preserve">Должность: </w:t>
+            </w:r>
+            <w:r>
+              <w:rPr>
+                <w:rFonts w:ascii="Times New Roman" w:hAnsi="Times New Roman" w:eastAsia="Times New Roman"/>
+                <w:b w:val="0"/>
+                <w:sz w:val="17"/>
+                <w:highlight w:val="yellow"/>
+              </w:rPr>
+              <w:t>[●]</w:t>
             </w:r>
           </w:p>
           <w:p>
@@ -1297,7 +1533,24 @@
           <w:b/>
           <w:sz w:val="20"/>
         </w:rPr>
-        <w:t>к Договору возмездного оказания услуг № ____ / JT-BSI-2026</w:t>
+        <w:t xml:space="preserve">к Договору возмездного оказания услуг № </w:t>
+      </w:r>
+      <w:r>
+        <w:rPr>
+          <w:rFonts w:ascii="Times New Roman" w:hAnsi="Times New Roman" w:eastAsia="Times New Roman"/>
+          <w:b/>
+          <w:sz w:val="20"/>
+          <w:highlight w:val="yellow"/>
+        </w:rPr>
+        <w:t>____</w:t>
+      </w:r>
+      <w:r>
+        <w:rPr>
+          <w:rFonts w:ascii="Times New Roman" w:hAnsi="Times New Roman" w:eastAsia="Times New Roman"/>
+          <w:b/>
+          <w:sz w:val="20"/>
+        </w:rPr>
+        <w:t xml:space="preserve"> / JT-BSI-2026</w:t>
       </w:r>
     </w:p>
     <w:p>
@@ -1619,7 +1872,24 @@
           <w:b w:val="0"/>
           <w:sz w:val="20"/>
         </w:rPr>
-        <w:t>ИСПОЛНИТЕЛЬ: ________________ / Serdar Guler /</w:t>
+        <w:t xml:space="preserve">ИСПОЛНИТЕЛЬ: </w:t>
+      </w:r>
+      <w:r>
+        <w:rPr>
+          <w:rFonts w:ascii="Times New Roman" w:hAnsi="Times New Roman" w:eastAsia="Times New Roman"/>
+          <w:b w:val="0"/>
+          <w:sz w:val="20"/>
+          <w:highlight w:val="yellow"/>
+        </w:rPr>
+        <w:t>________________</w:t>
+      </w:r>
+      <w:r>
+        <w:rPr>
+          <w:rFonts w:ascii="Times New Roman" w:hAnsi="Times New Roman" w:eastAsia="Times New Roman"/>
+          <w:b w:val="0"/>
+          <w:sz w:val="20"/>
+        </w:rPr>
+        <w:t xml:space="preserve"> / Serdar Guler /</w:t>
       </w:r>
     </w:p>
     <w:p>
@@ -1633,7 +1903,41 @@
           <w:b w:val="0"/>
           <w:sz w:val="20"/>
         </w:rPr>
-        <w:t>ЗАКАЗЧИК:    ________________ / [ФИО] /</w:t>
+        <w:t xml:space="preserve">ЗАКАЗЧИК:    </w:t>
+      </w:r>
+      <w:r>
+        <w:rPr>
+          <w:rFonts w:ascii="Times New Roman" w:hAnsi="Times New Roman" w:eastAsia="Times New Roman"/>
+          <w:b w:val="0"/>
+          <w:sz w:val="20"/>
+          <w:highlight w:val="yellow"/>
+        </w:rPr>
+        <w:t>________________</w:t>
+      </w:r>
+      <w:r>
+        <w:rPr>
+          <w:rFonts w:ascii="Times New Roman" w:hAnsi="Times New Roman" w:eastAsia="Times New Roman"/>
+          <w:b w:val="0"/>
+          <w:sz w:val="20"/>
+        </w:rPr>
+        <w:t xml:space="preserve"> / </w:t>
+      </w:r>
+      <w:r>
+        <w:rPr>
+          <w:rFonts w:ascii="Times New Roman" w:hAnsi="Times New Roman" w:eastAsia="Times New Roman"/>
+          <w:b w:val="0"/>
+          <w:sz w:val="20"/>
+          <w:highlight w:val="yellow"/>
+        </w:rPr>
+        <w:t>[ФИО]</w:t>
+      </w:r>
+      <w:r>
+        <w:rPr>
+          <w:rFonts w:ascii="Times New Roman" w:hAnsi="Times New Roman" w:eastAsia="Times New Roman"/>
+          <w:b w:val="0"/>
+          <w:sz w:val="20"/>
+        </w:rPr>
+        <w:t xml:space="preserve"> /</w:t>
       </w:r>
     </w:p>
     <w:p>

</xml_diff>

<commit_message>
Remove appendix and shorten inspection service agreements
Drop Appendix No. 1 from the VQ-BOO inspection contract; keep scope
and price in the main body with tighter wording, yellow highlights,
and regenerated DOC/DOCX files (~2 pages).

Co-authored-by: alexanderp-cell <alexanderp-cell@users.noreply.github.com>
</commit_message>
<xml_diff>
--- a/agreements/Dogovor_JT-BSI-2026_RU.docx
+++ b/agreements/Dogovor_JT-BSI-2026_RU.docx
@@ -44,7 +44,7 @@
           <w:b/>
           <w:sz w:val="21"/>
         </w:rPr>
-        <w:t>на инспекцию воздушного судна и бороскопическую инспекцию двигателей и ВСУ</w:t>
+        <w:t>инспекция ВС и бороскопическая инспекция двигателей и ВСУ</w:t>
       </w:r>
     </w:p>
     <w:p>
@@ -58,7 +58,7 @@
           <w:b/>
           <w:sz w:val="20"/>
         </w:rPr>
-        <w:t>Воздушное судно: Boeing 737-500, регистрационный знак VQ-BOO</w:t>
+        <w:t>Boeing 737-500, регистрационный знак VQ-BOO</w:t>
       </w:r>
     </w:p>
     <w:p>
@@ -128,7 +128,7 @@
     </w:p>
     <w:p>
       <w:pPr>
-        <w:spacing w:after="80" w:before="0" w:line="252" w:lineRule="auto"/>
+        <w:spacing w:after="60" w:line="252" w:lineRule="auto"/>
         <w:jc w:val="both"/>
       </w:pPr>
       <w:r>
@@ -145,7 +145,7 @@
           <w:b w:val="0"/>
           <w:sz w:val="20"/>
         </w:rPr>
-        <w:t xml:space="preserve"> (юридический адрес: Egitim Mahallesi, Fahrettin Kerim Gokay Caddesi, Ortaklar Is Merkezi, No: 71/57, Kadikoy, Istanbul, Turkey; Company No. 389609-5; Tax No. 484 212 4015; тел. +90 533 736 84 00; email: sales@jetechnic.com; далее — «</w:t>
+        <w:t xml:space="preserve"> (Egitim Mahallesi, Fahrettin Kerim Gokay Caddesi, Ortaklar Is Merkezi, No: 71/57, Kadikoy, Istanbul, Turkey; Company No. 389609-5; Tax No. 484 212 4015; тел. +90 533 736 84 00; sales@jetechnic.com; «</w:t>
       </w:r>
       <w:r>
         <w:rPr>
@@ -161,12 +161,12 @@
           <w:b w:val="0"/>
           <w:sz w:val="20"/>
         </w:rPr>
-        <w:t>»), в лице Генерального директора Serdar Guler, действующего на основании устава / полномочий Генерального директора, с одной стороны, и</w:t>
+        <w:t>»), в лице Генерального директора Serdar Guler, с одной стороны, и</w:t>
       </w:r>
     </w:p>
     <w:p>
       <w:pPr>
-        <w:spacing w:after="60" w:before="0" w:line="252" w:lineRule="auto"/>
+        <w:spacing w:after="60" w:line="252" w:lineRule="auto"/>
         <w:jc w:val="both"/>
       </w:pPr>
       <w:r>
@@ -181,15 +181,15 @@
       <w:r>
         <w:rPr>
           <w:rFonts w:ascii="Times New Roman" w:hAnsi="Times New Roman" w:eastAsia="Times New Roman"/>
-          <w:b/>
+          <w:b w:val="0"/>
           <w:sz w:val="20"/>
         </w:rPr>
-        <w:t xml:space="preserve"> (адрес: </w:t>
+        <w:t xml:space="preserve"> (</w:t>
       </w:r>
       <w:r>
         <w:rPr>
           <w:rFonts w:ascii="Times New Roman" w:hAnsi="Times New Roman" w:eastAsia="Times New Roman"/>
-          <w:b/>
+          <w:b w:val="0"/>
           <w:sz w:val="20"/>
           <w:highlight w:val="yellow"/>
         </w:rPr>
@@ -198,15 +198,15 @@
       <w:r>
         <w:rPr>
           <w:rFonts w:ascii="Times New Roman" w:hAnsi="Times New Roman" w:eastAsia="Times New Roman"/>
-          <w:b/>
+          <w:b w:val="0"/>
           <w:sz w:val="20"/>
         </w:rPr>
-        <w:t xml:space="preserve">, регистрационный / налоговый номер: </w:t>
+        <w:t xml:space="preserve">; рег. / налог. номер: </w:t>
       </w:r>
       <w:r>
         <w:rPr>
           <w:rFonts w:ascii="Times New Roman" w:hAnsi="Times New Roman" w:eastAsia="Times New Roman"/>
-          <w:b/>
+          <w:b w:val="0"/>
           <w:sz w:val="20"/>
           <w:highlight w:val="yellow"/>
         </w:rPr>
@@ -215,15 +215,31 @@
       <w:r>
         <w:rPr>
           <w:rFonts w:ascii="Times New Roman" w:hAnsi="Times New Roman" w:eastAsia="Times New Roman"/>
-          <w:b/>
+          <w:b w:val="0"/>
           <w:sz w:val="20"/>
         </w:rPr>
-        <w:t xml:space="preserve">, далее — «Заказчик»), в лице </w:t>
+        <w:t>; «</w:t>
       </w:r>
       <w:r>
         <w:rPr>
           <w:rFonts w:ascii="Times New Roman" w:hAnsi="Times New Roman" w:eastAsia="Times New Roman"/>
           <w:b/>
+          <w:sz w:val="20"/>
+        </w:rPr>
+        <w:t>Заказчик</w:t>
+      </w:r>
+      <w:r>
+        <w:rPr>
+          <w:rFonts w:ascii="Times New Roman" w:hAnsi="Times New Roman" w:eastAsia="Times New Roman"/>
+          <w:b w:val="0"/>
+          <w:sz w:val="20"/>
+        </w:rPr>
+        <w:t xml:space="preserve">»), в лице </w:t>
+      </w:r>
+      <w:r>
+        <w:rPr>
+          <w:rFonts w:ascii="Times New Roman" w:hAnsi="Times New Roman" w:eastAsia="Times New Roman"/>
+          <w:b w:val="0"/>
           <w:sz w:val="20"/>
           <w:highlight w:val="yellow"/>
         </w:rPr>
@@ -232,15 +248,15 @@
       <w:r>
         <w:rPr>
           <w:rFonts w:ascii="Times New Roman" w:hAnsi="Times New Roman" w:eastAsia="Times New Roman"/>
-          <w:b/>
+          <w:b w:val="0"/>
           <w:sz w:val="20"/>
         </w:rPr>
-        <w:t xml:space="preserve">, действующего на основании </w:t>
+        <w:t xml:space="preserve"> на основании </w:t>
       </w:r>
       <w:r>
         <w:rPr>
           <w:rFonts w:ascii="Times New Roman" w:hAnsi="Times New Roman" w:eastAsia="Times New Roman"/>
-          <w:b/>
+          <w:b w:val="0"/>
           <w:sz w:val="20"/>
           <w:highlight w:val="yellow"/>
         </w:rPr>
@@ -249,7 +265,7 @@
       <w:r>
         <w:rPr>
           <w:rFonts w:ascii="Times New Roman" w:hAnsi="Times New Roman" w:eastAsia="Times New Roman"/>
-          <w:b/>
+          <w:b w:val="0"/>
           <w:sz w:val="20"/>
         </w:rPr>
         <w:t>, с другой стороны,</w:t>
@@ -266,12 +282,12 @@
           <w:b w:val="0"/>
           <w:sz w:val="20"/>
         </w:rPr>
-        <w:t>совместно именуемые «Стороны», заключили настоящий Договор возмездного оказания услуг (далее — «Договор») о нижеследующем:</w:t>
+        <w:t>договорились о нижеследующем:</w:t>
       </w:r>
     </w:p>
     <w:p>
       <w:pPr>
-        <w:spacing w:before="20" w:after="40" w:line="252" w:lineRule="auto"/>
+        <w:spacing w:before="0" w:after="40" w:line="252" w:lineRule="auto"/>
         <w:jc w:val="left"/>
       </w:pPr>
       <w:r>
@@ -280,12 +296,12 @@
           <w:b/>
           <w:sz w:val="21"/>
         </w:rPr>
-        <w:t>1. ПРЕДМЕТ ДОГОВОРА</w:t>
+        <w:t>1. ПРЕДМЕТ</w:t>
       </w:r>
     </w:p>
     <w:p>
       <w:pPr>
-        <w:spacing w:before="0" w:after="60" w:line="252" w:lineRule="auto"/>
+        <w:spacing w:before="0" w:after="40" w:line="252" w:lineRule="auto"/>
         <w:jc w:val="both"/>
       </w:pPr>
       <w:r>
@@ -294,12 +310,12 @@
           <w:b w:val="0"/>
           <w:sz w:val="20"/>
         </w:rPr>
-        <w:t>1.1. Исполнитель обязуется оказать, а Заказчик обязуется принять и оплатить услуги в отношении Boeing 737-500, регистрационный знак VQ-BOO (далее — «ВС»), перечень которых приведён в Приложении № 1 к настоящему Договору (далее — «Услуги»).</w:t>
+        <w:t>1.1. Исполнитель оказывает, а Заказчик принимает и оплачивает следующие услуги в отношении Boeing 737-500 VQ-BOO (далее — «ВС»):</w:t>
       </w:r>
     </w:p>
     <w:p>
       <w:pPr>
-        <w:spacing w:before="0" w:after="60" w:line="252" w:lineRule="auto"/>
+        <w:spacing w:before="0" w:after="40" w:line="252" w:lineRule="auto"/>
         <w:jc w:val="both"/>
       </w:pPr>
       <w:r>
@@ -308,12 +324,12 @@
           <w:b w:val="0"/>
           <w:sz w:val="20"/>
         </w:rPr>
-        <w:t>1.2. В объём Услуг входит:</w:t>
+        <w:t>(a) BSI двух (2) двигателей CFM56-3 (объём уточняется); (b) BSI ВСУ APS2000; (c) GVI ВС (шасси, кабина, отсек авионики); (d) проверка документации (двигатели, ВСУ); (e) транспорт и проживание Исполнителя в объёме, включённом в Цену.</w:t>
       </w:r>
     </w:p>
     <w:p>
       <w:pPr>
-        <w:spacing w:before="0" w:after="60" w:line="252" w:lineRule="auto"/>
+        <w:spacing w:before="0" w:after="40" w:line="252" w:lineRule="auto"/>
         <w:jc w:val="both"/>
       </w:pPr>
       <w:r>
@@ -322,12 +338,12 @@
           <w:b w:val="0"/>
           <w:sz w:val="20"/>
         </w:rPr>
-        <w:t>(a) бороскопическая инспекция (BSI) двух (2) двигателей CFM56-3 (объём работ уточняется);</w:t>
+        <w:t>1.2. Место оказания: JAT Tehnika, Белград, Сербия. Заказчик обеспечивает доступ в аэропорт и к ВС.</w:t>
       </w:r>
     </w:p>
     <w:p>
       <w:pPr>
-        <w:spacing w:before="0" w:after="60" w:line="252" w:lineRule="auto"/>
+        <w:spacing w:before="0" w:after="40" w:line="252" w:lineRule="auto"/>
         <w:jc w:val="both"/>
       </w:pPr>
       <w:r>
@@ -336,12 +352,26 @@
           <w:b w:val="0"/>
           <w:sz w:val="20"/>
         </w:rPr>
-        <w:t>(b) бороскопическая инспекция (BSI) ВСУ APS2000;</w:t>
+        <w:t>1.3. Результат: отчёт(ы) об инспекции / BSI и видеоматериалы BSI. BSI выполняет сертифицированный инженер.</w:t>
       </w:r>
     </w:p>
     <w:p>
       <w:pPr>
-        <w:spacing w:before="0" w:after="60" w:line="252" w:lineRule="auto"/>
+        <w:spacing w:before="40" w:after="40" w:line="252" w:lineRule="auto"/>
+        <w:jc w:val="left"/>
+      </w:pPr>
+      <w:r>
+        <w:rPr>
+          <w:rFonts w:ascii="Times New Roman" w:hAnsi="Times New Roman" w:eastAsia="Times New Roman"/>
+          <w:b/>
+          <w:sz w:val="21"/>
+        </w:rPr>
+        <w:t>2. СРОК</w:t>
+      </w:r>
+    </w:p>
+    <w:p>
+      <w:pPr>
+        <w:spacing w:before="0" w:after="40" w:line="252" w:lineRule="auto"/>
         <w:jc w:val="both"/>
       </w:pPr>
       <w:r>
@@ -350,12 +380,12 @@
           <w:b w:val="0"/>
           <w:sz w:val="20"/>
         </w:rPr>
-        <w:t>(c) общая визуальная инспекция (GVI) ВС, включая шасси, пассажирскую кабину и отсек авионики;</w:t>
+        <w:t>2.1. Ориентировочно 3 (три) дня с даты вступления Договора в силу и предоставления Заказчиком доступа и необходимой документации.</w:t>
       </w:r>
     </w:p>
     <w:p>
       <w:pPr>
-        <w:spacing w:before="0" w:after="60" w:line="252" w:lineRule="auto"/>
+        <w:spacing w:before="0" w:after="40" w:line="252" w:lineRule="auto"/>
         <w:jc w:val="both"/>
       </w:pPr>
       <w:r>
@@ -364,12 +394,26 @@
           <w:b w:val="0"/>
           <w:sz w:val="20"/>
         </w:rPr>
-        <w:t>(d) проверка документации по двигателям и ВСУ; и</w:t>
+        <w:t>2.2. Заказчик принимает отчёт(ы) в течение 5 (пяти) рабочих дней либо направляет мотивированные возражения; иначе Услуги считаются принятыми.</w:t>
       </w:r>
     </w:p>
     <w:p>
       <w:pPr>
-        <w:spacing w:before="0" w:after="60" w:line="252" w:lineRule="auto"/>
+        <w:spacing w:before="40" w:after="40" w:line="252" w:lineRule="auto"/>
+        <w:jc w:val="left"/>
+      </w:pPr>
+      <w:r>
+        <w:rPr>
+          <w:rFonts w:ascii="Times New Roman" w:hAnsi="Times New Roman" w:eastAsia="Times New Roman"/>
+          <w:b/>
+          <w:sz w:val="21"/>
+        </w:rPr>
+        <w:t>3. ЦЕНА И ОПЛАТА</w:t>
+      </w:r>
+    </w:p>
+    <w:p>
+      <w:pPr>
+        <w:spacing w:before="0" w:after="40" w:line="252" w:lineRule="auto"/>
         <w:jc w:val="both"/>
       </w:pPr>
       <w:r>
@@ -378,119 +422,7 @@
           <w:b w:val="0"/>
           <w:sz w:val="20"/>
         </w:rPr>
-        <w:t>(e) транспортные расходы и проживание персонала Исполнителя в объёме, включённом в Цену согласно Приложению № 1.</w:t>
-      </w:r>
-    </w:p>
-    <w:p>
-      <w:pPr>
-        <w:spacing w:before="0" w:after="60" w:line="252" w:lineRule="auto"/>
-        <w:jc w:val="both"/>
-      </w:pPr>
-      <w:r>
-        <w:rPr>
-          <w:rFonts w:ascii="Times New Roman" w:hAnsi="Times New Roman" w:eastAsia="Times New Roman"/>
-          <w:b w:val="0"/>
-          <w:sz w:val="20"/>
-        </w:rPr>
-        <w:t>1.3. Приложение № 1 (Перечень услуг и цены) является неотъемлемой частью Договора. При противоречии между текстом Договора и Приложением № 1 в части перечня Услуг или Цены приоритет имеет Приложение № 1.</w:t>
-      </w:r>
-    </w:p>
-    <w:p>
-      <w:pPr>
-        <w:spacing w:before="0" w:after="60" w:line="252" w:lineRule="auto"/>
-        <w:jc w:val="both"/>
-      </w:pPr>
-      <w:r>
-        <w:rPr>
-          <w:rFonts w:ascii="Times New Roman" w:hAnsi="Times New Roman" w:eastAsia="Times New Roman"/>
-          <w:b w:val="0"/>
-          <w:sz w:val="20"/>
-        </w:rPr>
-        <w:t>1.4. Место оказания Услуг: JAT Tehnika, Белград, Республика Сербия. Доступ в зону аэропорта и к ВС обеспечивает Заказчик.</w:t>
-      </w:r>
-    </w:p>
-    <w:p>
-      <w:pPr>
-        <w:spacing w:before="0" w:after="60" w:line="252" w:lineRule="auto"/>
-        <w:jc w:val="both"/>
-      </w:pPr>
-      <w:r>
-        <w:rPr>
-          <w:rFonts w:ascii="Times New Roman" w:hAnsi="Times New Roman" w:eastAsia="Times New Roman"/>
-          <w:b w:val="0"/>
-          <w:sz w:val="20"/>
-        </w:rPr>
-        <w:t>1.5. BSI выполняется сертифицированным инженером. Результат: отчёт(ы) об инспекции / BSI и видеоматериалы по BSI.</w:t>
-      </w:r>
-    </w:p>
-    <w:p>
-      <w:pPr>
-        <w:spacing w:before="60" w:after="40" w:line="252" w:lineRule="auto"/>
-        <w:jc w:val="left"/>
-      </w:pPr>
-      <w:r>
-        <w:rPr>
-          <w:rFonts w:ascii="Times New Roman" w:hAnsi="Times New Roman" w:eastAsia="Times New Roman"/>
-          <w:b/>
-          <w:sz w:val="21"/>
-        </w:rPr>
-        <w:t>2. СРОКИ ОКАЗАНИЯ УСЛУГ</w:t>
-      </w:r>
-    </w:p>
-    <w:p>
-      <w:pPr>
-        <w:spacing w:before="0" w:after="60" w:line="252" w:lineRule="auto"/>
-        <w:jc w:val="both"/>
-      </w:pPr>
-      <w:r>
-        <w:rPr>
-          <w:rFonts w:ascii="Times New Roman" w:hAnsi="Times New Roman" w:eastAsia="Times New Roman"/>
-          <w:b w:val="0"/>
-          <w:sz w:val="20"/>
-        </w:rPr>
-        <w:t>2.1. Ориентировочный срок оказания Услуг — 3 (три) дня, начиная с более поздней из дат: (i) вступления Договора в силу; (ii) предоставления Заказчиком доступа к аэропорту / ВС и документации, разумно необходимой для оказания Услуг.</w:t>
-      </w:r>
-    </w:p>
-    <w:p>
-      <w:pPr>
-        <w:spacing w:before="0" w:after="60" w:line="252" w:lineRule="auto"/>
-        <w:jc w:val="both"/>
-      </w:pPr>
-      <w:r>
-        <w:rPr>
-          <w:rFonts w:ascii="Times New Roman" w:hAnsi="Times New Roman" w:eastAsia="Times New Roman"/>
-          <w:b w:val="0"/>
-          <w:sz w:val="20"/>
-        </w:rPr>
-        <w:t>2.2. Заказчик в течение 5 (пяти) рабочих дней с даты получения отчёта(ов) подтверждает приёмку либо направляет мотивированные письменные возражения; в противном случае Услуги считаются принятыми.</w:t>
-      </w:r>
-    </w:p>
-    <w:p>
-      <w:pPr>
-        <w:spacing w:before="60" w:after="40" w:line="252" w:lineRule="auto"/>
-        <w:jc w:val="left"/>
-      </w:pPr>
-      <w:r>
-        <w:rPr>
-          <w:rFonts w:ascii="Times New Roman" w:hAnsi="Times New Roman" w:eastAsia="Times New Roman"/>
-          <w:b/>
-          <w:sz w:val="21"/>
-        </w:rPr>
-        <w:t>3. ЦЕНА И ПОРЯДОК РАСЧЁТОВ</w:t>
-      </w:r>
-    </w:p>
-    <w:p>
-      <w:pPr>
-        <w:spacing w:before="0" w:after="60" w:line="252" w:lineRule="auto"/>
-        <w:jc w:val="both"/>
-      </w:pPr>
-      <w:r>
-        <w:rPr>
-          <w:rFonts w:ascii="Times New Roman" w:hAnsi="Times New Roman" w:eastAsia="Times New Roman"/>
-          <w:b w:val="0"/>
-          <w:sz w:val="20"/>
-        </w:rPr>
-        <w:t>3.1. Общая цена Услуг составляет USD 24 000,00 (двадцать четыре тысячи долларов США) (далее — «Цена») без учёта применимых налогов и сборов, а именно:</w:t>
+        <w:t>3.1. Общая Цена: USD 24 000,00 (двадцать четыре тысячи долларов США) без учёта налогов и сборов:</w:t>
       </w:r>
     </w:p>
     <w:p>
@@ -504,7 +436,7 @@
           <w:b w:val="0"/>
           <w:sz w:val="20"/>
         </w:rPr>
-        <w:t>• BSI CFM56-3 — 2 двигателя (объём работ уточняется) — USD 9 500,00</w:t>
+        <w:t>• BSI CFM56-3 — 2 двигателя (объём уточняется) — USD 9 500,00</w:t>
       </w:r>
     </w:p>
     <w:p>
@@ -532,7 +464,7 @@
           <w:b w:val="0"/>
           <w:sz w:val="20"/>
         </w:rPr>
-        <w:t>• GVI воздушного судна (включая шасси, пассажирскую кабину, отсек авионики) — USD 3 000,00</w:t>
+        <w:t>• GVI ВС (шасси, кабина, авионика) — USD 3 000,00</w:t>
       </w:r>
     </w:p>
     <w:p>
@@ -560,12 +492,12 @@
           <w:b w:val="0"/>
           <w:sz w:val="20"/>
         </w:rPr>
-        <w:t>• Транспортные расходы и проживание — USD 4 000,00</w:t>
+        <w:t>• Транспорт и проживание — USD 4 000,00</w:t>
       </w:r>
     </w:p>
     <w:p>
       <w:pPr>
-        <w:spacing w:before="40" w:after="60" w:line="252" w:lineRule="auto"/>
+        <w:spacing w:before="0" w:after="60" w:line="252" w:lineRule="auto"/>
         <w:jc w:val="left"/>
       </w:pPr>
       <w:r>
@@ -579,7 +511,21 @@
     </w:p>
     <w:p>
       <w:pPr>
-        <w:spacing w:before="0" w:after="60" w:line="252" w:lineRule="auto"/>
+        <w:spacing w:before="0" w:after="40" w:line="252" w:lineRule="auto"/>
+        <w:jc w:val="both"/>
+      </w:pPr>
+      <w:r>
+        <w:rPr>
+          <w:rFonts w:ascii="Times New Roman" w:hAnsi="Times New Roman" w:eastAsia="Times New Roman"/>
+          <w:b w:val="0"/>
+          <w:sz w:val="20"/>
+        </w:rPr>
+        <w:t>3.2. Вариант оплаты (выбрать один; остальные вычеркнуть):</w:t>
+      </w:r>
+    </w:p>
+    <w:p>
+      <w:pPr>
+        <w:spacing w:before="0" w:after="20" w:line="252" w:lineRule="auto"/>
         <w:jc w:val="both"/>
       </w:pPr>
       <w:r>
@@ -589,12 +535,12 @@
           <w:sz w:val="20"/>
           <w:highlight w:val="yellow"/>
         </w:rPr>
-        <w:t>3.2. Варианты оплаты (Стороны выбирают один вариант путём отметки / вычёркивания неприменимого):</w:t>
+        <w:t>(A) 100% постоплата в течение 5 банковских дней после приёмки;</w:t>
       </w:r>
     </w:p>
     <w:p>
       <w:pPr>
-        <w:spacing w:before="0" w:after="60" w:line="252" w:lineRule="auto"/>
+        <w:spacing w:before="0" w:after="20" w:line="252" w:lineRule="auto"/>
         <w:jc w:val="both"/>
       </w:pPr>
       <w:r>
@@ -604,12 +550,12 @@
           <w:sz w:val="20"/>
           <w:highlight w:val="yellow"/>
         </w:rPr>
-        <w:t>(A) 100% постоплата: Заказчик оплачивает 100% Цены в течение 5 (пяти) банковских дней после приёмки Услуг (или после признания Услуг принятыми по п. 2.2);</w:t>
+        <w:t>(B) 50% по счёту и 50% в течение 5 банковских дней после приёмки; либо</w:t>
       </w:r>
     </w:p>
     <w:p>
       <w:pPr>
-        <w:spacing w:before="0" w:after="60" w:line="252" w:lineRule="auto"/>
+        <w:spacing w:before="0" w:after="20" w:line="252" w:lineRule="auto"/>
         <w:jc w:val="both"/>
       </w:pPr>
       <w:r>
@@ -619,12 +565,12 @@
           <w:sz w:val="20"/>
           <w:highlight w:val="yellow"/>
         </w:rPr>
-        <w:t>(B) 50% / 50%: 50% Цены в течение 3 (трёх) банковских дней с даты счёта и 50% в течение 5 (пяти) банковских дней после приёмки Услуг; либо</w:t>
+        <w:t>(C) 100% предоплата в течение 3 банковских дней с даты счёта.</w:t>
       </w:r>
     </w:p>
     <w:p>
       <w:pPr>
-        <w:spacing w:before="0" w:after="60" w:line="252" w:lineRule="auto"/>
+        <w:spacing w:before="0" w:after="40" w:line="252" w:lineRule="auto"/>
         <w:jc w:val="both"/>
       </w:pPr>
       <w:r>
@@ -634,27 +580,12 @@
           <w:sz w:val="20"/>
           <w:highlight w:val="yellow"/>
         </w:rPr>
-        <w:t>(C) 100% предоплата: Заказчик оплачивает 100% Цены в течение 3 (трёх) банковских дней с даты счёта / даты вступления Договора в силу.</w:t>
+        <w:t>Если иное не выбрано письменно, применяется вариант (A).</w:t>
       </w:r>
     </w:p>
     <w:p>
       <w:pPr>
-        <w:spacing w:before="0" w:after="60" w:line="252" w:lineRule="auto"/>
-        <w:jc w:val="both"/>
-      </w:pPr>
-      <w:r>
-        <w:rPr>
-          <w:rFonts w:ascii="Times New Roman" w:hAnsi="Times New Roman" w:eastAsia="Times New Roman"/>
-          <w:b w:val="0"/>
-          <w:sz w:val="20"/>
-          <w:highlight w:val="yellow"/>
-        </w:rPr>
-        <w:t>Если иной вариант прямо не выбран письменно, применяется вариант (A) (100% постоплата).</w:t>
-      </w:r>
-    </w:p>
-    <w:p>
-      <w:pPr>
-        <w:spacing w:before="0" w:after="60" w:line="252" w:lineRule="auto"/>
+        <w:spacing w:before="0" w:after="40" w:line="252" w:lineRule="auto"/>
         <w:jc w:val="both"/>
       </w:pPr>
       <w:r>
@@ -663,12 +594,12 @@
           <w:b w:val="0"/>
           <w:sz w:val="20"/>
         </w:rPr>
-        <w:t>3.3. Оплата производится в USD банковским переводом на USD-счёт Исполнителя, указанный в разделе 10. Комиссии банка-отправителя несёт Заказчик.</w:t>
+        <w:t>3.3. Оплата в USD на счёт Исполнителя (раздел 7). Комиссии банка-отправителя — за счёт Заказчика.</w:t>
       </w:r>
     </w:p>
     <w:p>
       <w:pPr>
-        <w:spacing w:before="0" w:after="60" w:line="252" w:lineRule="auto"/>
+        <w:spacing w:before="0" w:after="40" w:line="252" w:lineRule="auto"/>
         <w:jc w:val="both"/>
       </w:pPr>
       <w:r>
@@ -677,12 +608,12 @@
           <w:b w:val="0"/>
           <w:sz w:val="20"/>
         </w:rPr>
-        <w:t>3.4. Работы вне объёма Приложения № 1 (включая дополнительное время из-за задержки доступа или неготовности ВС) согласовываются письменно и оплачиваются отдельно.</w:t>
+        <w:t>3.4. Дополнительные работы — только по предварительному письменному согласованию и отдельной цене.</w:t>
       </w:r>
     </w:p>
     <w:p>
       <w:pPr>
-        <w:spacing w:before="60" w:after="40" w:line="252" w:lineRule="auto"/>
+        <w:spacing w:before="40" w:after="40" w:line="252" w:lineRule="auto"/>
         <w:jc w:val="left"/>
       </w:pPr>
       <w:r>
@@ -691,12 +622,12 @@
           <w:b/>
           <w:sz w:val="21"/>
         </w:rPr>
-        <w:t>4. ОБЯЗАННОСТИ СТОРОН</w:t>
+        <w:t>4. ОБЯЗАННОСТИ</w:t>
       </w:r>
     </w:p>
     <w:p>
       <w:pPr>
-        <w:spacing w:before="0" w:after="60" w:line="252" w:lineRule="auto"/>
+        <w:spacing w:before="0" w:after="40" w:line="252" w:lineRule="auto"/>
         <w:jc w:val="both"/>
       </w:pPr>
       <w:r>
@@ -705,12 +636,12 @@
           <w:b w:val="0"/>
           <w:sz w:val="20"/>
         </w:rPr>
-        <w:t>4.1. Исполнитель оказывает Услуги профессионально, соблюдает применимые правила техники безопасности и процедуры ангара JAT Tehnika, передаёт отчёт(ы) и видеоматериалы BSI.</w:t>
+        <w:t>4.1. Исполнитель оказывает Услуги профессионально, соблюдает правила ТБ и процедуры JAT Tehnika, передаёт отчёт(ы) и видеоматериалы BSI.</w:t>
       </w:r>
     </w:p>
     <w:p>
       <w:pPr>
-        <w:spacing w:before="0" w:after="60" w:line="252" w:lineRule="auto"/>
+        <w:spacing w:before="0" w:after="40" w:line="252" w:lineRule="auto"/>
         <w:jc w:val="both"/>
       </w:pPr>
       <w:r>
@@ -719,12 +650,12 @@
           <w:b w:val="0"/>
           <w:sz w:val="20"/>
         </w:rPr>
-        <w:t>4.2. Заказчик своевременно обеспечивает доступ в аэропорт и к ВС, координацию с JAT Tehnika, разрешения и техническую документацию, разумно необходимую для оказания Услуг, оплачивает Цену и назначает контактное лицо для оперативной координации.</w:t>
+        <w:t>4.2. Заказчик своевременно обеспечивает доступ, координацию с JAT Tehnika, разрешения и документацию, оплату и контактное лицо.</w:t>
       </w:r>
     </w:p>
     <w:p>
       <w:pPr>
-        <w:spacing w:before="0" w:after="60" w:line="252" w:lineRule="auto"/>
+        <w:spacing w:before="0" w:after="40" w:line="252" w:lineRule="auto"/>
         <w:jc w:val="both"/>
       </w:pPr>
       <w:r>
@@ -733,12 +664,12 @@
           <w:b w:val="0"/>
           <w:sz w:val="20"/>
         </w:rPr>
-        <w:t>4.3. Услуги носят инспекционный / диагностический характер и не включают ремонт, устранение дефектов, подтверждение лётной годности или допуск к эксплуатации, если иное прямо не согласовано письменно. Выводы отчёта основаны на состоянии и доступе на момент инспекции. Детальный объём BSI двигателей подлежит уточнению, как указано в Приложении № 1.</w:t>
+        <w:t>4.3. Услуги носят инспекционный характер и не включают ремонт, устранение дефектов, подтверждение лётной годности и допуск к эксплуатации, если иное не согласовано письменно.</w:t>
       </w:r>
     </w:p>
     <w:p>
       <w:pPr>
-        <w:spacing w:before="60" w:after="40" w:line="252" w:lineRule="auto"/>
+        <w:spacing w:before="40" w:after="40" w:line="252" w:lineRule="auto"/>
         <w:jc w:val="left"/>
       </w:pPr>
       <w:r>
@@ -747,12 +678,12 @@
           <w:b/>
           <w:sz w:val="21"/>
         </w:rPr>
-        <w:t>5. ОТВЕТСТВЕННОСТЬ И ОБСТОЯТЕЛЬСТВА НЕПРЕОДОЛИМОЙ СИЛЫ</w:t>
+        <w:t>5. ОТВЕТСТВЕННОСТЬ И ФОРС-МАЖОР</w:t>
       </w:r>
     </w:p>
     <w:p>
       <w:pPr>
-        <w:spacing w:before="0" w:after="60" w:line="252" w:lineRule="auto"/>
+        <w:spacing w:before="0" w:after="40" w:line="252" w:lineRule="auto"/>
         <w:jc w:val="both"/>
       </w:pPr>
       <w:r>
@@ -761,12 +692,12 @@
           <w:b w:val="0"/>
           <w:sz w:val="20"/>
         </w:rPr>
-        <w:t>5.1. За исключением случаев умысла или грубой неосторожности, совокупная ответственность Исполнителя по Договору не превышает Цену, фактически уплаченную Заказчиком. Стороны не отвечают за косвенные убытки (включая упущенную выгоду и простой ВС), если иное не вытекает из императивных норм права.</w:t>
+        <w:t>5.1. За исключением умысла или грубой неосторожности ответственность Исполнителя ограничена фактически уплаченной Ценой. Стороны не отвечают за косвенные убытки.</w:t>
       </w:r>
     </w:p>
     <w:p>
       <w:pPr>
-        <w:spacing w:before="0" w:after="60" w:line="252" w:lineRule="auto"/>
+        <w:spacing w:before="0" w:after="40" w:line="252" w:lineRule="auto"/>
         <w:jc w:val="both"/>
       </w:pPr>
       <w:r>
@@ -775,12 +706,12 @@
           <w:b w:val="0"/>
           <w:sz w:val="20"/>
         </w:rPr>
-        <w:t>5.2. Сторона освобождается от ответственности на период действия обстоятельств непреодолимой силы (включая военные действия, санкции, препятствующие исполнению, стихийные бедствия, эпидемии, акты органов власти, закрытие аэропорта или ангара) при условии своевременного письменного уведомления. При продолжении таких обстоятельств более 30 (тридцати) дней любая Сторона вправе расторгнуть Договор письменным уведомлением без штрафных санкций с оплатой фактически оказанных Услуг.</w:t>
+        <w:t>5.2. Форс-мажор освобождает от ответственности на период его действия при своевременном уведомлении. При продолжении более 30 дней любая Сторона вправе расторгнуть Договор без штрафов с оплатой фактически оказанных Услуг.</w:t>
       </w:r>
     </w:p>
     <w:p>
       <w:pPr>
-        <w:spacing w:before="60" w:after="40" w:line="252" w:lineRule="auto"/>
+        <w:spacing w:before="40" w:after="40" w:line="252" w:lineRule="auto"/>
         <w:jc w:val="left"/>
       </w:pPr>
       <w:r>
@@ -789,12 +720,12 @@
           <w:b/>
           <w:sz w:val="21"/>
         </w:rPr>
-        <w:t>6. КОНФИДЕНЦИАЛЬНОСТЬ</w:t>
+        <w:t>6. ОБЩИЕ ПОЛОЖЕНИЯ</w:t>
       </w:r>
     </w:p>
     <w:p>
       <w:pPr>
-        <w:spacing w:before="0" w:after="60" w:line="252" w:lineRule="auto"/>
+        <w:spacing w:before="0" w:after="40" w:line="252" w:lineRule="auto"/>
         <w:jc w:val="both"/>
       </w:pPr>
       <w:r>
@@ -803,12 +734,96 @@
           <w:b w:val="0"/>
           <w:sz w:val="20"/>
         </w:rPr>
-        <w:t>6.1. Каждая Сторона обязуется не раскрывать конфиденциальную коммерческую и техническую информацию другой Стороны, полученную в связи с Договором, третьим лицам без предварительного письменного согласия, за исключением профессиональных консультантов и случаев, предусмотренных законом. Обязательство действует в течение 3 (трёх) лет после прекращения Договора.</w:t>
+        <w:t>6.1. Договор вступает в силу с даты подписания и действует до полного исполнения.</w:t>
       </w:r>
     </w:p>
     <w:p>
       <w:pPr>
-        <w:spacing w:before="60" w:after="40" w:line="252" w:lineRule="auto"/>
+        <w:spacing w:before="0" w:after="40" w:line="252" w:lineRule="auto"/>
+        <w:jc w:val="both"/>
+      </w:pPr>
+      <w:r>
+        <w:rPr>
+          <w:rFonts w:ascii="Times New Roman" w:hAnsi="Times New Roman" w:eastAsia="Times New Roman"/>
+          <w:b w:val="0"/>
+          <w:sz w:val="20"/>
+        </w:rPr>
+        <w:t>6.2. Любая Сторона вправе расторгнуть Договор при существенном нарушении, не устранённом в течение 10 рабочих дней. Заказчик вправе отказаться до начала работ с возмещением документально подтверждённых расходов Исполнителя.</w:t>
+      </w:r>
+    </w:p>
+    <w:p>
+      <w:pPr>
+        <w:spacing w:before="0" w:after="40" w:line="252" w:lineRule="auto"/>
+        <w:jc w:val="both"/>
+      </w:pPr>
+      <w:r>
+        <w:rPr>
+          <w:rFonts w:ascii="Times New Roman" w:hAnsi="Times New Roman" w:eastAsia="Times New Roman"/>
+          <w:b w:val="0"/>
+          <w:sz w:val="20"/>
+        </w:rPr>
+        <w:t>6.3. Изменения — только в письменной форме, подписанной обеими Сторонами (включая PDF-сканы).</w:t>
+      </w:r>
+    </w:p>
+    <w:p>
+      <w:pPr>
+        <w:spacing w:before="0" w:after="40" w:line="252" w:lineRule="auto"/>
+        <w:jc w:val="both"/>
+      </w:pPr>
+      <w:r>
+        <w:rPr>
+          <w:rFonts w:ascii="Times New Roman" w:hAnsi="Times New Roman" w:eastAsia="Times New Roman"/>
+          <w:b w:val="0"/>
+          <w:sz w:val="20"/>
+        </w:rPr>
+        <w:t>6.4. Конфиденциальная информация защищается в течение 3 лет после прекращения Договора.</w:t>
+      </w:r>
+    </w:p>
+    <w:p>
+      <w:pPr>
+        <w:spacing w:before="0" w:after="40" w:line="252" w:lineRule="auto"/>
+        <w:jc w:val="both"/>
+      </w:pPr>
+      <w:r>
+        <w:rPr>
+          <w:rFonts w:ascii="Times New Roman" w:hAnsi="Times New Roman" w:eastAsia="Times New Roman"/>
+          <w:b w:val="0"/>
+          <w:sz w:val="20"/>
+        </w:rPr>
+        <w:t>6.5. Уведомления по email (раздел 7) считаются полученными на следующий рабочий день.</w:t>
+      </w:r>
+    </w:p>
+    <w:p>
+      <w:pPr>
+        <w:spacing w:before="0" w:after="40" w:line="252" w:lineRule="auto"/>
+        <w:jc w:val="both"/>
+      </w:pPr>
+      <w:r>
+        <w:rPr>
+          <w:rFonts w:ascii="Times New Roman" w:hAnsi="Times New Roman" w:eastAsia="Times New Roman"/>
+          <w:b w:val="0"/>
+          <w:sz w:val="20"/>
+        </w:rPr>
+        <w:t>6.6. Составлен на английском и русском языках; при расхождении приоритет имеет английская версия. PDF-сканы подписанных оригиналов действительны.</w:t>
+      </w:r>
+    </w:p>
+    <w:p>
+      <w:pPr>
+        <w:spacing w:before="0" w:after="40" w:line="252" w:lineRule="auto"/>
+        <w:jc w:val="both"/>
+      </w:pPr>
+      <w:r>
+        <w:rPr>
+          <w:rFonts w:ascii="Times New Roman" w:hAnsi="Times New Roman" w:eastAsia="Times New Roman"/>
+          <w:b w:val="0"/>
+          <w:sz w:val="20"/>
+        </w:rPr>
+        <w:t>6.7. Применимое право — Турция. Споры, не урегулированные за 15 рабочих дней, передаются в суды Стамбула (язык — английский, если не согласовано иное).</w:t>
+      </w:r>
+    </w:p>
+    <w:p>
+      <w:pPr>
+        <w:spacing w:before="40" w:after="60" w:line="252" w:lineRule="auto"/>
         <w:jc w:val="left"/>
       </w:pPr>
       <w:r>
@@ -817,161 +832,7 @@
           <w:b/>
           <w:sz w:val="21"/>
         </w:rPr>
-        <w:t>7. СРОК ДЕЙСТВИЯ, ИЗМЕНЕНИЕ И РАСТОРЖЕНИЕ</w:t>
-      </w:r>
-    </w:p>
-    <w:p>
-      <w:pPr>
-        <w:spacing w:before="0" w:after="60" w:line="252" w:lineRule="auto"/>
-        <w:jc w:val="both"/>
-      </w:pPr>
-      <w:r>
-        <w:rPr>
-          <w:rFonts w:ascii="Times New Roman" w:hAnsi="Times New Roman" w:eastAsia="Times New Roman"/>
-          <w:b w:val="0"/>
-          <w:sz w:val="20"/>
-        </w:rPr>
-        <w:t>7.1. Договор вступает в силу с даты подписания обеими Сторонами (либо с более поздней даты подписи) и действует до полного исполнения обязательств Сторон.</w:t>
-      </w:r>
-    </w:p>
-    <w:p>
-      <w:pPr>
-        <w:spacing w:before="0" w:after="60" w:line="252" w:lineRule="auto"/>
-        <w:jc w:val="both"/>
-      </w:pPr>
-      <w:r>
-        <w:rPr>
-          <w:rFonts w:ascii="Times New Roman" w:hAnsi="Times New Roman" w:eastAsia="Times New Roman"/>
-          <w:b w:val="0"/>
-          <w:sz w:val="20"/>
-        </w:rPr>
-        <w:t>7.2. Любая Сторона вправе расторгнуть Договор письменным уведомлением при существенном нарушении другой Стороной, не устранённом в течение 10 (десяти) рабочих дней с даты уведомления. Заказчик вправе отказаться от Услуг до их начала с возмещением документально подтверждённых расходов Исполнителя.</w:t>
-      </w:r>
-    </w:p>
-    <w:p>
-      <w:pPr>
-        <w:spacing w:before="0" w:after="60" w:line="252" w:lineRule="auto"/>
-        <w:jc w:val="both"/>
-      </w:pPr>
-      <w:r>
-        <w:rPr>
-          <w:rFonts w:ascii="Times New Roman" w:hAnsi="Times New Roman" w:eastAsia="Times New Roman"/>
-          <w:b w:val="0"/>
-          <w:sz w:val="20"/>
-        </w:rPr>
-        <w:t>7.3. Изменения действительны только в письменной форме, подписанной обеими Сторонами (включая обмен подписанными PDF-сканами).</w:t>
-      </w:r>
-    </w:p>
-    <w:p>
-      <w:pPr>
-        <w:spacing w:before="60" w:after="40" w:line="252" w:lineRule="auto"/>
-        <w:jc w:val="left"/>
-      </w:pPr>
-      <w:r>
-        <w:rPr>
-          <w:rFonts w:ascii="Times New Roman" w:hAnsi="Times New Roman" w:eastAsia="Times New Roman"/>
-          <w:b/>
-          <w:sz w:val="21"/>
-        </w:rPr>
-        <w:t>8. ПРИМЕНИМОЕ ПРАВО И РАЗРЕШЕНИЕ СПОРОВ</w:t>
-      </w:r>
-    </w:p>
-    <w:p>
-      <w:pPr>
-        <w:spacing w:before="0" w:after="60" w:line="252" w:lineRule="auto"/>
-        <w:jc w:val="both"/>
-      </w:pPr>
-      <w:r>
-        <w:rPr>
-          <w:rFonts w:ascii="Times New Roman" w:hAnsi="Times New Roman" w:eastAsia="Times New Roman"/>
-          <w:b w:val="0"/>
-          <w:sz w:val="20"/>
-        </w:rPr>
-        <w:t>8.1. К Договору применяется право Турецкой Республики без учёта коллизионных норм.</w:t>
-      </w:r>
-    </w:p>
-    <w:p>
-      <w:pPr>
-        <w:spacing w:before="0" w:after="60" w:line="252" w:lineRule="auto"/>
-        <w:jc w:val="both"/>
-      </w:pPr>
-      <w:r>
-        <w:rPr>
-          <w:rFonts w:ascii="Times New Roman" w:hAnsi="Times New Roman" w:eastAsia="Times New Roman"/>
-          <w:b w:val="0"/>
-          <w:sz w:val="20"/>
-        </w:rPr>
-        <w:t>8.2. Споры, не урегулированные путём переговоров в течение 15 (пятнадцати) рабочих дней, передаются в компетентные суды Стамбула, Турция. Язык разбирательства — английский, если иное не согласовано.</w:t>
-      </w:r>
-    </w:p>
-    <w:p>
-      <w:pPr>
-        <w:spacing w:before="60" w:after="40" w:line="252" w:lineRule="auto"/>
-        <w:jc w:val="left"/>
-      </w:pPr>
-      <w:r>
-        <w:rPr>
-          <w:rFonts w:ascii="Times New Roman" w:hAnsi="Times New Roman" w:eastAsia="Times New Roman"/>
-          <w:b/>
-          <w:sz w:val="21"/>
-        </w:rPr>
-        <w:t>9. ЗАКЛЮЧИТЕЛЬНЫЕ ПОЛОЖЕНИЯ</w:t>
-      </w:r>
-    </w:p>
-    <w:p>
-      <w:pPr>
-        <w:spacing w:before="0" w:after="60" w:line="252" w:lineRule="auto"/>
-        <w:jc w:val="both"/>
-      </w:pPr>
-      <w:r>
-        <w:rPr>
-          <w:rFonts w:ascii="Times New Roman" w:hAnsi="Times New Roman" w:eastAsia="Times New Roman"/>
-          <w:b w:val="0"/>
-          <w:sz w:val="20"/>
-        </w:rPr>
-        <w:t>9.1. Договор составлен на английском и русском языках в двух экземплярах (по одному для каждой Стороны). При расхождении между языковыми версиями приоритет имеет английская версия. Каждый экземпляр (включая PDF-скан подписанного оригинала) имеет равную юридическую силу.</w:t>
-      </w:r>
-    </w:p>
-    <w:p>
-      <w:pPr>
-        <w:spacing w:before="0" w:after="60" w:line="252" w:lineRule="auto"/>
-        <w:jc w:val="both"/>
-      </w:pPr>
-      <w:r>
-        <w:rPr>
-          <w:rFonts w:ascii="Times New Roman" w:hAnsi="Times New Roman" w:eastAsia="Times New Roman"/>
-          <w:b w:val="0"/>
-          <w:sz w:val="20"/>
-        </w:rPr>
-        <w:t>9.2. Приложение № 1 (Перечень услуг и цены) является неотъемлемой частью настоящего Договора.</w:t>
-      </w:r>
-    </w:p>
-    <w:p>
-      <w:pPr>
-        <w:spacing w:before="0" w:after="60" w:line="252" w:lineRule="auto"/>
-        <w:jc w:val="both"/>
-      </w:pPr>
-      <w:r>
-        <w:rPr>
-          <w:rFonts w:ascii="Times New Roman" w:hAnsi="Times New Roman" w:eastAsia="Times New Roman"/>
-          <w:b w:val="0"/>
-          <w:sz w:val="20"/>
-        </w:rPr>
-        <w:t>9.3. Уведомления могут направляться по электронной почте на адреса, указанные в разделе 10, и считаются полученными на следующий рабочий день после отправки при отсутствии сообщения о недоставке.</w:t>
-      </w:r>
-    </w:p>
-    <w:p>
-      <w:pPr>
-        <w:spacing w:before="60" w:after="60" w:line="252" w:lineRule="auto"/>
-        <w:jc w:val="left"/>
-      </w:pPr>
-      <w:r>
-        <w:rPr>
-          <w:rFonts w:ascii="Times New Roman" w:hAnsi="Times New Roman" w:eastAsia="Times New Roman"/>
-          <w:b/>
-          <w:sz w:val="21"/>
-        </w:rPr>
-        <w:t>10. РЕКВИЗИТЫ И ПОДПИСИ СТОРОН</w:t>
+        <w:t>7. РЕКВИЗИТЫ И ПОДПИСИ</w:t>
       </w:r>
     </w:p>
     <w:tbl>
@@ -1001,7 +862,7 @@
           </w:p>
           <w:p>
             <w:pPr>
-              <w:spacing w:after="0" w:before="0" w:line="245" w:lineRule="auto"/>
+              <w:spacing w:after="0" w:line="245" w:lineRule="auto"/>
             </w:pPr>
             <w:r>
               <w:rPr>
@@ -1009,12 +870,12 @@
                 <w:b w:val="0"/>
                 <w:sz w:val="17"/>
               </w:rPr>
-              <w:t>Юр. наименование: Hava Araclari Lojistik Sanayi ve Ticaret Anonim</w:t>
+              <w:t>Hava Araclari Lojistik Sanayi ve Ticaret Anonim</w:t>
             </w:r>
           </w:p>
           <w:p>
             <w:pPr>
-              <w:spacing w:after="0" w:before="0" w:line="245" w:lineRule="auto"/>
+              <w:spacing w:after="0" w:line="245" w:lineRule="auto"/>
             </w:pPr>
             <w:r>
               <w:rPr>
@@ -1022,12 +883,12 @@
                 <w:b w:val="0"/>
                 <w:sz w:val="17"/>
               </w:rPr>
-              <w:t>Адрес: Egitim Mahallesi, Fahrettin Kerim Gokay Caddesi, Ortaklar Is Merkezi, No: 71/57, Kadikoy, Istanbul, Turkey</w:t>
+              <w:t>Egitim Mahallesi, Fahrettin Kerim Gokay Caddesi, Ortaklar Is Merkezi, No: 71/57, Kadikoy, Istanbul, Turkey</w:t>
             </w:r>
           </w:p>
           <w:p>
             <w:pPr>
-              <w:spacing w:after="0" w:before="0" w:line="245" w:lineRule="auto"/>
+              <w:spacing w:after="0" w:line="245" w:lineRule="auto"/>
             </w:pPr>
             <w:r>
               <w:rPr>
@@ -1040,7 +901,7 @@
           </w:p>
           <w:p>
             <w:pPr>
-              <w:spacing w:after="0" w:before="0" w:line="245" w:lineRule="auto"/>
+              <w:spacing w:after="0" w:line="245" w:lineRule="auto"/>
             </w:pPr>
             <w:r>
               <w:rPr>
@@ -1053,7 +914,7 @@
           </w:p>
           <w:p>
             <w:pPr>
-              <w:spacing w:after="0" w:before="0" w:line="245" w:lineRule="auto"/>
+              <w:spacing w:after="0" w:line="245" w:lineRule="auto"/>
             </w:pPr>
             <w:r>
               <w:rPr>
@@ -1066,33 +927,7 @@
           </w:p>
           <w:p>
             <w:pPr>
-              <w:spacing w:after="0" w:before="0" w:line="245" w:lineRule="auto"/>
-            </w:pPr>
-            <w:r>
-              <w:rPr>
-                <w:rFonts w:ascii="Times New Roman" w:hAnsi="Times New Roman" w:eastAsia="Times New Roman"/>
-                <w:b w:val="0"/>
-                <w:sz w:val="17"/>
-              </w:rPr>
-              <w:t>IBAN (EUR): TR430006701000000015213968</w:t>
-            </w:r>
-          </w:p>
-          <w:p>
-            <w:pPr>
-              <w:spacing w:after="0" w:before="0" w:line="245" w:lineRule="auto"/>
-            </w:pPr>
-            <w:r>
-              <w:rPr>
-                <w:rFonts w:ascii="Times New Roman" w:hAnsi="Times New Roman" w:eastAsia="Times New Roman"/>
-                <w:b w:val="0"/>
-                <w:sz w:val="17"/>
-              </w:rPr>
-              <w:t>IBAN (TRY): TR260006701000000015208357</w:t>
-            </w:r>
-          </w:p>
-          <w:p>
-            <w:pPr>
-              <w:spacing w:after="0" w:before="0" w:line="245" w:lineRule="auto"/>
+              <w:spacing w:after="0" w:line="245" w:lineRule="auto"/>
             </w:pPr>
             <w:r>
               <w:rPr>
@@ -1105,7 +940,7 @@
           </w:p>
           <w:p>
             <w:pPr>
-              <w:spacing w:after="0" w:before="0" w:line="245" w:lineRule="auto"/>
+              <w:spacing w:after="0" w:line="245" w:lineRule="auto"/>
             </w:pPr>
             <w:r>
               <w:rPr>
@@ -1116,9 +951,25 @@
               <w:t>Тел.: +90 533 736 84 00   Email: sales@jetechnic.com</w:t>
             </w:r>
           </w:p>
+        </w:tc>
+        <w:tc>
+          <w:tcPr>
+            <w:tcW w:type="dxa" w:w="5185"/>
+          </w:tcPr>
+          <w:p>
+            <w:r/>
+            <w:r>
+              <w:rPr>
+                <w:rFonts w:ascii="Times New Roman" w:hAnsi="Times New Roman" w:eastAsia="Times New Roman"/>
+                <w:b/>
+                <w:sz w:val="19"/>
+              </w:rPr>
+              <w:t>ЗАКАЗЧИК: [●]</w:t>
+            </w:r>
+          </w:p>
           <w:p>
             <w:pPr>
-              <w:spacing w:after="0" w:before="0" w:line="245" w:lineRule="auto"/>
+              <w:spacing w:after="0" w:line="245" w:lineRule="auto"/>
             </w:pPr>
             <w:r>
               <w:rPr>
@@ -1126,40 +977,7 @@
                 <w:b w:val="0"/>
                 <w:sz w:val="17"/>
               </w:rPr>
-              <w:t>Web: jetechnic.com</w:t>
-            </w:r>
-          </w:p>
-        </w:tc>
-        <w:tc>
-          <w:tcPr>
-            <w:tcW w:type="dxa" w:w="5185"/>
-          </w:tcPr>
-          <w:p>
-            <w:r>
-              <w:rPr>
-                <w:b/>
-              </w:rPr>
-              <w:t xml:space="preserve">ЗАКАЗЧИК: </w:t>
-            </w:r>
-            <w:r>
-              <w:rPr>
-                <w:b/>
-                <w:highlight w:val="yellow"/>
-              </w:rPr>
-              <w:t>[●]</w:t>
-            </w:r>
-          </w:p>
-          <w:p>
-            <w:pPr>
-              <w:spacing w:after="0" w:before="0" w:line="245" w:lineRule="auto"/>
-            </w:pPr>
-            <w:r>
-              <w:rPr>
-                <w:rFonts w:ascii="Times New Roman" w:hAnsi="Times New Roman" w:eastAsia="Times New Roman"/>
-                <w:b w:val="0"/>
-                <w:sz w:val="17"/>
-              </w:rPr>
-              <w:t xml:space="preserve">Полное наименование: </w:t>
+              <w:t xml:space="preserve">Наименование: </w:t>
             </w:r>
             <w:r>
               <w:rPr>
@@ -1173,7 +991,7 @@
           </w:p>
           <w:p>
             <w:pPr>
-              <w:spacing w:after="0" w:before="0" w:line="245" w:lineRule="auto"/>
+              <w:spacing w:after="0" w:line="245" w:lineRule="auto"/>
             </w:pPr>
             <w:r>
               <w:rPr>
@@ -1195,7 +1013,7 @@
           </w:p>
           <w:p>
             <w:pPr>
-              <w:spacing w:after="0" w:before="0" w:line="245" w:lineRule="auto"/>
+              <w:spacing w:after="0" w:line="245" w:lineRule="auto"/>
             </w:pPr>
             <w:r>
               <w:rPr>
@@ -1217,7 +1035,7 @@
           </w:p>
           <w:p>
             <w:pPr>
-              <w:spacing w:after="0" w:before="0" w:line="245" w:lineRule="auto"/>
+              <w:spacing w:after="0" w:line="245" w:lineRule="auto"/>
             </w:pPr>
             <w:r>
               <w:rPr>
@@ -1239,7 +1057,7 @@
           </w:p>
           <w:p>
             <w:pPr>
-              <w:spacing w:after="0" w:before="0" w:line="245" w:lineRule="auto"/>
+              <w:spacing w:after="0" w:line="245" w:lineRule="auto"/>
             </w:pPr>
             <w:r>
               <w:rPr>
@@ -1276,9 +1094,26 @@
               <w:t>[●]</w:t>
             </w:r>
           </w:p>
+        </w:tc>
+      </w:tr>
+      <w:tr>
+        <w:tc>
+          <w:tcPr>
+            <w:tcW w:type="dxa" w:w="5185"/>
+          </w:tcPr>
+          <w:p>
+            <w:r/>
+            <w:r>
+              <w:rPr>
+                <w:rFonts w:ascii="Times New Roman" w:hAnsi="Times New Roman" w:eastAsia="Times New Roman"/>
+                <w:b/>
+                <w:sz w:val="19"/>
+              </w:rPr>
+            </w:r>
+          </w:p>
           <w:p>
             <w:pPr>
-              <w:spacing w:after="0" w:before="0" w:line="245" w:lineRule="auto"/>
+              <w:spacing w:after="0" w:line="245" w:lineRule="auto"/>
             </w:pPr>
             <w:r>
               <w:rPr>
@@ -1290,77 +1125,7 @@
           </w:p>
           <w:p>
             <w:pPr>
-              <w:spacing w:after="0" w:before="0" w:line="245" w:lineRule="auto"/>
-            </w:pPr>
-            <w:r>
-              <w:rPr>
-                <w:rFonts w:ascii="Times New Roman" w:hAnsi="Times New Roman" w:eastAsia="Times New Roman"/>
-                <w:b w:val="0"/>
-                <w:sz w:val="17"/>
-              </w:rPr>
-            </w:r>
-          </w:p>
-          <w:p>
-            <w:pPr>
-              <w:spacing w:after="0" w:before="0" w:line="245" w:lineRule="auto"/>
-            </w:pPr>
-            <w:r>
-              <w:rPr>
-                <w:rFonts w:ascii="Times New Roman" w:hAnsi="Times New Roman" w:eastAsia="Times New Roman"/>
-                <w:b w:val="0"/>
-                <w:sz w:val="17"/>
-              </w:rPr>
-            </w:r>
-          </w:p>
-          <w:p>
-            <w:pPr>
-              <w:spacing w:after="0" w:before="0" w:line="245" w:lineRule="auto"/>
-            </w:pPr>
-            <w:r>
-              <w:rPr>
-                <w:rFonts w:ascii="Times New Roman" w:hAnsi="Times New Roman" w:eastAsia="Times New Roman"/>
-                <w:b w:val="0"/>
-                <w:sz w:val="17"/>
-              </w:rPr>
-            </w:r>
-          </w:p>
-          <w:p>
-            <w:pPr>
-              <w:spacing w:after="0" w:before="0" w:line="245" w:lineRule="auto"/>
-            </w:pPr>
-            <w:r>
-              <w:rPr>
-                <w:rFonts w:ascii="Times New Roman" w:hAnsi="Times New Roman" w:eastAsia="Times New Roman"/>
-                <w:b w:val="0"/>
-                <w:sz w:val="17"/>
-              </w:rPr>
-            </w:r>
-          </w:p>
-        </w:tc>
-      </w:tr>
-      <w:tr>
-        <w:tc>
-          <w:tcPr>
-            <w:tcW w:type="dxa" w:w="5185"/>
-          </w:tcPr>
-          <w:p>
-            <w:r/>
-          </w:p>
-          <w:p>
-            <w:pPr>
-              <w:spacing w:after="0" w:before="0" w:line="245" w:lineRule="auto"/>
-            </w:pPr>
-            <w:r>
-              <w:rPr>
-                <w:rFonts w:ascii="Times New Roman" w:hAnsi="Times New Roman" w:eastAsia="Times New Roman"/>
-                <w:b w:val="0"/>
-                <w:sz w:val="17"/>
-              </w:rPr>
-            </w:r>
-          </w:p>
-          <w:p>
-            <w:pPr>
-              <w:spacing w:after="0" w:before="0" w:line="245" w:lineRule="auto"/>
+              <w:spacing w:after="0" w:line="245" w:lineRule="auto"/>
             </w:pPr>
             <w:r>
               <w:rPr>
@@ -1382,7 +1147,7 @@
           </w:p>
           <w:p>
             <w:pPr>
-              <w:spacing w:after="0" w:before="0" w:line="245" w:lineRule="auto"/>
+              <w:spacing w:after="0" w:line="245" w:lineRule="auto"/>
             </w:pPr>
             <w:r>
               <w:rPr>
@@ -1395,7 +1160,7 @@
           </w:p>
           <w:p>
             <w:pPr>
-              <w:spacing w:after="0" w:before="0" w:line="245" w:lineRule="auto"/>
+              <w:spacing w:after="0" w:line="245" w:lineRule="auto"/>
             </w:pPr>
             <w:r>
               <w:rPr>
@@ -1413,10 +1178,17 @@
           </w:tcPr>
           <w:p>
             <w:r/>
+            <w:r>
+              <w:rPr>
+                <w:rFonts w:ascii="Times New Roman" w:hAnsi="Times New Roman" w:eastAsia="Times New Roman"/>
+                <w:b/>
+                <w:sz w:val="19"/>
+              </w:rPr>
+            </w:r>
           </w:p>
           <w:p>
             <w:pPr>
-              <w:spacing w:after="0" w:before="0" w:line="245" w:lineRule="auto"/>
+              <w:spacing w:after="0" w:line="245" w:lineRule="auto"/>
             </w:pPr>
             <w:r>
               <w:rPr>
@@ -1428,7 +1200,7 @@
           </w:p>
           <w:p>
             <w:pPr>
-              <w:spacing w:after="0" w:before="0" w:line="245" w:lineRule="auto"/>
+              <w:spacing w:after="0" w:line="245" w:lineRule="auto"/>
             </w:pPr>
             <w:r>
               <w:rPr>
@@ -1467,7 +1239,7 @@
           </w:p>
           <w:p>
             <w:pPr>
-              <w:spacing w:after="0" w:before="0" w:line="245" w:lineRule="auto"/>
+              <w:spacing w:after="0" w:line="245" w:lineRule="auto"/>
             </w:pPr>
             <w:r>
               <w:rPr>
@@ -1489,7 +1261,7 @@
           </w:p>
           <w:p>
             <w:pPr>
-              <w:spacing w:after="0" w:before="0" w:line="245" w:lineRule="auto"/>
+              <w:spacing w:after="0" w:line="245" w:lineRule="auto"/>
             </w:pPr>
             <w:r>
               <w:rPr>
@@ -1504,445 +1276,8 @@
       </w:tr>
     </w:tbl>
     <w:p>
-      <w:r>
-        <w:br w:type="page"/>
-      </w:r>
-    </w:p>
-    <w:p>
       <w:pPr>
-        <w:spacing w:before="0" w:after="40" w:line="252" w:lineRule="auto"/>
-        <w:jc w:val="center"/>
-      </w:pPr>
-      <w:r>
-        <w:rPr>
-          <w:rFonts w:ascii="Times New Roman" w:hAnsi="Times New Roman" w:eastAsia="Times New Roman"/>
-          <w:b/>
-          <w:sz w:val="24"/>
-        </w:rPr>
-        <w:t>ПРИЛОЖЕНИЕ № 1</w:t>
-      </w:r>
-    </w:p>
-    <w:p>
-      <w:pPr>
-        <w:spacing w:before="0" w:after="40" w:line="252" w:lineRule="auto"/>
-        <w:jc w:val="center"/>
-      </w:pPr>
-      <w:r>
-        <w:rPr>
-          <w:rFonts w:ascii="Times New Roman" w:hAnsi="Times New Roman" w:eastAsia="Times New Roman"/>
-          <w:b/>
-          <w:sz w:val="20"/>
-        </w:rPr>
-        <w:t xml:space="preserve">к Договору возмездного оказания услуг № </w:t>
-      </w:r>
-      <w:r>
-        <w:rPr>
-          <w:rFonts w:ascii="Times New Roman" w:hAnsi="Times New Roman" w:eastAsia="Times New Roman"/>
-          <w:b/>
-          <w:sz w:val="20"/>
-          <w:highlight w:val="yellow"/>
-        </w:rPr>
-        <w:t>____</w:t>
-      </w:r>
-      <w:r>
-        <w:rPr>
-          <w:rFonts w:ascii="Times New Roman" w:hAnsi="Times New Roman" w:eastAsia="Times New Roman"/>
-          <w:b/>
-          <w:sz w:val="20"/>
-        </w:rPr>
-        <w:t xml:space="preserve"> / JT-BSI-2026</w:t>
-      </w:r>
-    </w:p>
-    <w:p>
-      <w:pPr>
-        <w:spacing w:before="0" w:after="80" w:line="252" w:lineRule="auto"/>
-        <w:jc w:val="center"/>
-      </w:pPr>
-      <w:r>
-        <w:rPr>
-          <w:rFonts w:ascii="Times New Roman" w:hAnsi="Times New Roman" w:eastAsia="Times New Roman"/>
-          <w:b/>
-          <w:sz w:val="22"/>
-        </w:rPr>
-        <w:t>ПЕРЕЧЕНЬ УСЛУГ И ЦЕНЫ</w:t>
-      </w:r>
-    </w:p>
-    <w:p>
-      <w:pPr>
-        <w:spacing w:before="0" w:after="20" w:line="252" w:lineRule="auto"/>
-        <w:jc w:val="center"/>
-      </w:pPr>
-      <w:r>
-        <w:rPr>
-          <w:rFonts w:ascii="Times New Roman" w:hAnsi="Times New Roman" w:eastAsia="Times New Roman"/>
-          <w:b w:val="0"/>
-          <w:sz w:val="20"/>
-        </w:rPr>
-        <w:t>Воздушное судно: Boeing 737-500, регистрационный знак VQ-BOO</w:t>
-      </w:r>
-    </w:p>
-    <w:p>
-      <w:pPr>
-        <w:spacing w:before="0" w:after="20" w:line="252" w:lineRule="auto"/>
-        <w:jc w:val="center"/>
-      </w:pPr>
-      <w:r>
-        <w:rPr>
-          <w:rFonts w:ascii="Times New Roman" w:hAnsi="Times New Roman" w:eastAsia="Times New Roman"/>
-          <w:b w:val="0"/>
-          <w:sz w:val="20"/>
-        </w:rPr>
-        <w:t>Место оказания услуг: JAT Tehnika, Белград, Республика Сербия</w:t>
-      </w:r>
-    </w:p>
-    <w:p>
-      <w:pPr>
-        <w:spacing w:before="0" w:after="120" w:line="252" w:lineRule="auto"/>
-        <w:jc w:val="center"/>
-      </w:pPr>
-      <w:r>
-        <w:rPr>
-          <w:rFonts w:ascii="Times New Roman" w:hAnsi="Times New Roman" w:eastAsia="Times New Roman"/>
-          <w:b w:val="0"/>
-          <w:sz w:val="20"/>
-        </w:rPr>
-        <w:t>Ориентировочный срок: 3 (три) дня</w:t>
-      </w:r>
-    </w:p>
-    <w:p>
-      <w:pPr>
-        <w:spacing w:before="0" w:after="60" w:line="252" w:lineRule="auto"/>
-        <w:jc w:val="left"/>
-      </w:pPr>
-      <w:r>
-        <w:rPr>
-          <w:rFonts w:ascii="Times New Roman" w:hAnsi="Times New Roman" w:eastAsia="Times New Roman"/>
-          <w:b/>
-          <w:sz w:val="20"/>
-        </w:rPr>
-        <w:t>1. Перечень услуг (компонентов):</w:t>
-      </w:r>
-    </w:p>
-    <w:p>
-      <w:pPr>
-        <w:spacing w:before="0" w:after="60" w:line="252" w:lineRule="auto"/>
-        <w:jc w:val="left"/>
-      </w:pPr>
-      <w:r>
-        <w:rPr>
-          <w:rFonts w:ascii="Times New Roman" w:hAnsi="Times New Roman" w:eastAsia="Times New Roman"/>
-          <w:b w:val="0"/>
-          <w:sz w:val="20"/>
-        </w:rPr>
-        <w:t>1.1. BSI двух (2) двигателей CFM56-3 (объём работ уточняется).</w:t>
-      </w:r>
-    </w:p>
-    <w:p>
-      <w:pPr>
-        <w:spacing w:before="0" w:after="60" w:line="252" w:lineRule="auto"/>
-        <w:jc w:val="left"/>
-      </w:pPr>
-      <w:r>
-        <w:rPr>
-          <w:rFonts w:ascii="Times New Roman" w:hAnsi="Times New Roman" w:eastAsia="Times New Roman"/>
-          <w:b w:val="0"/>
-          <w:sz w:val="20"/>
-        </w:rPr>
-        <w:t>1.2. BSI ВСУ APS2000.</w:t>
-      </w:r>
-    </w:p>
-    <w:p>
-      <w:pPr>
-        <w:spacing w:before="0" w:after="60" w:line="252" w:lineRule="auto"/>
-        <w:jc w:val="left"/>
-      </w:pPr>
-      <w:r>
-        <w:rPr>
-          <w:rFonts w:ascii="Times New Roman" w:hAnsi="Times New Roman" w:eastAsia="Times New Roman"/>
-          <w:b w:val="0"/>
-          <w:sz w:val="20"/>
-        </w:rPr>
-        <w:t>1.3. GVI воздушного судна, включая шасси, пассажирскую кабину и отсек авионики.</w:t>
-      </w:r>
-    </w:p>
-    <w:p>
-      <w:pPr>
-        <w:spacing w:before="0" w:after="60" w:line="252" w:lineRule="auto"/>
-        <w:jc w:val="left"/>
-      </w:pPr>
-      <w:r>
-        <w:rPr>
-          <w:rFonts w:ascii="Times New Roman" w:hAnsi="Times New Roman" w:eastAsia="Times New Roman"/>
-          <w:b w:val="0"/>
-          <w:sz w:val="20"/>
-        </w:rPr>
-        <w:t>1.4. Проверка документации (двигатели, ВСУ).</w:t>
-      </w:r>
-    </w:p>
-    <w:p>
-      <w:pPr>
-        <w:spacing w:before="0" w:after="80" w:line="252" w:lineRule="auto"/>
-        <w:jc w:val="left"/>
-      </w:pPr>
-      <w:r>
-        <w:rPr>
-          <w:rFonts w:ascii="Times New Roman" w:hAnsi="Times New Roman" w:eastAsia="Times New Roman"/>
-          <w:b w:val="0"/>
-          <w:sz w:val="20"/>
-        </w:rPr>
-        <w:t>1.5. Транспортные расходы и проживание, связанные с оказанием Услуг.</w:t>
-      </w:r>
-    </w:p>
-    <w:p>
-      <w:pPr>
-        <w:spacing w:before="0" w:after="60" w:line="252" w:lineRule="auto"/>
-        <w:jc w:val="left"/>
-      </w:pPr>
-      <w:r>
-        <w:rPr>
-          <w:rFonts w:ascii="Times New Roman" w:hAnsi="Times New Roman" w:eastAsia="Times New Roman"/>
-          <w:b/>
-          <w:sz w:val="20"/>
-        </w:rPr>
-        <w:t>2. Цены (USD, без учёта применимых налогов и сборов):</w:t>
-      </w:r>
-    </w:p>
-    <w:p>
-      <w:pPr>
-        <w:spacing w:before="0" w:after="20" w:line="252" w:lineRule="auto"/>
-        <w:jc w:val="left"/>
-      </w:pPr>
-      <w:r>
-        <w:rPr>
-          <w:rFonts w:ascii="Times New Roman" w:hAnsi="Times New Roman" w:eastAsia="Times New Roman"/>
-          <w:b w:val="0"/>
-          <w:sz w:val="20"/>
-        </w:rPr>
-        <w:t>• BSI CFM56-3 — 2 двигателя (объём работ уточняется) — USD 9 500,00</w:t>
-      </w:r>
-    </w:p>
-    <w:p>
-      <w:pPr>
-        <w:spacing w:before="0" w:after="20" w:line="252" w:lineRule="auto"/>
-        <w:jc w:val="left"/>
-      </w:pPr>
-      <w:r>
-        <w:rPr>
-          <w:rFonts w:ascii="Times New Roman" w:hAnsi="Times New Roman" w:eastAsia="Times New Roman"/>
-          <w:b w:val="0"/>
-          <w:sz w:val="20"/>
-        </w:rPr>
-        <w:t>• BSI ВСУ APS2000 — USD 4 000,00</w:t>
-      </w:r>
-    </w:p>
-    <w:p>
-      <w:pPr>
-        <w:spacing w:before="0" w:after="20" w:line="252" w:lineRule="auto"/>
-        <w:jc w:val="left"/>
-      </w:pPr>
-      <w:r>
-        <w:rPr>
-          <w:rFonts w:ascii="Times New Roman" w:hAnsi="Times New Roman" w:eastAsia="Times New Roman"/>
-          <w:b w:val="0"/>
-          <w:sz w:val="20"/>
-        </w:rPr>
-        <w:t>• GVI воздушного судна (включая шасси, пассажирскую кабину, отсек авионики) — USD 3 000,00</w:t>
-      </w:r>
-    </w:p>
-    <w:p>
-      <w:pPr>
-        <w:spacing w:before="0" w:after="20" w:line="252" w:lineRule="auto"/>
-        <w:jc w:val="left"/>
-      </w:pPr>
-      <w:r>
-        <w:rPr>
-          <w:rFonts w:ascii="Times New Roman" w:hAnsi="Times New Roman" w:eastAsia="Times New Roman"/>
-          <w:b w:val="0"/>
-          <w:sz w:val="20"/>
-        </w:rPr>
-        <w:t>• Проверка документации (двигатели, ВСУ) — USD 3 500,00</w:t>
-      </w:r>
-    </w:p>
-    <w:p>
-      <w:pPr>
-        <w:spacing w:before="0" w:after="20" w:line="252" w:lineRule="auto"/>
-        <w:jc w:val="left"/>
-      </w:pPr>
-      <w:r>
-        <w:rPr>
-          <w:rFonts w:ascii="Times New Roman" w:hAnsi="Times New Roman" w:eastAsia="Times New Roman"/>
-          <w:b w:val="0"/>
-          <w:sz w:val="20"/>
-        </w:rPr>
-        <w:t>• Транспортные расходы и проживание — USD 4 000,00</w:t>
-      </w:r>
-    </w:p>
-    <w:p>
-      <w:pPr>
-        <w:spacing w:before="60" w:after="80" w:line="252" w:lineRule="auto"/>
-        <w:jc w:val="left"/>
-      </w:pPr>
-      <w:r>
-        <w:rPr>
-          <w:rFonts w:ascii="Times New Roman" w:hAnsi="Times New Roman" w:eastAsia="Times New Roman"/>
-          <w:b/>
-          <w:sz w:val="20"/>
-        </w:rPr>
-        <w:t>ИТОГО: USD 24 000,00 (двадцать четыре тысячи долларов США).</w:t>
-      </w:r>
-    </w:p>
-    <w:p>
-      <w:pPr>
-        <w:spacing w:before="0" w:after="40" w:line="252" w:lineRule="auto"/>
-        <w:jc w:val="left"/>
-      </w:pPr>
-      <w:r>
-        <w:rPr>
-          <w:rFonts w:ascii="Times New Roman" w:hAnsi="Times New Roman" w:eastAsia="Times New Roman"/>
-          <w:b/>
-          <w:sz w:val="20"/>
-        </w:rPr>
-        <w:t>3. Примечания:</w:t>
-      </w:r>
-    </w:p>
-    <w:p>
-      <w:pPr>
-        <w:spacing w:before="0" w:after="60" w:line="252" w:lineRule="auto"/>
-        <w:jc w:val="both"/>
-      </w:pPr>
-      <w:r>
-        <w:rPr>
-          <w:rFonts w:ascii="Times New Roman" w:hAnsi="Times New Roman" w:eastAsia="Times New Roman"/>
-          <w:b w:val="0"/>
-          <w:sz w:val="20"/>
-        </w:rPr>
-        <w:t>3.1. Цена не включает применимые налоги и сборы.</w:t>
-      </w:r>
-    </w:p>
-    <w:p>
-      <w:pPr>
-        <w:spacing w:before="0" w:after="60" w:line="252" w:lineRule="auto"/>
-        <w:jc w:val="both"/>
-      </w:pPr>
-      <w:r>
-        <w:rPr>
-          <w:rFonts w:ascii="Times New Roman" w:hAnsi="Times New Roman" w:eastAsia="Times New Roman"/>
-          <w:b w:val="0"/>
-          <w:sz w:val="20"/>
-        </w:rPr>
-        <w:t>3.2. Доступ в зону аэропорта и к ВС обеспечивает Заказчик.</w:t>
-      </w:r>
-    </w:p>
-    <w:p>
-      <w:pPr>
-        <w:spacing w:before="0" w:after="60" w:line="252" w:lineRule="auto"/>
-        <w:jc w:val="both"/>
-      </w:pPr>
-      <w:r>
-        <w:rPr>
-          <w:rFonts w:ascii="Times New Roman" w:hAnsi="Times New Roman" w:eastAsia="Times New Roman"/>
-          <w:b w:val="0"/>
-          <w:sz w:val="20"/>
-        </w:rPr>
-        <w:t>3.3. BSI выполняется сертифицированным инженером с выдачей отчёта BSI и видеоматериалов.</w:t>
-      </w:r>
-    </w:p>
-    <w:p>
-      <w:pPr>
-        <w:spacing w:before="0" w:after="160" w:line="252" w:lineRule="auto"/>
-        <w:jc w:val="both"/>
-      </w:pPr>
-      <w:r>
-        <w:rPr>
-          <w:rFonts w:ascii="Times New Roman" w:hAnsi="Times New Roman" w:eastAsia="Times New Roman"/>
-          <w:b w:val="0"/>
-          <w:sz w:val="20"/>
-        </w:rPr>
-        <w:t>3.4. Настоящее Приложение № 1 является неотъемлемой частью Договора.</w:t>
-      </w:r>
-    </w:p>
-    <w:p>
-      <w:pPr>
-        <w:spacing w:before="0" w:after="40" w:line="252" w:lineRule="auto"/>
-        <w:jc w:val="left"/>
-      </w:pPr>
-      <w:r>
-        <w:rPr>
-          <w:rFonts w:ascii="Times New Roman" w:hAnsi="Times New Roman" w:eastAsia="Times New Roman"/>
-          <w:b w:val="0"/>
-          <w:sz w:val="20"/>
-        </w:rPr>
-        <w:t xml:space="preserve">ИСПОЛНИТЕЛЬ: </w:t>
-      </w:r>
-      <w:r>
-        <w:rPr>
-          <w:rFonts w:ascii="Times New Roman" w:hAnsi="Times New Roman" w:eastAsia="Times New Roman"/>
-          <w:b w:val="0"/>
-          <w:sz w:val="20"/>
-          <w:highlight w:val="yellow"/>
-        </w:rPr>
-        <w:t>________________</w:t>
-      </w:r>
-      <w:r>
-        <w:rPr>
-          <w:rFonts w:ascii="Times New Roman" w:hAnsi="Times New Roman" w:eastAsia="Times New Roman"/>
-          <w:b w:val="0"/>
-          <w:sz w:val="20"/>
-        </w:rPr>
-        <w:t xml:space="preserve"> / Serdar Guler /</w:t>
-      </w:r>
-    </w:p>
-    <w:p>
-      <w:pPr>
-        <w:spacing w:before="0" w:after="120" w:line="252" w:lineRule="auto"/>
-        <w:jc w:val="left"/>
-      </w:pPr>
-      <w:r>
-        <w:rPr>
-          <w:rFonts w:ascii="Times New Roman" w:hAnsi="Times New Roman" w:eastAsia="Times New Roman"/>
-          <w:b w:val="0"/>
-          <w:sz w:val="20"/>
-        </w:rPr>
-        <w:t xml:space="preserve">ЗАКАЗЧИК:    </w:t>
-      </w:r>
-      <w:r>
-        <w:rPr>
-          <w:rFonts w:ascii="Times New Roman" w:hAnsi="Times New Roman" w:eastAsia="Times New Roman"/>
-          <w:b w:val="0"/>
-          <w:sz w:val="20"/>
-          <w:highlight w:val="yellow"/>
-        </w:rPr>
-        <w:t>________________</w:t>
-      </w:r>
-      <w:r>
-        <w:rPr>
-          <w:rFonts w:ascii="Times New Roman" w:hAnsi="Times New Roman" w:eastAsia="Times New Roman"/>
-          <w:b w:val="0"/>
-          <w:sz w:val="20"/>
-        </w:rPr>
-        <w:t xml:space="preserve"> / </w:t>
-      </w:r>
-      <w:r>
-        <w:rPr>
-          <w:rFonts w:ascii="Times New Roman" w:hAnsi="Times New Roman" w:eastAsia="Times New Roman"/>
-          <w:b w:val="0"/>
-          <w:sz w:val="20"/>
-          <w:highlight w:val="yellow"/>
-        </w:rPr>
-        <w:t>[ФИО]</w:t>
-      </w:r>
-      <w:r>
-        <w:rPr>
-          <w:rFonts w:ascii="Times New Roman" w:hAnsi="Times New Roman" w:eastAsia="Times New Roman"/>
-          <w:b w:val="0"/>
-          <w:sz w:val="20"/>
-        </w:rPr>
-        <w:t xml:space="preserve"> /</w:t>
-      </w:r>
-    </w:p>
-    <w:p>
-      <w:pPr>
-        <w:spacing w:before="0" w:after="60" w:line="252" w:lineRule="auto"/>
+        <w:spacing w:before="0" w:after="0" w:line="252" w:lineRule="auto"/>
         <w:jc w:val="left"/>
       </w:pPr>
       <w:r>
@@ -1951,14 +1286,14 @@
           <w:b w:val="0"/>
           <w:sz w:val="16"/>
         </w:rPr>
-        <w:t>ЧЕРНОВИК — для внутренней проверки. Данные Заказчика ещё не заполнены. Не является юридической консультацией.</w:t>
+        <w:t>ЧЕРНОВИК — не юридическая консультация.</w:t>
       </w:r>
     </w:p>
     <w:sectPr>
       <w:headerReference w:type="default" r:id="rId9"/>
       <w:footerReference w:type="default" r:id="rId10"/>
       <w:pgSz w:w="12240" w:h="15840"/>
-      <w:pgMar w:top="680" w:right="850" w:bottom="907" w:left="1020" w:header="283" w:footer="283" w:gutter="0"/>
+      <w:pgMar w:top="680" w:right="850" w:bottom="850" w:left="1020" w:header="227" w:footer="227" w:gutter="0"/>
       <w:cols w:space="720"/>
       <w:docGrid w:linePitch="360"/>
     </w:sectPr>
@@ -1977,7 +1312,7 @@
       <w:rPr>
         <w:rFonts w:ascii="Times New Roman" w:hAnsi="Times New Roman" w:eastAsia="Times New Roman"/>
         <w:b w:val="0"/>
-        <w:color w:val="555555"/>
+        <w:color w:val="666666"/>
         <w:sz w:val="15"/>
       </w:rPr>
       <w:t>Egitim Mahallesi, Fahrettin Kerim Gokay Caddesi, Ortaklar Ishani, N: 71/57, Kadikoy, 34722, Istanbul, Turkey  |  sales@jetechnic.com  |  jetechnic.com</w:t>
@@ -1991,13 +1326,12 @@
   <w:p>
     <w:pPr>
       <w:pStyle w:val="Header"/>
-      <w:spacing w:after="40" w:before="0"/>
       <w:jc w:val="center"/>
     </w:pPr>
     <w:r>
       <w:drawing>
         <wp:inline xmlns:a="http://schemas.openxmlformats.org/drawingml/2006/main" xmlns:pic="http://schemas.openxmlformats.org/drawingml/2006/picture">
-          <wp:extent cx="3780000" cy="644882"/>
+          <wp:extent cx="3600000" cy="614173"/>
           <wp:docPr id="1" name="Picture 1"/>
           <wp:cNvGraphicFramePr>
             <a:graphicFrameLocks noChangeAspect="1"/>
@@ -2018,7 +1352,7 @@
                 <pic:spPr>
                   <a:xfrm>
                     <a:off x="0" y="0"/>
-                    <a:ext cx="3780000" cy="644882"/>
+                    <a:ext cx="3600000" cy="614173"/>
                   </a:xfrm>
                   <a:prstGeom prst="rect"/>
                 </pic:spPr>

</xml_diff>

<commit_message>
Remove bilingual language clause from inspection agreements
Co-authored-by: alexanderp-cell <alexanderp-cell@users.noreply.github.com>
</commit_message>
<xml_diff>
--- a/agreements/Dogovor_JT-BSI-2026_RU.docx
+++ b/agreements/Dogovor_JT-BSI-2026_RU.docx
@@ -757,12 +757,7 @@
         <w:jc w:val="both"/>
       </w:pPr>
       <w:r>
-        <w:rPr>
-          <w:rFonts w:ascii="Times New Roman" w:hAnsi="Times New Roman" w:eastAsia="Times New Roman"/>
-          <w:b w:val="0"/>
-          <w:sz w:val="20"/>
-        </w:rPr>
-        <w:t>6.3. Изменения — только в письменной форме, подписанной обеими Сторонами (включая PDF-сканы).</w:t>
+        <w:t>6.3. Изменения — только в письменной форме, подписанной обеими Сторонами (включая PDF-сканы подписанных оригиналов).</w:t>
       </w:r>
     </w:p>
     <w:p>
@@ -799,26 +794,7 @@
         <w:jc w:val="both"/>
       </w:pPr>
       <w:r>
-        <w:rPr>
-          <w:rFonts w:ascii="Times New Roman" w:hAnsi="Times New Roman" w:eastAsia="Times New Roman"/>
-          <w:b w:val="0"/>
-          <w:sz w:val="20"/>
-        </w:rPr>
-        <w:t>6.6. Составлен на английском и русском языках; при расхождении приоритет имеет английская версия. PDF-сканы подписанных оригиналов действительны.</w:t>
-      </w:r>
-    </w:p>
-    <w:p>
-      <w:pPr>
-        <w:spacing w:before="0" w:after="40" w:line="252" w:lineRule="auto"/>
-        <w:jc w:val="both"/>
-      </w:pPr>
-      <w:r>
-        <w:rPr>
-          <w:rFonts w:ascii="Times New Roman" w:hAnsi="Times New Roman" w:eastAsia="Times New Roman"/>
-          <w:b w:val="0"/>
-          <w:sz w:val="20"/>
-        </w:rPr>
-        <w:t>6.7. Применимое право — Турция. Споры, не урегулированные за 15 рабочих дней, передаются в суды Стамбула (язык — английский, если не согласовано иное).</w:t>
+        <w:t>6.6. Применимое право — Турция. Споры, не урегулированные за 15 рабочих дней, передаются в суды Стамбула (язык — английский, если не согласовано иное).</w:t>
       </w:r>
     </w:p>
     <w:p>

</xml_diff>

<commit_message>
Set Calibri font in inspection service agreements
Co-authored-by: alexanderp-cell <alexanderp-cell@users.noreply.github.com>
</commit_message>
<xml_diff>
--- a/agreements/Dogovor_JT-BSI-2026_RU.docx
+++ b/agreements/Dogovor_JT-BSI-2026_RU.docx
@@ -9,7 +9,7 @@
       </w:pPr>
       <w:r>
         <w:rPr>
-          <w:rFonts w:ascii="Times New Roman" w:hAnsi="Times New Roman" w:eastAsia="Times New Roman"/>
+          <w:rFonts w:ascii="Calibri" w:hAnsi="Calibri" w:eastAsia="Calibri" w:cs="Calibri"/>
           <w:b/>
           <w:sz w:val="24"/>
         </w:rPr>
@@ -17,7 +17,7 @@
       </w:r>
       <w:r>
         <w:rPr>
-          <w:rFonts w:ascii="Times New Roman" w:hAnsi="Times New Roman" w:eastAsia="Times New Roman"/>
+          <w:rFonts w:ascii="Calibri" w:hAnsi="Calibri" w:eastAsia="Calibri" w:cs="Calibri"/>
           <w:b/>
           <w:sz w:val="24"/>
           <w:highlight w:val="yellow"/>
@@ -26,7 +26,7 @@
       </w:r>
       <w:r>
         <w:rPr>
-          <w:rFonts w:ascii="Times New Roman" w:hAnsi="Times New Roman" w:eastAsia="Times New Roman"/>
+          <w:rFonts w:ascii="Calibri" w:hAnsi="Calibri" w:eastAsia="Calibri" w:cs="Calibri"/>
           <w:b/>
           <w:sz w:val="24"/>
         </w:rPr>
@@ -40,7 +40,7 @@
       </w:pPr>
       <w:r>
         <w:rPr>
-          <w:rFonts w:ascii="Times New Roman" w:hAnsi="Times New Roman" w:eastAsia="Times New Roman"/>
+          <w:rFonts w:ascii="Calibri" w:hAnsi="Calibri" w:eastAsia="Calibri" w:cs="Calibri"/>
           <w:b/>
           <w:sz w:val="21"/>
         </w:rPr>
@@ -54,7 +54,7 @@
       </w:pPr>
       <w:r>
         <w:rPr>
-          <w:rFonts w:ascii="Times New Roman" w:hAnsi="Times New Roman" w:eastAsia="Times New Roman"/>
+          <w:rFonts w:ascii="Calibri" w:hAnsi="Calibri" w:eastAsia="Calibri" w:cs="Calibri"/>
           <w:b/>
           <w:sz w:val="20"/>
         </w:rPr>
@@ -68,7 +68,7 @@
       </w:pPr>
       <w:r>
         <w:rPr>
-          <w:rFonts w:ascii="Times New Roman" w:hAnsi="Times New Roman" w:eastAsia="Times New Roman"/>
+          <w:rFonts w:ascii="Calibri" w:hAnsi="Calibri" w:eastAsia="Calibri" w:cs="Calibri"/>
           <w:b w:val="0"/>
           <w:sz w:val="19"/>
         </w:rPr>
@@ -76,7 +76,7 @@
       </w:r>
       <w:r>
         <w:rPr>
-          <w:rFonts w:ascii="Times New Roman" w:hAnsi="Times New Roman" w:eastAsia="Times New Roman"/>
+          <w:rFonts w:ascii="Calibri" w:hAnsi="Calibri" w:eastAsia="Calibri" w:cs="Calibri"/>
           <w:b w:val="0"/>
           <w:sz w:val="19"/>
           <w:highlight w:val="yellow"/>
@@ -85,7 +85,7 @@
       </w:r>
       <w:r>
         <w:rPr>
-          <w:rFonts w:ascii="Times New Roman" w:hAnsi="Times New Roman" w:eastAsia="Times New Roman"/>
+          <w:rFonts w:ascii="Calibri" w:hAnsi="Calibri" w:eastAsia="Calibri" w:cs="Calibri"/>
           <w:b w:val="0"/>
           <w:sz w:val="19"/>
         </w:rPr>
@@ -93,7 +93,7 @@
       </w:r>
       <w:r>
         <w:rPr>
-          <w:rFonts w:ascii="Times New Roman" w:hAnsi="Times New Roman" w:eastAsia="Times New Roman"/>
+          <w:rFonts w:ascii="Calibri" w:hAnsi="Calibri" w:eastAsia="Calibri" w:cs="Calibri"/>
           <w:b w:val="0"/>
           <w:sz w:val="19"/>
           <w:highlight w:val="yellow"/>
@@ -102,7 +102,7 @@
       </w:r>
       <w:r>
         <w:rPr>
-          <w:rFonts w:ascii="Times New Roman" w:hAnsi="Times New Roman" w:eastAsia="Times New Roman"/>
+          <w:rFonts w:ascii="Calibri" w:hAnsi="Calibri" w:eastAsia="Calibri" w:cs="Calibri"/>
           <w:b w:val="0"/>
           <w:sz w:val="19"/>
         </w:rPr>
@@ -110,7 +110,7 @@
       </w:r>
       <w:r>
         <w:rPr>
-          <w:rFonts w:ascii="Times New Roman" w:hAnsi="Times New Roman" w:eastAsia="Times New Roman"/>
+          <w:rFonts w:ascii="Calibri" w:hAnsi="Calibri" w:eastAsia="Calibri" w:cs="Calibri"/>
           <w:b w:val="0"/>
           <w:sz w:val="19"/>
           <w:highlight w:val="yellow"/>
@@ -119,7 +119,7 @@
       </w:r>
       <w:r>
         <w:rPr>
-          <w:rFonts w:ascii="Times New Roman" w:hAnsi="Times New Roman" w:eastAsia="Times New Roman"/>
+          <w:rFonts w:ascii="Calibri" w:hAnsi="Calibri" w:eastAsia="Calibri" w:cs="Calibri"/>
           <w:b w:val="0"/>
           <w:sz w:val="19"/>
         </w:rPr>
@@ -133,7 +133,7 @@
       </w:pPr>
       <w:r>
         <w:rPr>
-          <w:rFonts w:ascii="Times New Roman" w:hAnsi="Times New Roman" w:eastAsia="Times New Roman"/>
+          <w:rFonts w:ascii="Calibri" w:hAnsi="Calibri" w:eastAsia="Calibri" w:cs="Calibri"/>
           <w:b/>
           <w:sz w:val="20"/>
         </w:rPr>
@@ -141,7 +141,7 @@
       </w:r>
       <w:r>
         <w:rPr>
-          <w:rFonts w:ascii="Times New Roman" w:hAnsi="Times New Roman" w:eastAsia="Times New Roman"/>
+          <w:rFonts w:ascii="Calibri" w:hAnsi="Calibri" w:eastAsia="Calibri" w:cs="Calibri"/>
           <w:b w:val="0"/>
           <w:sz w:val="20"/>
         </w:rPr>
@@ -149,7 +149,7 @@
       </w:r>
       <w:r>
         <w:rPr>
-          <w:rFonts w:ascii="Times New Roman" w:hAnsi="Times New Roman" w:eastAsia="Times New Roman"/>
+          <w:rFonts w:ascii="Calibri" w:hAnsi="Calibri" w:eastAsia="Calibri" w:cs="Calibri"/>
           <w:b/>
           <w:sz w:val="20"/>
         </w:rPr>
@@ -157,7 +157,7 @@
       </w:r>
       <w:r>
         <w:rPr>
-          <w:rFonts w:ascii="Times New Roman" w:hAnsi="Times New Roman" w:eastAsia="Times New Roman"/>
+          <w:rFonts w:ascii="Calibri" w:hAnsi="Calibri" w:eastAsia="Calibri" w:cs="Calibri"/>
           <w:b w:val="0"/>
           <w:sz w:val="20"/>
         </w:rPr>
@@ -171,7 +171,7 @@
       </w:pPr>
       <w:r>
         <w:rPr>
-          <w:rFonts w:ascii="Times New Roman" w:hAnsi="Times New Roman" w:eastAsia="Times New Roman"/>
+          <w:rFonts w:ascii="Calibri" w:hAnsi="Calibri" w:eastAsia="Calibri" w:cs="Calibri"/>
           <w:b/>
           <w:sz w:val="20"/>
           <w:highlight w:val="yellow"/>
@@ -180,7 +180,7 @@
       </w:r>
       <w:r>
         <w:rPr>
-          <w:rFonts w:ascii="Times New Roman" w:hAnsi="Times New Roman" w:eastAsia="Times New Roman"/>
+          <w:rFonts w:ascii="Calibri" w:hAnsi="Calibri" w:eastAsia="Calibri" w:cs="Calibri"/>
           <w:b w:val="0"/>
           <w:sz w:val="20"/>
         </w:rPr>
@@ -188,7 +188,7 @@
       </w:r>
       <w:r>
         <w:rPr>
-          <w:rFonts w:ascii="Times New Roman" w:hAnsi="Times New Roman" w:eastAsia="Times New Roman"/>
+          <w:rFonts w:ascii="Calibri" w:hAnsi="Calibri" w:eastAsia="Calibri" w:cs="Calibri"/>
           <w:b w:val="0"/>
           <w:sz w:val="20"/>
           <w:highlight w:val="yellow"/>
@@ -197,7 +197,7 @@
       </w:r>
       <w:r>
         <w:rPr>
-          <w:rFonts w:ascii="Times New Roman" w:hAnsi="Times New Roman" w:eastAsia="Times New Roman"/>
+          <w:rFonts w:ascii="Calibri" w:hAnsi="Calibri" w:eastAsia="Calibri" w:cs="Calibri"/>
           <w:b w:val="0"/>
           <w:sz w:val="20"/>
         </w:rPr>
@@ -205,7 +205,7 @@
       </w:r>
       <w:r>
         <w:rPr>
-          <w:rFonts w:ascii="Times New Roman" w:hAnsi="Times New Roman" w:eastAsia="Times New Roman"/>
+          <w:rFonts w:ascii="Calibri" w:hAnsi="Calibri" w:eastAsia="Calibri" w:cs="Calibri"/>
           <w:b w:val="0"/>
           <w:sz w:val="20"/>
           <w:highlight w:val="yellow"/>
@@ -214,7 +214,7 @@
       </w:r>
       <w:r>
         <w:rPr>
-          <w:rFonts w:ascii="Times New Roman" w:hAnsi="Times New Roman" w:eastAsia="Times New Roman"/>
+          <w:rFonts w:ascii="Calibri" w:hAnsi="Calibri" w:eastAsia="Calibri" w:cs="Calibri"/>
           <w:b w:val="0"/>
           <w:sz w:val="20"/>
         </w:rPr>
@@ -222,7 +222,7 @@
       </w:r>
       <w:r>
         <w:rPr>
-          <w:rFonts w:ascii="Times New Roman" w:hAnsi="Times New Roman" w:eastAsia="Times New Roman"/>
+          <w:rFonts w:ascii="Calibri" w:hAnsi="Calibri" w:eastAsia="Calibri" w:cs="Calibri"/>
           <w:b/>
           <w:sz w:val="20"/>
         </w:rPr>
@@ -230,7 +230,7 @@
       </w:r>
       <w:r>
         <w:rPr>
-          <w:rFonts w:ascii="Times New Roman" w:hAnsi="Times New Roman" w:eastAsia="Times New Roman"/>
+          <w:rFonts w:ascii="Calibri" w:hAnsi="Calibri" w:eastAsia="Calibri" w:cs="Calibri"/>
           <w:b w:val="0"/>
           <w:sz w:val="20"/>
         </w:rPr>
@@ -238,7 +238,7 @@
       </w:r>
       <w:r>
         <w:rPr>
-          <w:rFonts w:ascii="Times New Roman" w:hAnsi="Times New Roman" w:eastAsia="Times New Roman"/>
+          <w:rFonts w:ascii="Calibri" w:hAnsi="Calibri" w:eastAsia="Calibri" w:cs="Calibri"/>
           <w:b w:val="0"/>
           <w:sz w:val="20"/>
           <w:highlight w:val="yellow"/>
@@ -247,7 +247,7 @@
       </w:r>
       <w:r>
         <w:rPr>
-          <w:rFonts w:ascii="Times New Roman" w:hAnsi="Times New Roman" w:eastAsia="Times New Roman"/>
+          <w:rFonts w:ascii="Calibri" w:hAnsi="Calibri" w:eastAsia="Calibri" w:cs="Calibri"/>
           <w:b w:val="0"/>
           <w:sz w:val="20"/>
         </w:rPr>
@@ -255,7 +255,7 @@
       </w:r>
       <w:r>
         <w:rPr>
-          <w:rFonts w:ascii="Times New Roman" w:hAnsi="Times New Roman" w:eastAsia="Times New Roman"/>
+          <w:rFonts w:ascii="Calibri" w:hAnsi="Calibri" w:eastAsia="Calibri" w:cs="Calibri"/>
           <w:b w:val="0"/>
           <w:sz w:val="20"/>
           <w:highlight w:val="yellow"/>
@@ -264,7 +264,7 @@
       </w:r>
       <w:r>
         <w:rPr>
-          <w:rFonts w:ascii="Times New Roman" w:hAnsi="Times New Roman" w:eastAsia="Times New Roman"/>
+          <w:rFonts w:ascii="Calibri" w:hAnsi="Calibri" w:eastAsia="Calibri" w:cs="Calibri"/>
           <w:b w:val="0"/>
           <w:sz w:val="20"/>
         </w:rPr>
@@ -278,7 +278,7 @@
       </w:pPr>
       <w:r>
         <w:rPr>
-          <w:rFonts w:ascii="Times New Roman" w:hAnsi="Times New Roman" w:eastAsia="Times New Roman"/>
+          <w:rFonts w:ascii="Calibri" w:hAnsi="Calibri" w:eastAsia="Calibri" w:cs="Calibri"/>
           <w:b w:val="0"/>
           <w:sz w:val="20"/>
         </w:rPr>
@@ -292,7 +292,7 @@
       </w:pPr>
       <w:r>
         <w:rPr>
-          <w:rFonts w:ascii="Times New Roman" w:hAnsi="Times New Roman" w:eastAsia="Times New Roman"/>
+          <w:rFonts w:ascii="Calibri" w:hAnsi="Calibri" w:eastAsia="Calibri" w:cs="Calibri"/>
           <w:b/>
           <w:sz w:val="21"/>
         </w:rPr>
@@ -306,7 +306,7 @@
       </w:pPr>
       <w:r>
         <w:rPr>
-          <w:rFonts w:ascii="Times New Roman" w:hAnsi="Times New Roman" w:eastAsia="Times New Roman"/>
+          <w:rFonts w:ascii="Calibri" w:hAnsi="Calibri" w:eastAsia="Calibri" w:cs="Calibri"/>
           <w:b w:val="0"/>
           <w:sz w:val="20"/>
         </w:rPr>
@@ -320,7 +320,7 @@
       </w:pPr>
       <w:r>
         <w:rPr>
-          <w:rFonts w:ascii="Times New Roman" w:hAnsi="Times New Roman" w:eastAsia="Times New Roman"/>
+          <w:rFonts w:ascii="Calibri" w:hAnsi="Calibri" w:eastAsia="Calibri" w:cs="Calibri"/>
           <w:b w:val="0"/>
           <w:sz w:val="20"/>
         </w:rPr>
@@ -334,7 +334,7 @@
       </w:pPr>
       <w:r>
         <w:rPr>
-          <w:rFonts w:ascii="Times New Roman" w:hAnsi="Times New Roman" w:eastAsia="Times New Roman"/>
+          <w:rFonts w:ascii="Calibri" w:hAnsi="Calibri" w:eastAsia="Calibri" w:cs="Calibri"/>
           <w:b w:val="0"/>
           <w:sz w:val="20"/>
         </w:rPr>
@@ -348,7 +348,7 @@
       </w:pPr>
       <w:r>
         <w:rPr>
-          <w:rFonts w:ascii="Times New Roman" w:hAnsi="Times New Roman" w:eastAsia="Times New Roman"/>
+          <w:rFonts w:ascii="Calibri" w:hAnsi="Calibri" w:eastAsia="Calibri" w:cs="Calibri"/>
           <w:b w:val="0"/>
           <w:sz w:val="20"/>
         </w:rPr>
@@ -362,7 +362,7 @@
       </w:pPr>
       <w:r>
         <w:rPr>
-          <w:rFonts w:ascii="Times New Roman" w:hAnsi="Times New Roman" w:eastAsia="Times New Roman"/>
+          <w:rFonts w:ascii="Calibri" w:hAnsi="Calibri" w:eastAsia="Calibri" w:cs="Calibri"/>
           <w:b/>
           <w:sz w:val="21"/>
         </w:rPr>
@@ -376,7 +376,7 @@
       </w:pPr>
       <w:r>
         <w:rPr>
-          <w:rFonts w:ascii="Times New Roman" w:hAnsi="Times New Roman" w:eastAsia="Times New Roman"/>
+          <w:rFonts w:ascii="Calibri" w:hAnsi="Calibri" w:eastAsia="Calibri" w:cs="Calibri"/>
           <w:b w:val="0"/>
           <w:sz w:val="20"/>
         </w:rPr>
@@ -390,7 +390,7 @@
       </w:pPr>
       <w:r>
         <w:rPr>
-          <w:rFonts w:ascii="Times New Roman" w:hAnsi="Times New Roman" w:eastAsia="Times New Roman"/>
+          <w:rFonts w:ascii="Calibri" w:hAnsi="Calibri" w:eastAsia="Calibri" w:cs="Calibri"/>
           <w:b w:val="0"/>
           <w:sz w:val="20"/>
         </w:rPr>
@@ -404,7 +404,7 @@
       </w:pPr>
       <w:r>
         <w:rPr>
-          <w:rFonts w:ascii="Times New Roman" w:hAnsi="Times New Roman" w:eastAsia="Times New Roman"/>
+          <w:rFonts w:ascii="Calibri" w:hAnsi="Calibri" w:eastAsia="Calibri" w:cs="Calibri"/>
           <w:b/>
           <w:sz w:val="21"/>
         </w:rPr>
@@ -418,7 +418,7 @@
       </w:pPr>
       <w:r>
         <w:rPr>
-          <w:rFonts w:ascii="Times New Roman" w:hAnsi="Times New Roman" w:eastAsia="Times New Roman"/>
+          <w:rFonts w:ascii="Calibri" w:hAnsi="Calibri" w:eastAsia="Calibri" w:cs="Calibri"/>
           <w:b w:val="0"/>
           <w:sz w:val="20"/>
         </w:rPr>
@@ -432,7 +432,7 @@
       </w:pPr>
       <w:r>
         <w:rPr>
-          <w:rFonts w:ascii="Times New Roman" w:hAnsi="Times New Roman" w:eastAsia="Times New Roman"/>
+          <w:rFonts w:ascii="Calibri" w:hAnsi="Calibri" w:eastAsia="Calibri" w:cs="Calibri"/>
           <w:b w:val="0"/>
           <w:sz w:val="20"/>
         </w:rPr>
@@ -446,7 +446,7 @@
       </w:pPr>
       <w:r>
         <w:rPr>
-          <w:rFonts w:ascii="Times New Roman" w:hAnsi="Times New Roman" w:eastAsia="Times New Roman"/>
+          <w:rFonts w:ascii="Calibri" w:hAnsi="Calibri" w:eastAsia="Calibri" w:cs="Calibri"/>
           <w:b w:val="0"/>
           <w:sz w:val="20"/>
         </w:rPr>
@@ -460,7 +460,7 @@
       </w:pPr>
       <w:r>
         <w:rPr>
-          <w:rFonts w:ascii="Times New Roman" w:hAnsi="Times New Roman" w:eastAsia="Times New Roman"/>
+          <w:rFonts w:ascii="Calibri" w:hAnsi="Calibri" w:eastAsia="Calibri" w:cs="Calibri"/>
           <w:b w:val="0"/>
           <w:sz w:val="20"/>
         </w:rPr>
@@ -474,7 +474,7 @@
       </w:pPr>
       <w:r>
         <w:rPr>
-          <w:rFonts w:ascii="Times New Roman" w:hAnsi="Times New Roman" w:eastAsia="Times New Roman"/>
+          <w:rFonts w:ascii="Calibri" w:hAnsi="Calibri" w:eastAsia="Calibri" w:cs="Calibri"/>
           <w:b w:val="0"/>
           <w:sz w:val="20"/>
         </w:rPr>
@@ -488,7 +488,7 @@
       </w:pPr>
       <w:r>
         <w:rPr>
-          <w:rFonts w:ascii="Times New Roman" w:hAnsi="Times New Roman" w:eastAsia="Times New Roman"/>
+          <w:rFonts w:ascii="Calibri" w:hAnsi="Calibri" w:eastAsia="Calibri" w:cs="Calibri"/>
           <w:b w:val="0"/>
           <w:sz w:val="20"/>
         </w:rPr>
@@ -502,7 +502,7 @@
       </w:pPr>
       <w:r>
         <w:rPr>
-          <w:rFonts w:ascii="Times New Roman" w:hAnsi="Times New Roman" w:eastAsia="Times New Roman"/>
+          <w:rFonts w:ascii="Calibri" w:hAnsi="Calibri" w:eastAsia="Calibri" w:cs="Calibri"/>
           <w:b/>
           <w:sz w:val="20"/>
         </w:rPr>
@@ -516,7 +516,7 @@
       </w:pPr>
       <w:r>
         <w:rPr>
-          <w:rFonts w:ascii="Times New Roman" w:hAnsi="Times New Roman" w:eastAsia="Times New Roman"/>
+          <w:rFonts w:ascii="Calibri" w:hAnsi="Calibri" w:eastAsia="Calibri" w:cs="Calibri"/>
           <w:b w:val="0"/>
           <w:sz w:val="20"/>
         </w:rPr>
@@ -530,7 +530,7 @@
       </w:pPr>
       <w:r>
         <w:rPr>
-          <w:rFonts w:ascii="Times New Roman" w:hAnsi="Times New Roman" w:eastAsia="Times New Roman"/>
+          <w:rFonts w:ascii="Calibri" w:hAnsi="Calibri" w:eastAsia="Calibri" w:cs="Calibri"/>
           <w:b w:val="0"/>
           <w:sz w:val="20"/>
           <w:highlight w:val="yellow"/>
@@ -545,7 +545,7 @@
       </w:pPr>
       <w:r>
         <w:rPr>
-          <w:rFonts w:ascii="Times New Roman" w:hAnsi="Times New Roman" w:eastAsia="Times New Roman"/>
+          <w:rFonts w:ascii="Calibri" w:hAnsi="Calibri" w:eastAsia="Calibri" w:cs="Calibri"/>
           <w:b w:val="0"/>
           <w:sz w:val="20"/>
           <w:highlight w:val="yellow"/>
@@ -560,7 +560,7 @@
       </w:pPr>
       <w:r>
         <w:rPr>
-          <w:rFonts w:ascii="Times New Roman" w:hAnsi="Times New Roman" w:eastAsia="Times New Roman"/>
+          <w:rFonts w:ascii="Calibri" w:hAnsi="Calibri" w:eastAsia="Calibri" w:cs="Calibri"/>
           <w:b w:val="0"/>
           <w:sz w:val="20"/>
           <w:highlight w:val="yellow"/>
@@ -575,7 +575,7 @@
       </w:pPr>
       <w:r>
         <w:rPr>
-          <w:rFonts w:ascii="Times New Roman" w:hAnsi="Times New Roman" w:eastAsia="Times New Roman"/>
+          <w:rFonts w:ascii="Calibri" w:hAnsi="Calibri" w:eastAsia="Calibri" w:cs="Calibri"/>
           <w:b w:val="0"/>
           <w:sz w:val="20"/>
           <w:highlight w:val="yellow"/>
@@ -590,7 +590,7 @@
       </w:pPr>
       <w:r>
         <w:rPr>
-          <w:rFonts w:ascii="Times New Roman" w:hAnsi="Times New Roman" w:eastAsia="Times New Roman"/>
+          <w:rFonts w:ascii="Calibri" w:hAnsi="Calibri" w:eastAsia="Calibri" w:cs="Calibri"/>
           <w:b w:val="0"/>
           <w:sz w:val="20"/>
         </w:rPr>
@@ -604,7 +604,7 @@
       </w:pPr>
       <w:r>
         <w:rPr>
-          <w:rFonts w:ascii="Times New Roman" w:hAnsi="Times New Roman" w:eastAsia="Times New Roman"/>
+          <w:rFonts w:ascii="Calibri" w:hAnsi="Calibri" w:eastAsia="Calibri" w:cs="Calibri"/>
           <w:b w:val="0"/>
           <w:sz w:val="20"/>
         </w:rPr>
@@ -618,7 +618,7 @@
       </w:pPr>
       <w:r>
         <w:rPr>
-          <w:rFonts w:ascii="Times New Roman" w:hAnsi="Times New Roman" w:eastAsia="Times New Roman"/>
+          <w:rFonts w:ascii="Calibri" w:hAnsi="Calibri" w:eastAsia="Calibri" w:cs="Calibri"/>
           <w:b/>
           <w:sz w:val="21"/>
         </w:rPr>
@@ -632,7 +632,7 @@
       </w:pPr>
       <w:r>
         <w:rPr>
-          <w:rFonts w:ascii="Times New Roman" w:hAnsi="Times New Roman" w:eastAsia="Times New Roman"/>
+          <w:rFonts w:ascii="Calibri" w:hAnsi="Calibri" w:eastAsia="Calibri" w:cs="Calibri"/>
           <w:b w:val="0"/>
           <w:sz w:val="20"/>
         </w:rPr>
@@ -646,7 +646,7 @@
       </w:pPr>
       <w:r>
         <w:rPr>
-          <w:rFonts w:ascii="Times New Roman" w:hAnsi="Times New Roman" w:eastAsia="Times New Roman"/>
+          <w:rFonts w:ascii="Calibri" w:hAnsi="Calibri" w:eastAsia="Calibri" w:cs="Calibri"/>
           <w:b w:val="0"/>
           <w:sz w:val="20"/>
         </w:rPr>
@@ -660,7 +660,7 @@
       </w:pPr>
       <w:r>
         <w:rPr>
-          <w:rFonts w:ascii="Times New Roman" w:hAnsi="Times New Roman" w:eastAsia="Times New Roman"/>
+          <w:rFonts w:ascii="Calibri" w:hAnsi="Calibri" w:eastAsia="Calibri" w:cs="Calibri"/>
           <w:b w:val="0"/>
           <w:sz w:val="20"/>
         </w:rPr>
@@ -674,7 +674,7 @@
       </w:pPr>
       <w:r>
         <w:rPr>
-          <w:rFonts w:ascii="Times New Roman" w:hAnsi="Times New Roman" w:eastAsia="Times New Roman"/>
+          <w:rFonts w:ascii="Calibri" w:hAnsi="Calibri" w:eastAsia="Calibri" w:cs="Calibri"/>
           <w:b/>
           <w:sz w:val="21"/>
         </w:rPr>
@@ -688,7 +688,7 @@
       </w:pPr>
       <w:r>
         <w:rPr>
-          <w:rFonts w:ascii="Times New Roman" w:hAnsi="Times New Roman" w:eastAsia="Times New Roman"/>
+          <w:rFonts w:ascii="Calibri" w:hAnsi="Calibri" w:eastAsia="Calibri" w:cs="Calibri"/>
           <w:b w:val="0"/>
           <w:sz w:val="20"/>
         </w:rPr>
@@ -702,7 +702,7 @@
       </w:pPr>
       <w:r>
         <w:rPr>
-          <w:rFonts w:ascii="Times New Roman" w:hAnsi="Times New Roman" w:eastAsia="Times New Roman"/>
+          <w:rFonts w:ascii="Calibri" w:hAnsi="Calibri" w:eastAsia="Calibri" w:cs="Calibri"/>
           <w:b w:val="0"/>
           <w:sz w:val="20"/>
         </w:rPr>
@@ -716,7 +716,7 @@
       </w:pPr>
       <w:r>
         <w:rPr>
-          <w:rFonts w:ascii="Times New Roman" w:hAnsi="Times New Roman" w:eastAsia="Times New Roman"/>
+          <w:rFonts w:ascii="Calibri" w:hAnsi="Calibri" w:eastAsia="Calibri" w:cs="Calibri"/>
           <w:b/>
           <w:sz w:val="21"/>
         </w:rPr>
@@ -730,7 +730,7 @@
       </w:pPr>
       <w:r>
         <w:rPr>
-          <w:rFonts w:ascii="Times New Roman" w:hAnsi="Times New Roman" w:eastAsia="Times New Roman"/>
+          <w:rFonts w:ascii="Calibri" w:hAnsi="Calibri" w:eastAsia="Calibri" w:cs="Calibri"/>
           <w:b w:val="0"/>
           <w:sz w:val="20"/>
         </w:rPr>
@@ -744,7 +744,7 @@
       </w:pPr>
       <w:r>
         <w:rPr>
-          <w:rFonts w:ascii="Times New Roman" w:hAnsi="Times New Roman" w:eastAsia="Times New Roman"/>
+          <w:rFonts w:ascii="Calibri" w:hAnsi="Calibri" w:eastAsia="Calibri" w:cs="Calibri"/>
           <w:b w:val="0"/>
           <w:sz w:val="20"/>
         </w:rPr>
@@ -757,6 +757,9 @@
         <w:jc w:val="both"/>
       </w:pPr>
       <w:r>
+        <w:rPr>
+          <w:rFonts w:ascii="Calibri" w:hAnsi="Calibri" w:eastAsia="Calibri" w:cs="Calibri"/>
+        </w:rPr>
         <w:t>6.3. Изменения — только в письменной форме, подписанной обеими Сторонами (включая PDF-сканы подписанных оригиналов).</w:t>
       </w:r>
     </w:p>
@@ -767,7 +770,7 @@
       </w:pPr>
       <w:r>
         <w:rPr>
-          <w:rFonts w:ascii="Times New Roman" w:hAnsi="Times New Roman" w:eastAsia="Times New Roman"/>
+          <w:rFonts w:ascii="Calibri" w:hAnsi="Calibri" w:eastAsia="Calibri" w:cs="Calibri"/>
           <w:b w:val="0"/>
           <w:sz w:val="20"/>
         </w:rPr>
@@ -781,7 +784,7 @@
       </w:pPr>
       <w:r>
         <w:rPr>
-          <w:rFonts w:ascii="Times New Roman" w:hAnsi="Times New Roman" w:eastAsia="Times New Roman"/>
+          <w:rFonts w:ascii="Calibri" w:hAnsi="Calibri" w:eastAsia="Calibri" w:cs="Calibri"/>
           <w:b w:val="0"/>
           <w:sz w:val="20"/>
         </w:rPr>
@@ -794,6 +797,9 @@
         <w:jc w:val="both"/>
       </w:pPr>
       <w:r>
+        <w:rPr>
+          <w:rFonts w:ascii="Calibri" w:hAnsi="Calibri" w:eastAsia="Calibri" w:cs="Calibri"/>
+        </w:rPr>
         <w:t>6.6. Применимое право — Турция. Споры, не урегулированные за 15 рабочих дней, передаются в суды Стамбула (язык — английский, если не согласовано иное).</w:t>
       </w:r>
     </w:p>
@@ -804,7 +810,7 @@
       </w:pPr>
       <w:r>
         <w:rPr>
-          <w:rFonts w:ascii="Times New Roman" w:hAnsi="Times New Roman" w:eastAsia="Times New Roman"/>
+          <w:rFonts w:ascii="Calibri" w:hAnsi="Calibri" w:eastAsia="Calibri" w:cs="Calibri"/>
           <w:b/>
           <w:sz w:val="21"/>
         </w:rPr>
@@ -826,10 +832,14 @@
             <w:tcW w:type="dxa" w:w="5185"/>
           </w:tcPr>
           <w:p>
-            <w:r/>
             <w:r>
               <w:rPr>
-                <w:rFonts w:ascii="Times New Roman" w:hAnsi="Times New Roman" w:eastAsia="Times New Roman"/>
+                <w:rFonts w:ascii="Calibri" w:hAnsi="Calibri" w:eastAsia="Calibri" w:cs="Calibri"/>
+              </w:rPr>
+            </w:r>
+            <w:r>
+              <w:rPr>
+                <w:rFonts w:ascii="Calibri" w:hAnsi="Calibri" w:eastAsia="Calibri" w:cs="Calibri"/>
                 <w:b/>
                 <w:sz w:val="19"/>
               </w:rPr>
@@ -842,7 +852,7 @@
             </w:pPr>
             <w:r>
               <w:rPr>
-                <w:rFonts w:ascii="Times New Roman" w:hAnsi="Times New Roman" w:eastAsia="Times New Roman"/>
+                <w:rFonts w:ascii="Calibri" w:hAnsi="Calibri" w:eastAsia="Calibri" w:cs="Calibri"/>
                 <w:b w:val="0"/>
                 <w:sz w:val="17"/>
               </w:rPr>
@@ -855,7 +865,7 @@
             </w:pPr>
             <w:r>
               <w:rPr>
-                <w:rFonts w:ascii="Times New Roman" w:hAnsi="Times New Roman" w:eastAsia="Times New Roman"/>
+                <w:rFonts w:ascii="Calibri" w:hAnsi="Calibri" w:eastAsia="Calibri" w:cs="Calibri"/>
                 <w:b w:val="0"/>
                 <w:sz w:val="17"/>
               </w:rPr>
@@ -868,7 +878,7 @@
             </w:pPr>
             <w:r>
               <w:rPr>
-                <w:rFonts w:ascii="Times New Roman" w:hAnsi="Times New Roman" w:eastAsia="Times New Roman"/>
+                <w:rFonts w:ascii="Calibri" w:hAnsi="Calibri" w:eastAsia="Calibri" w:cs="Calibri"/>
                 <w:b w:val="0"/>
                 <w:sz w:val="17"/>
               </w:rPr>
@@ -881,7 +891,7 @@
             </w:pPr>
             <w:r>
               <w:rPr>
-                <w:rFonts w:ascii="Times New Roman" w:hAnsi="Times New Roman" w:eastAsia="Times New Roman"/>
+                <w:rFonts w:ascii="Calibri" w:hAnsi="Calibri" w:eastAsia="Calibri" w:cs="Calibri"/>
                 <w:b w:val="0"/>
                 <w:sz w:val="17"/>
               </w:rPr>
@@ -894,7 +904,7 @@
             </w:pPr>
             <w:r>
               <w:rPr>
-                <w:rFonts w:ascii="Times New Roman" w:hAnsi="Times New Roman" w:eastAsia="Times New Roman"/>
+                <w:rFonts w:ascii="Calibri" w:hAnsi="Calibri" w:eastAsia="Calibri" w:cs="Calibri"/>
                 <w:b w:val="0"/>
                 <w:sz w:val="17"/>
               </w:rPr>
@@ -907,7 +917,7 @@
             </w:pPr>
             <w:r>
               <w:rPr>
-                <w:rFonts w:ascii="Times New Roman" w:hAnsi="Times New Roman" w:eastAsia="Times New Roman"/>
+                <w:rFonts w:ascii="Calibri" w:hAnsi="Calibri" w:eastAsia="Calibri" w:cs="Calibri"/>
                 <w:b w:val="0"/>
                 <w:sz w:val="17"/>
               </w:rPr>
@@ -920,7 +930,7 @@
             </w:pPr>
             <w:r>
               <w:rPr>
-                <w:rFonts w:ascii="Times New Roman" w:hAnsi="Times New Roman" w:eastAsia="Times New Roman"/>
+                <w:rFonts w:ascii="Calibri" w:hAnsi="Calibri" w:eastAsia="Calibri" w:cs="Calibri"/>
                 <w:b w:val="0"/>
                 <w:sz w:val="17"/>
               </w:rPr>
@@ -933,10 +943,14 @@
             <w:tcW w:type="dxa" w:w="5185"/>
           </w:tcPr>
           <w:p>
-            <w:r/>
             <w:r>
               <w:rPr>
-                <w:rFonts w:ascii="Times New Roman" w:hAnsi="Times New Roman" w:eastAsia="Times New Roman"/>
+                <w:rFonts w:ascii="Calibri" w:hAnsi="Calibri" w:eastAsia="Calibri" w:cs="Calibri"/>
+              </w:rPr>
+            </w:r>
+            <w:r>
+              <w:rPr>
+                <w:rFonts w:ascii="Calibri" w:hAnsi="Calibri" w:eastAsia="Calibri" w:cs="Calibri"/>
                 <w:b/>
                 <w:sz w:val="19"/>
               </w:rPr>
@@ -949,7 +963,7 @@
             </w:pPr>
             <w:r>
               <w:rPr>
-                <w:rFonts w:ascii="Times New Roman" w:hAnsi="Times New Roman" w:eastAsia="Times New Roman"/>
+                <w:rFonts w:ascii="Calibri" w:hAnsi="Calibri" w:eastAsia="Calibri" w:cs="Calibri"/>
                 <w:b w:val="0"/>
                 <w:sz w:val="17"/>
               </w:rPr>
@@ -957,7 +971,7 @@
             </w:r>
             <w:r>
               <w:rPr>
-                <w:rFonts w:ascii="Times New Roman" w:hAnsi="Times New Roman" w:eastAsia="Times New Roman"/>
+                <w:rFonts w:ascii="Calibri" w:hAnsi="Calibri" w:eastAsia="Calibri" w:cs="Calibri"/>
                 <w:b w:val="0"/>
                 <w:sz w:val="17"/>
                 <w:highlight w:val="yellow"/>
@@ -971,7 +985,7 @@
             </w:pPr>
             <w:r>
               <w:rPr>
-                <w:rFonts w:ascii="Times New Roman" w:hAnsi="Times New Roman" w:eastAsia="Times New Roman"/>
+                <w:rFonts w:ascii="Calibri" w:hAnsi="Calibri" w:eastAsia="Calibri" w:cs="Calibri"/>
                 <w:b w:val="0"/>
                 <w:sz w:val="17"/>
               </w:rPr>
@@ -979,7 +993,7 @@
             </w:r>
             <w:r>
               <w:rPr>
-                <w:rFonts w:ascii="Times New Roman" w:hAnsi="Times New Roman" w:eastAsia="Times New Roman"/>
+                <w:rFonts w:ascii="Calibri" w:hAnsi="Calibri" w:eastAsia="Calibri" w:cs="Calibri"/>
                 <w:b w:val="0"/>
                 <w:sz w:val="17"/>
                 <w:highlight w:val="yellow"/>
@@ -993,7 +1007,7 @@
             </w:pPr>
             <w:r>
               <w:rPr>
-                <w:rFonts w:ascii="Times New Roman" w:hAnsi="Times New Roman" w:eastAsia="Times New Roman"/>
+                <w:rFonts w:ascii="Calibri" w:hAnsi="Calibri" w:eastAsia="Calibri" w:cs="Calibri"/>
                 <w:b w:val="0"/>
                 <w:sz w:val="17"/>
               </w:rPr>
@@ -1001,7 +1015,7 @@
             </w:r>
             <w:r>
               <w:rPr>
-                <w:rFonts w:ascii="Times New Roman" w:hAnsi="Times New Roman" w:eastAsia="Times New Roman"/>
+                <w:rFonts w:ascii="Calibri" w:hAnsi="Calibri" w:eastAsia="Calibri" w:cs="Calibri"/>
                 <w:b w:val="0"/>
                 <w:sz w:val="17"/>
                 <w:highlight w:val="yellow"/>
@@ -1015,7 +1029,7 @@
             </w:pPr>
             <w:r>
               <w:rPr>
-                <w:rFonts w:ascii="Times New Roman" w:hAnsi="Times New Roman" w:eastAsia="Times New Roman"/>
+                <w:rFonts w:ascii="Calibri" w:hAnsi="Calibri" w:eastAsia="Calibri" w:cs="Calibri"/>
                 <w:b w:val="0"/>
                 <w:sz w:val="17"/>
               </w:rPr>
@@ -1023,7 +1037,7 @@
             </w:r>
             <w:r>
               <w:rPr>
-                <w:rFonts w:ascii="Times New Roman" w:hAnsi="Times New Roman" w:eastAsia="Times New Roman"/>
+                <w:rFonts w:ascii="Calibri" w:hAnsi="Calibri" w:eastAsia="Calibri" w:cs="Calibri"/>
                 <w:b w:val="0"/>
                 <w:sz w:val="17"/>
                 <w:highlight w:val="yellow"/>
@@ -1037,7 +1051,7 @@
             </w:pPr>
             <w:r>
               <w:rPr>
-                <w:rFonts w:ascii="Times New Roman" w:hAnsi="Times New Roman" w:eastAsia="Times New Roman"/>
+                <w:rFonts w:ascii="Calibri" w:hAnsi="Calibri" w:eastAsia="Calibri" w:cs="Calibri"/>
                 <w:b w:val="0"/>
                 <w:sz w:val="17"/>
               </w:rPr>
@@ -1045,7 +1059,7 @@
             </w:r>
             <w:r>
               <w:rPr>
-                <w:rFonts w:ascii="Times New Roman" w:hAnsi="Times New Roman" w:eastAsia="Times New Roman"/>
+                <w:rFonts w:ascii="Calibri" w:hAnsi="Calibri" w:eastAsia="Calibri" w:cs="Calibri"/>
                 <w:b w:val="0"/>
                 <w:sz w:val="17"/>
                 <w:highlight w:val="yellow"/>
@@ -1054,7 +1068,7 @@
             </w:r>
             <w:r>
               <w:rPr>
-                <w:rFonts w:ascii="Times New Roman" w:hAnsi="Times New Roman" w:eastAsia="Times New Roman"/>
+                <w:rFonts w:ascii="Calibri" w:hAnsi="Calibri" w:eastAsia="Calibri" w:cs="Calibri"/>
                 <w:b w:val="0"/>
                 <w:sz w:val="17"/>
               </w:rPr>
@@ -1062,7 +1076,7 @@
             </w:r>
             <w:r>
               <w:rPr>
-                <w:rFonts w:ascii="Times New Roman" w:hAnsi="Times New Roman" w:eastAsia="Times New Roman"/>
+                <w:rFonts w:ascii="Calibri" w:hAnsi="Calibri" w:eastAsia="Calibri" w:cs="Calibri"/>
                 <w:b w:val="0"/>
                 <w:sz w:val="17"/>
                 <w:highlight w:val="yellow"/>
@@ -1078,10 +1092,14 @@
             <w:tcW w:type="dxa" w:w="5185"/>
           </w:tcPr>
           <w:p>
-            <w:r/>
             <w:r>
               <w:rPr>
-                <w:rFonts w:ascii="Times New Roman" w:hAnsi="Times New Roman" w:eastAsia="Times New Roman"/>
+                <w:rFonts w:ascii="Calibri" w:hAnsi="Calibri" w:eastAsia="Calibri" w:cs="Calibri"/>
+              </w:rPr>
+            </w:r>
+            <w:r>
+              <w:rPr>
+                <w:rFonts w:ascii="Calibri" w:hAnsi="Calibri" w:eastAsia="Calibri" w:cs="Calibri"/>
                 <w:b/>
                 <w:sz w:val="19"/>
               </w:rPr>
@@ -1093,7 +1111,7 @@
             </w:pPr>
             <w:r>
               <w:rPr>
-                <w:rFonts w:ascii="Times New Roman" w:hAnsi="Times New Roman" w:eastAsia="Times New Roman"/>
+                <w:rFonts w:ascii="Calibri" w:hAnsi="Calibri" w:eastAsia="Calibri" w:cs="Calibri"/>
                 <w:b w:val="0"/>
                 <w:sz w:val="17"/>
               </w:rPr>
@@ -1105,7 +1123,7 @@
             </w:pPr>
             <w:r>
               <w:rPr>
-                <w:rFonts w:ascii="Times New Roman" w:hAnsi="Times New Roman" w:eastAsia="Times New Roman"/>
+                <w:rFonts w:ascii="Calibri" w:hAnsi="Calibri" w:eastAsia="Calibri" w:cs="Calibri"/>
                 <w:b w:val="0"/>
                 <w:sz w:val="17"/>
                 <w:highlight w:val="yellow"/>
@@ -1114,7 +1132,7 @@
             </w:r>
             <w:r>
               <w:rPr>
-                <w:rFonts w:ascii="Times New Roman" w:hAnsi="Times New Roman" w:eastAsia="Times New Roman"/>
+                <w:rFonts w:ascii="Calibri" w:hAnsi="Calibri" w:eastAsia="Calibri" w:cs="Calibri"/>
                 <w:b w:val="0"/>
                 <w:sz w:val="17"/>
               </w:rPr>
@@ -1127,7 +1145,7 @@
             </w:pPr>
             <w:r>
               <w:rPr>
-                <w:rFonts w:ascii="Times New Roman" w:hAnsi="Times New Roman" w:eastAsia="Times New Roman"/>
+                <w:rFonts w:ascii="Calibri" w:hAnsi="Calibri" w:eastAsia="Calibri" w:cs="Calibri"/>
                 <w:b w:val="0"/>
                 <w:sz w:val="17"/>
               </w:rPr>
@@ -1140,7 +1158,7 @@
             </w:pPr>
             <w:r>
               <w:rPr>
-                <w:rFonts w:ascii="Times New Roman" w:hAnsi="Times New Roman" w:eastAsia="Times New Roman"/>
+                <w:rFonts w:ascii="Calibri" w:hAnsi="Calibri" w:eastAsia="Calibri" w:cs="Calibri"/>
                 <w:b w:val="0"/>
                 <w:sz w:val="17"/>
               </w:rPr>
@@ -1153,10 +1171,14 @@
             <w:tcW w:type="dxa" w:w="5185"/>
           </w:tcPr>
           <w:p>
-            <w:r/>
             <w:r>
               <w:rPr>
-                <w:rFonts w:ascii="Times New Roman" w:hAnsi="Times New Roman" w:eastAsia="Times New Roman"/>
+                <w:rFonts w:ascii="Calibri" w:hAnsi="Calibri" w:eastAsia="Calibri" w:cs="Calibri"/>
+              </w:rPr>
+            </w:r>
+            <w:r>
+              <w:rPr>
+                <w:rFonts w:ascii="Calibri" w:hAnsi="Calibri" w:eastAsia="Calibri" w:cs="Calibri"/>
                 <w:b/>
                 <w:sz w:val="19"/>
               </w:rPr>
@@ -1168,7 +1190,7 @@
             </w:pPr>
             <w:r>
               <w:rPr>
-                <w:rFonts w:ascii="Times New Roman" w:hAnsi="Times New Roman" w:eastAsia="Times New Roman"/>
+                <w:rFonts w:ascii="Calibri" w:hAnsi="Calibri" w:eastAsia="Calibri" w:cs="Calibri"/>
                 <w:b w:val="0"/>
                 <w:sz w:val="17"/>
               </w:rPr>
@@ -1180,7 +1202,7 @@
             </w:pPr>
             <w:r>
               <w:rPr>
-                <w:rFonts w:ascii="Times New Roman" w:hAnsi="Times New Roman" w:eastAsia="Times New Roman"/>
+                <w:rFonts w:ascii="Calibri" w:hAnsi="Calibri" w:eastAsia="Calibri" w:cs="Calibri"/>
                 <w:b w:val="0"/>
                 <w:sz w:val="17"/>
                 <w:highlight w:val="yellow"/>
@@ -1189,7 +1211,7 @@
             </w:r>
             <w:r>
               <w:rPr>
-                <w:rFonts w:ascii="Times New Roman" w:hAnsi="Times New Roman" w:eastAsia="Times New Roman"/>
+                <w:rFonts w:ascii="Calibri" w:hAnsi="Calibri" w:eastAsia="Calibri" w:cs="Calibri"/>
                 <w:b w:val="0"/>
                 <w:sz w:val="17"/>
               </w:rPr>
@@ -1197,7 +1219,7 @@
             </w:r>
             <w:r>
               <w:rPr>
-                <w:rFonts w:ascii="Times New Roman" w:hAnsi="Times New Roman" w:eastAsia="Times New Roman"/>
+                <w:rFonts w:ascii="Calibri" w:hAnsi="Calibri" w:eastAsia="Calibri" w:cs="Calibri"/>
                 <w:b w:val="0"/>
                 <w:sz w:val="17"/>
                 <w:highlight w:val="yellow"/>
@@ -1206,7 +1228,7 @@
             </w:r>
             <w:r>
               <w:rPr>
-                <w:rFonts w:ascii="Times New Roman" w:hAnsi="Times New Roman" w:eastAsia="Times New Roman"/>
+                <w:rFonts w:ascii="Calibri" w:hAnsi="Calibri" w:eastAsia="Calibri" w:cs="Calibri"/>
                 <w:b w:val="0"/>
                 <w:sz w:val="17"/>
               </w:rPr>
@@ -1219,7 +1241,7 @@
             </w:pPr>
             <w:r>
               <w:rPr>
-                <w:rFonts w:ascii="Times New Roman" w:hAnsi="Times New Roman" w:eastAsia="Times New Roman"/>
+                <w:rFonts w:ascii="Calibri" w:hAnsi="Calibri" w:eastAsia="Calibri" w:cs="Calibri"/>
                 <w:b w:val="0"/>
                 <w:sz w:val="17"/>
               </w:rPr>
@@ -1227,7 +1249,7 @@
             </w:r>
             <w:r>
               <w:rPr>
-                <w:rFonts w:ascii="Times New Roman" w:hAnsi="Times New Roman" w:eastAsia="Times New Roman"/>
+                <w:rFonts w:ascii="Calibri" w:hAnsi="Calibri" w:eastAsia="Calibri" w:cs="Calibri"/>
                 <w:b w:val="0"/>
                 <w:sz w:val="17"/>
                 <w:highlight w:val="yellow"/>
@@ -1241,7 +1263,7 @@
             </w:pPr>
             <w:r>
               <w:rPr>
-                <w:rFonts w:ascii="Times New Roman" w:hAnsi="Times New Roman" w:eastAsia="Times New Roman"/>
+                <w:rFonts w:ascii="Calibri" w:hAnsi="Calibri" w:eastAsia="Calibri" w:cs="Calibri"/>
                 <w:b w:val="0"/>
                 <w:sz w:val="17"/>
               </w:rPr>
@@ -1258,7 +1280,7 @@
       </w:pPr>
       <w:r>
         <w:rPr>
-          <w:rFonts w:ascii="Times New Roman" w:hAnsi="Times New Roman" w:eastAsia="Times New Roman"/>
+          <w:rFonts w:ascii="Calibri" w:hAnsi="Calibri" w:eastAsia="Calibri" w:cs="Calibri"/>
           <w:b w:val="0"/>
           <w:sz w:val="16"/>
         </w:rPr>
@@ -1286,7 +1308,7 @@
     </w:pPr>
     <w:r>
       <w:rPr>
-        <w:rFonts w:ascii="Times New Roman" w:hAnsi="Times New Roman" w:eastAsia="Times New Roman"/>
+        <w:rFonts w:ascii="Calibri" w:hAnsi="Calibri" w:eastAsia="Calibri" w:cs="Calibri"/>
         <w:b w:val="0"/>
         <w:color w:val="666666"/>
         <w:sz w:val="15"/>
@@ -1305,6 +1327,9 @@
       <w:jc w:val="center"/>
     </w:pPr>
     <w:r>
+      <w:rPr>
+        <w:rFonts w:ascii="Calibri" w:hAnsi="Calibri" w:eastAsia="Calibri" w:cs="Calibri"/>
+      </w:rPr>
       <w:drawing>
         <wp:inline xmlns:a="http://schemas.openxmlformats.org/drawingml/2006/main" xmlns:pic="http://schemas.openxmlformats.org/drawingml/2006/picture">
           <wp:extent cx="3600000" cy="614173"/>
@@ -1705,6 +1730,9 @@
     <w:name w:val="Normal"/>
     <w:qFormat/>
     <w:rsid w:val="00FC693F"/>
+    <w:rPr>
+      <w:rFonts w:ascii="Calibri" w:hAnsi="Calibri" w:eastAsia="Calibri"/>
+    </w:rPr>
   </w:style>
   <w:style w:type="paragraph" w:styleId="Header">
     <w:name w:val="header"/>

</xml_diff>

<commit_message>
Patch theme and font table to Calibri in agreement DOCX
Co-authored-by: alexanderp-cell <alexanderp-cell@users.noreply.github.com>
</commit_message>
<xml_diff>
--- a/agreements/Dogovor_JT-BSI-2026_RU.docx
+++ b/agreements/Dogovor_JT-BSI-2026_RU.docx
@@ -25253,8 +25253,8 @@
         <ns0:font script="Hang" typeface="맑은 고딕"/>
         <ns0:font script="Hans" typeface="宋体"/>
         <ns0:font script="Hant" typeface="新細明體"/>
-        <ns0:font script="Arab" typeface="Times New Roman"/>
-        <ns0:font script="Hebr" typeface="Times New Roman"/>
+        <ns0:font script="Arab" typeface="Calibri"/>
+        <ns0:font script="Hebr" typeface="Calibri"/>
         <ns0:font script="Thai" typeface="Angsana New"/>
         <ns0:font script="Ethi" typeface="Nyala"/>
         <ns0:font script="Beng" typeface="Vrinda"/>
@@ -25276,7 +25276,7 @@
         <ns0:font script="Laoo" typeface="DokChampa"/>
         <ns0:font script="Sinh" typeface="Iskoola Pota"/>
         <ns0:font script="Mong" typeface="Mongolian Baiti"/>
-        <ns0:font script="Viet" typeface="Times New Roman"/>
+        <ns0:font script="Viet" typeface="Calibri"/>
         <ns0:font script="Uigh" typeface="Microsoft Uighur"/>
         <ns0:font script="Geor" typeface="Sylfaen"/>
       </ns0:majorFont>

</xml_diff>

<commit_message>
Remove theme font references from agreement DOCX defaults
Co-authored-by: alexanderp-cell <alexanderp-cell@users.noreply.github.com>
</commit_message>
<xml_diff>
--- a/agreements/Dogovor_JT-BSI-2026_RU.docx
+++ b/agreements/Dogovor_JT-BSI-2026_RU.docx
@@ -1556,7 +1556,7 @@
   <ns0:docDefaults>
     <ns0:rPrDefault>
       <ns0:rPr>
-        <ns0:rFonts ns0:cstheme="minorBidi" ns0:ascii="Calibri" ns0:hAnsi="Calibri" ns0:cs="Calibri" ns0:eastAsia="Calibri"/>
+        <ns0:rFonts ns0:ascii="Calibri" ns0:hAnsi="Calibri" ns0:cs="Calibri" ns0:eastAsia="Calibri"/>
         <ns0:sz ns0:val="22"/>
         <ns0:szCs ns0:val="22"/>
         <ns0:lang ns0:val="en-US" ns0:eastAsia="en-US" ns0:bidi="ar-SA"/>
@@ -1775,7 +1775,7 @@
       <ns0:outlineLvl ns0:val="0"/>
     </ns0:pPr>
     <ns0:rPr>
-      <ns0:rFonts ns0:cstheme="majorBidi" ns0:ascii="Calibri" ns0:hAnsi="Calibri" ns0:cs="Calibri" ns0:eastAsia="Calibri"/>
+      <ns0:rFonts ns0:ascii="Calibri" ns0:hAnsi="Calibri" ns0:cs="Calibri" ns0:eastAsia="Calibri"/>
       <ns0:b/>
       <ns0:bCs/>
       <ns0:color ns0:val="365F91" ns0:themeColor="accent1" ns0:themeShade="BF"/>
@@ -1799,7 +1799,7 @@
       <ns0:outlineLvl ns0:val="1"/>
     </ns0:pPr>
     <ns0:rPr>
-      <ns0:rFonts ns0:cstheme="majorBidi" ns0:ascii="Calibri" ns0:hAnsi="Calibri" ns0:cs="Calibri" ns0:eastAsia="Calibri"/>
+      <ns0:rFonts ns0:ascii="Calibri" ns0:hAnsi="Calibri" ns0:cs="Calibri" ns0:eastAsia="Calibri"/>
       <ns0:b/>
       <ns0:bCs/>
       <ns0:color ns0:val="4F81BD" ns0:themeColor="accent1"/>
@@ -1823,7 +1823,7 @@
       <ns0:outlineLvl ns0:val="2"/>
     </ns0:pPr>
     <ns0:rPr>
-      <ns0:rFonts ns0:cstheme="majorBidi" ns0:ascii="Calibri" ns0:hAnsi="Calibri" ns0:cs="Calibri" ns0:eastAsia="Calibri"/>
+      <ns0:rFonts ns0:ascii="Calibri" ns0:hAnsi="Calibri" ns0:cs="Calibri" ns0:eastAsia="Calibri"/>
       <ns0:b/>
       <ns0:bCs/>
       <ns0:color ns0:val="4F81BD" ns0:themeColor="accent1"/>
@@ -1846,7 +1846,7 @@
       <ns0:outlineLvl ns0:val="3"/>
     </ns0:pPr>
     <ns0:rPr>
-      <ns0:rFonts ns0:cstheme="majorBidi" ns0:ascii="Calibri" ns0:hAnsi="Calibri" ns0:cs="Calibri" ns0:eastAsia="Calibri"/>
+      <ns0:rFonts ns0:ascii="Calibri" ns0:hAnsi="Calibri" ns0:cs="Calibri" ns0:eastAsia="Calibri"/>
       <ns0:b/>
       <ns0:bCs/>
       <ns0:i/>
@@ -1871,7 +1871,7 @@
       <ns0:outlineLvl ns0:val="4"/>
     </ns0:pPr>
     <ns0:rPr>
-      <ns0:rFonts ns0:cstheme="majorBidi" ns0:ascii="Calibri" ns0:hAnsi="Calibri" ns0:cs="Calibri" ns0:eastAsia="Calibri"/>
+      <ns0:rFonts ns0:ascii="Calibri" ns0:hAnsi="Calibri" ns0:cs="Calibri" ns0:eastAsia="Calibri"/>
       <ns0:color ns0:val="243F60" ns0:themeColor="accent1" ns0:themeShade="7F"/>
     </ns0:rPr>
   </ns0:style>
@@ -1892,7 +1892,7 @@
       <ns0:outlineLvl ns0:val="5"/>
     </ns0:pPr>
     <ns0:rPr>
-      <ns0:rFonts ns0:cstheme="majorBidi" ns0:ascii="Calibri" ns0:hAnsi="Calibri" ns0:cs="Calibri" ns0:eastAsia="Calibri"/>
+      <ns0:rFonts ns0:ascii="Calibri" ns0:hAnsi="Calibri" ns0:cs="Calibri" ns0:eastAsia="Calibri"/>
       <ns0:i/>
       <ns0:iCs/>
       <ns0:color ns0:val="243F60" ns0:themeColor="accent1" ns0:themeShade="7F"/>
@@ -1915,7 +1915,7 @@
       <ns0:outlineLvl ns0:val="6"/>
     </ns0:pPr>
     <ns0:rPr>
-      <ns0:rFonts ns0:cstheme="majorBidi" ns0:ascii="Calibri" ns0:hAnsi="Calibri" ns0:cs="Calibri" ns0:eastAsia="Calibri"/>
+      <ns0:rFonts ns0:ascii="Calibri" ns0:hAnsi="Calibri" ns0:cs="Calibri" ns0:eastAsia="Calibri"/>
       <ns0:i/>
       <ns0:iCs/>
       <ns0:color ns0:val="404040" ns0:themeColor="text1" ns0:themeTint="BF"/>
@@ -1938,7 +1938,7 @@
       <ns0:outlineLvl ns0:val="7"/>
     </ns0:pPr>
     <ns0:rPr>
-      <ns0:rFonts ns0:cstheme="majorBidi" ns0:ascii="Calibri" ns0:hAnsi="Calibri" ns0:cs="Calibri" ns0:eastAsia="Calibri"/>
+      <ns0:rFonts ns0:ascii="Calibri" ns0:hAnsi="Calibri" ns0:cs="Calibri" ns0:eastAsia="Calibri"/>
       <ns0:color ns0:val="4F81BD" ns0:themeColor="accent1"/>
       <ns0:sz ns0:val="20"/>
       <ns0:szCs ns0:val="20"/>
@@ -1961,7 +1961,7 @@
       <ns0:outlineLvl ns0:val="8"/>
     </ns0:pPr>
     <ns0:rPr>
-      <ns0:rFonts ns0:cstheme="majorBidi" ns0:ascii="Calibri" ns0:hAnsi="Calibri" ns0:cs="Calibri" ns0:eastAsia="Calibri"/>
+      <ns0:rFonts ns0:ascii="Calibri" ns0:hAnsi="Calibri" ns0:cs="Calibri" ns0:eastAsia="Calibri"/>
       <ns0:i/>
       <ns0:iCs/>
       <ns0:color ns0:val="404040" ns0:themeColor="text1" ns0:themeTint="BF"/>
@@ -2012,7 +2012,7 @@
     <ns0:uiPriority ns0:val="9"/>
     <ns0:rsid ns0:val="00FC693F"/>
     <ns0:rPr>
-      <ns0:rFonts ns0:cstheme="majorBidi" ns0:ascii="Calibri" ns0:hAnsi="Calibri" ns0:cs="Calibri" ns0:eastAsia="Calibri"/>
+      <ns0:rFonts ns0:ascii="Calibri" ns0:hAnsi="Calibri" ns0:cs="Calibri" ns0:eastAsia="Calibri"/>
       <ns0:b/>
       <ns0:bCs/>
       <ns0:color ns0:val="365F91" ns0:themeColor="accent1" ns0:themeShade="BF"/>
@@ -2027,7 +2027,7 @@
     <ns0:uiPriority ns0:val="9"/>
     <ns0:rsid ns0:val="00FC693F"/>
     <ns0:rPr>
-      <ns0:rFonts ns0:cstheme="majorBidi" ns0:ascii="Calibri" ns0:hAnsi="Calibri" ns0:cs="Calibri" ns0:eastAsia="Calibri"/>
+      <ns0:rFonts ns0:ascii="Calibri" ns0:hAnsi="Calibri" ns0:cs="Calibri" ns0:eastAsia="Calibri"/>
       <ns0:b/>
       <ns0:bCs/>
       <ns0:color ns0:val="4F81BD" ns0:themeColor="accent1"/>
@@ -2042,7 +2042,7 @@
     <ns0:uiPriority ns0:val="9"/>
     <ns0:rsid ns0:val="00FC693F"/>
     <ns0:rPr>
-      <ns0:rFonts ns0:cstheme="majorBidi" ns0:ascii="Calibri" ns0:hAnsi="Calibri" ns0:cs="Calibri" ns0:eastAsia="Calibri"/>
+      <ns0:rFonts ns0:ascii="Calibri" ns0:hAnsi="Calibri" ns0:cs="Calibri" ns0:eastAsia="Calibri"/>
       <ns0:b/>
       <ns0:bCs/>
       <ns0:color ns0:val="4F81BD" ns0:themeColor="accent1"/>
@@ -2064,7 +2064,7 @@
       <ns0:contextualSpacing/>
     </ns0:pPr>
     <ns0:rPr>
-      <ns0:rFonts ns0:cstheme="majorBidi" ns0:ascii="Calibri" ns0:hAnsi="Calibri" ns0:cs="Calibri" ns0:eastAsia="Calibri"/>
+      <ns0:rFonts ns0:ascii="Calibri" ns0:hAnsi="Calibri" ns0:cs="Calibri" ns0:eastAsia="Calibri"/>
       <ns0:color ns0:val="17365D" ns0:themeColor="text2" ns0:themeShade="BF"/>
       <ns0:spacing ns0:val="5"/>
       <ns0:kern ns0:val="28"/>
@@ -2079,7 +2079,7 @@
     <ns0:uiPriority ns0:val="10"/>
     <ns0:rsid ns0:val="00FC693F"/>
     <ns0:rPr>
-      <ns0:rFonts ns0:cstheme="majorBidi" ns0:ascii="Calibri" ns0:hAnsi="Calibri" ns0:cs="Calibri" ns0:eastAsia="Calibri"/>
+      <ns0:rFonts ns0:ascii="Calibri" ns0:hAnsi="Calibri" ns0:cs="Calibri" ns0:eastAsia="Calibri"/>
       <ns0:color ns0:val="17365D" ns0:themeColor="text2" ns0:themeShade="BF"/>
       <ns0:spacing ns0:val="5"/>
       <ns0:kern ns0:val="28"/>
@@ -2101,7 +2101,7 @@
       </ns0:numPr>
     </ns0:pPr>
     <ns0:rPr>
-      <ns0:rFonts ns0:cstheme="majorBidi" ns0:ascii="Calibri" ns0:hAnsi="Calibri" ns0:cs="Calibri" ns0:eastAsia="Calibri"/>
+      <ns0:rFonts ns0:ascii="Calibri" ns0:hAnsi="Calibri" ns0:cs="Calibri" ns0:eastAsia="Calibri"/>
       <ns0:i/>
       <ns0:iCs/>
       <ns0:color ns0:val="4F81BD" ns0:themeColor="accent1"/>
@@ -2117,7 +2117,7 @@
     <ns0:uiPriority ns0:val="11"/>
     <ns0:rsid ns0:val="00FC693F"/>
     <ns0:rPr>
-      <ns0:rFonts ns0:cstheme="majorBidi" ns0:ascii="Calibri" ns0:hAnsi="Calibri" ns0:cs="Calibri" ns0:eastAsia="Calibri"/>
+      <ns0:rFonts ns0:ascii="Calibri" ns0:hAnsi="Calibri" ns0:cs="Calibri" ns0:eastAsia="Calibri"/>
       <ns0:i/>
       <ns0:iCs/>
       <ns0:color ns0:val="4F81BD" ns0:themeColor="accent1"/>
@@ -2415,7 +2415,7 @@
     <ns0:semiHidden/>
     <ns0:rsid ns0:val="00FC693F"/>
     <ns0:rPr>
-      <ns0:rFonts ns0:cstheme="majorBidi" ns0:ascii="Calibri" ns0:hAnsi="Calibri" ns0:cs="Calibri" ns0:eastAsia="Calibri"/>
+      <ns0:rFonts ns0:ascii="Calibri" ns0:hAnsi="Calibri" ns0:cs="Calibri" ns0:eastAsia="Calibri"/>
       <ns0:b/>
       <ns0:bCs/>
       <ns0:i/>
@@ -2431,7 +2431,7 @@
     <ns0:semiHidden/>
     <ns0:rsid ns0:val="00FC693F"/>
     <ns0:rPr>
-      <ns0:rFonts ns0:cstheme="majorBidi" ns0:ascii="Calibri" ns0:hAnsi="Calibri" ns0:cs="Calibri" ns0:eastAsia="Calibri"/>
+      <ns0:rFonts ns0:ascii="Calibri" ns0:hAnsi="Calibri" ns0:cs="Calibri" ns0:eastAsia="Calibri"/>
       <ns0:color ns0:val="243F60" ns0:themeColor="accent1" ns0:themeShade="7F"/>
     </ns0:rPr>
   </ns0:style>
@@ -2443,7 +2443,7 @@
     <ns0:semiHidden/>
     <ns0:rsid ns0:val="00FC693F"/>
     <ns0:rPr>
-      <ns0:rFonts ns0:cstheme="majorBidi" ns0:ascii="Calibri" ns0:hAnsi="Calibri" ns0:cs="Calibri" ns0:eastAsia="Calibri"/>
+      <ns0:rFonts ns0:ascii="Calibri" ns0:hAnsi="Calibri" ns0:cs="Calibri" ns0:eastAsia="Calibri"/>
       <ns0:i/>
       <ns0:iCs/>
       <ns0:color ns0:val="243F60" ns0:themeColor="accent1" ns0:themeShade="7F"/>
@@ -2457,7 +2457,7 @@
     <ns0:semiHidden/>
     <ns0:rsid ns0:val="00FC693F"/>
     <ns0:rPr>
-      <ns0:rFonts ns0:cstheme="majorBidi" ns0:ascii="Calibri" ns0:hAnsi="Calibri" ns0:cs="Calibri" ns0:eastAsia="Calibri"/>
+      <ns0:rFonts ns0:ascii="Calibri" ns0:hAnsi="Calibri" ns0:cs="Calibri" ns0:eastAsia="Calibri"/>
       <ns0:i/>
       <ns0:iCs/>
       <ns0:color ns0:val="404040" ns0:themeColor="text1" ns0:themeTint="BF"/>
@@ -2471,7 +2471,7 @@
     <ns0:semiHidden/>
     <ns0:rsid ns0:val="00FC693F"/>
     <ns0:rPr>
-      <ns0:rFonts ns0:cstheme="majorBidi" ns0:ascii="Calibri" ns0:hAnsi="Calibri" ns0:cs="Calibri" ns0:eastAsia="Calibri"/>
+      <ns0:rFonts ns0:ascii="Calibri" ns0:hAnsi="Calibri" ns0:cs="Calibri" ns0:eastAsia="Calibri"/>
       <ns0:color ns0:val="4F81BD" ns0:themeColor="accent1"/>
       <ns0:sz ns0:val="20"/>
       <ns0:szCs ns0:val="20"/>
@@ -2485,7 +2485,7 @@
     <ns0:semiHidden/>
     <ns0:rsid ns0:val="00FC693F"/>
     <ns0:rPr>
-      <ns0:rFonts ns0:cstheme="majorBidi" ns0:ascii="Calibri" ns0:hAnsi="Calibri" ns0:cs="Calibri" ns0:eastAsia="Calibri"/>
+      <ns0:rFonts ns0:ascii="Calibri" ns0:hAnsi="Calibri" ns0:cs="Calibri" ns0:eastAsia="Calibri"/>
       <ns0:i/>
       <ns0:iCs/>
       <ns0:color ns0:val="404040" ns0:themeColor="text1" ns0:themeTint="BF"/>
@@ -4074,7 +4074,7 @@
         <ns0:spacing ns0:before="0" ns0:after="0" ns0:line="240" ns0:lineRule="auto"/>
       </ns0:pPr>
       <ns0:rPr>
-        <ns0:rFonts ns0:cstheme="majorBidi" ns0:ascii="Calibri" ns0:hAnsi="Calibri" ns0:cs="Calibri" ns0:eastAsia="Calibri"/>
+        <ns0:rFonts ns0:ascii="Calibri" ns0:hAnsi="Calibri" ns0:cs="Calibri" ns0:eastAsia="Calibri"/>
         <ns0:b/>
         <ns0:bCs/>
       </ns0:rPr>
@@ -4095,7 +4095,7 @@
         <ns0:spacing ns0:before="0" ns0:after="0" ns0:line="240" ns0:lineRule="auto"/>
       </ns0:pPr>
       <ns0:rPr>
-        <ns0:rFonts ns0:cstheme="majorBidi" ns0:ascii="Calibri" ns0:hAnsi="Calibri" ns0:cs="Calibri" ns0:eastAsia="Calibri"/>
+        <ns0:rFonts ns0:ascii="Calibri" ns0:hAnsi="Calibri" ns0:cs="Calibri" ns0:eastAsia="Calibri"/>
         <ns0:b/>
         <ns0:bCs/>
       </ns0:rPr>
@@ -4113,14 +4113,14 @@
     </ns0:tblStylePr>
     <ns0:tblStylePr ns0:type="firstCol">
       <ns0:rPr>
-        <ns0:rFonts ns0:cstheme="majorBidi" ns0:ascii="Calibri" ns0:hAnsi="Calibri" ns0:cs="Calibri" ns0:eastAsia="Calibri"/>
+        <ns0:rFonts ns0:ascii="Calibri" ns0:hAnsi="Calibri" ns0:cs="Calibri" ns0:eastAsia="Calibri"/>
         <ns0:b/>
         <ns0:bCs/>
       </ns0:rPr>
     </ns0:tblStylePr>
     <ns0:tblStylePr ns0:type="lastCol">
       <ns0:rPr>
-        <ns0:rFonts ns0:cstheme="majorBidi" ns0:ascii="Calibri" ns0:hAnsi="Calibri" ns0:cs="Calibri" ns0:eastAsia="Calibri"/>
+        <ns0:rFonts ns0:ascii="Calibri" ns0:hAnsi="Calibri" ns0:cs="Calibri" ns0:eastAsia="Calibri"/>
         <ns0:b/>
         <ns0:bCs/>
       </ns0:rPr>
@@ -4204,7 +4204,7 @@
         <ns0:spacing ns0:before="0" ns0:after="0" ns0:line="240" ns0:lineRule="auto"/>
       </ns0:pPr>
       <ns0:rPr>
-        <ns0:rFonts ns0:cstheme="majorBidi" ns0:ascii="Calibri" ns0:hAnsi="Calibri" ns0:cs="Calibri" ns0:eastAsia="Calibri"/>
+        <ns0:rFonts ns0:ascii="Calibri" ns0:hAnsi="Calibri" ns0:cs="Calibri" ns0:eastAsia="Calibri"/>
         <ns0:b/>
         <ns0:bCs/>
       </ns0:rPr>
@@ -4225,7 +4225,7 @@
         <ns0:spacing ns0:before="0" ns0:after="0" ns0:line="240" ns0:lineRule="auto"/>
       </ns0:pPr>
       <ns0:rPr>
-        <ns0:rFonts ns0:cstheme="majorBidi" ns0:ascii="Calibri" ns0:hAnsi="Calibri" ns0:cs="Calibri" ns0:eastAsia="Calibri"/>
+        <ns0:rFonts ns0:ascii="Calibri" ns0:hAnsi="Calibri" ns0:cs="Calibri" ns0:eastAsia="Calibri"/>
         <ns0:b/>
         <ns0:bCs/>
       </ns0:rPr>
@@ -4243,14 +4243,14 @@
     </ns0:tblStylePr>
     <ns0:tblStylePr ns0:type="firstCol">
       <ns0:rPr>
-        <ns0:rFonts ns0:cstheme="majorBidi" ns0:ascii="Calibri" ns0:hAnsi="Calibri" ns0:cs="Calibri" ns0:eastAsia="Calibri"/>
+        <ns0:rFonts ns0:ascii="Calibri" ns0:hAnsi="Calibri" ns0:cs="Calibri" ns0:eastAsia="Calibri"/>
         <ns0:b/>
         <ns0:bCs/>
       </ns0:rPr>
     </ns0:tblStylePr>
     <ns0:tblStylePr ns0:type="lastCol">
       <ns0:rPr>
-        <ns0:rFonts ns0:cstheme="majorBidi" ns0:ascii="Calibri" ns0:hAnsi="Calibri" ns0:cs="Calibri" ns0:eastAsia="Calibri"/>
+        <ns0:rFonts ns0:ascii="Calibri" ns0:hAnsi="Calibri" ns0:cs="Calibri" ns0:eastAsia="Calibri"/>
         <ns0:b/>
         <ns0:bCs/>
       </ns0:rPr>
@@ -4334,7 +4334,7 @@
         <ns0:spacing ns0:before="0" ns0:after="0" ns0:line="240" ns0:lineRule="auto"/>
       </ns0:pPr>
       <ns0:rPr>
-        <ns0:rFonts ns0:cstheme="majorBidi" ns0:ascii="Calibri" ns0:hAnsi="Calibri" ns0:cs="Calibri" ns0:eastAsia="Calibri"/>
+        <ns0:rFonts ns0:ascii="Calibri" ns0:hAnsi="Calibri" ns0:cs="Calibri" ns0:eastAsia="Calibri"/>
         <ns0:b/>
         <ns0:bCs/>
       </ns0:rPr>
@@ -4355,7 +4355,7 @@
         <ns0:spacing ns0:before="0" ns0:after="0" ns0:line="240" ns0:lineRule="auto"/>
       </ns0:pPr>
       <ns0:rPr>
-        <ns0:rFonts ns0:cstheme="majorBidi" ns0:ascii="Calibri" ns0:hAnsi="Calibri" ns0:cs="Calibri" ns0:eastAsia="Calibri"/>
+        <ns0:rFonts ns0:ascii="Calibri" ns0:hAnsi="Calibri" ns0:cs="Calibri" ns0:eastAsia="Calibri"/>
         <ns0:b/>
         <ns0:bCs/>
       </ns0:rPr>
@@ -4373,14 +4373,14 @@
     </ns0:tblStylePr>
     <ns0:tblStylePr ns0:type="firstCol">
       <ns0:rPr>
-        <ns0:rFonts ns0:cstheme="majorBidi" ns0:ascii="Calibri" ns0:hAnsi="Calibri" ns0:cs="Calibri" ns0:eastAsia="Calibri"/>
+        <ns0:rFonts ns0:ascii="Calibri" ns0:hAnsi="Calibri" ns0:cs="Calibri" ns0:eastAsia="Calibri"/>
         <ns0:b/>
         <ns0:bCs/>
       </ns0:rPr>
     </ns0:tblStylePr>
     <ns0:tblStylePr ns0:type="lastCol">
       <ns0:rPr>
-        <ns0:rFonts ns0:cstheme="majorBidi" ns0:ascii="Calibri" ns0:hAnsi="Calibri" ns0:cs="Calibri" ns0:eastAsia="Calibri"/>
+        <ns0:rFonts ns0:ascii="Calibri" ns0:hAnsi="Calibri" ns0:cs="Calibri" ns0:eastAsia="Calibri"/>
         <ns0:b/>
         <ns0:bCs/>
       </ns0:rPr>
@@ -4464,7 +4464,7 @@
         <ns0:spacing ns0:before="0" ns0:after="0" ns0:line="240" ns0:lineRule="auto"/>
       </ns0:pPr>
       <ns0:rPr>
-        <ns0:rFonts ns0:cstheme="majorBidi" ns0:ascii="Calibri" ns0:hAnsi="Calibri" ns0:cs="Calibri" ns0:eastAsia="Calibri"/>
+        <ns0:rFonts ns0:ascii="Calibri" ns0:hAnsi="Calibri" ns0:cs="Calibri" ns0:eastAsia="Calibri"/>
         <ns0:b/>
         <ns0:bCs/>
       </ns0:rPr>
@@ -4485,7 +4485,7 @@
         <ns0:spacing ns0:before="0" ns0:after="0" ns0:line="240" ns0:lineRule="auto"/>
       </ns0:pPr>
       <ns0:rPr>
-        <ns0:rFonts ns0:cstheme="majorBidi" ns0:ascii="Calibri" ns0:hAnsi="Calibri" ns0:cs="Calibri" ns0:eastAsia="Calibri"/>
+        <ns0:rFonts ns0:ascii="Calibri" ns0:hAnsi="Calibri" ns0:cs="Calibri" ns0:eastAsia="Calibri"/>
         <ns0:b/>
         <ns0:bCs/>
       </ns0:rPr>
@@ -4503,14 +4503,14 @@
     </ns0:tblStylePr>
     <ns0:tblStylePr ns0:type="firstCol">
       <ns0:rPr>
-        <ns0:rFonts ns0:cstheme="majorBidi" ns0:ascii="Calibri" ns0:hAnsi="Calibri" ns0:cs="Calibri" ns0:eastAsia="Calibri"/>
+        <ns0:rFonts ns0:ascii="Calibri" ns0:hAnsi="Calibri" ns0:cs="Calibri" ns0:eastAsia="Calibri"/>
         <ns0:b/>
         <ns0:bCs/>
       </ns0:rPr>
     </ns0:tblStylePr>
     <ns0:tblStylePr ns0:type="lastCol">
       <ns0:rPr>
-        <ns0:rFonts ns0:cstheme="majorBidi" ns0:ascii="Calibri" ns0:hAnsi="Calibri" ns0:cs="Calibri" ns0:eastAsia="Calibri"/>
+        <ns0:rFonts ns0:ascii="Calibri" ns0:hAnsi="Calibri" ns0:cs="Calibri" ns0:eastAsia="Calibri"/>
         <ns0:b/>
         <ns0:bCs/>
       </ns0:rPr>
@@ -4594,7 +4594,7 @@
         <ns0:spacing ns0:before="0" ns0:after="0" ns0:line="240" ns0:lineRule="auto"/>
       </ns0:pPr>
       <ns0:rPr>
-        <ns0:rFonts ns0:cstheme="majorBidi" ns0:ascii="Calibri" ns0:hAnsi="Calibri" ns0:cs="Calibri" ns0:eastAsia="Calibri"/>
+        <ns0:rFonts ns0:ascii="Calibri" ns0:hAnsi="Calibri" ns0:cs="Calibri" ns0:eastAsia="Calibri"/>
         <ns0:b/>
         <ns0:bCs/>
       </ns0:rPr>
@@ -4615,7 +4615,7 @@
         <ns0:spacing ns0:before="0" ns0:after="0" ns0:line="240" ns0:lineRule="auto"/>
       </ns0:pPr>
       <ns0:rPr>
-        <ns0:rFonts ns0:cstheme="majorBidi" ns0:ascii="Calibri" ns0:hAnsi="Calibri" ns0:cs="Calibri" ns0:eastAsia="Calibri"/>
+        <ns0:rFonts ns0:ascii="Calibri" ns0:hAnsi="Calibri" ns0:cs="Calibri" ns0:eastAsia="Calibri"/>
         <ns0:b/>
         <ns0:bCs/>
       </ns0:rPr>
@@ -4633,14 +4633,14 @@
     </ns0:tblStylePr>
     <ns0:tblStylePr ns0:type="firstCol">
       <ns0:rPr>
-        <ns0:rFonts ns0:cstheme="majorBidi" ns0:ascii="Calibri" ns0:hAnsi="Calibri" ns0:cs="Calibri" ns0:eastAsia="Calibri"/>
+        <ns0:rFonts ns0:ascii="Calibri" ns0:hAnsi="Calibri" ns0:cs="Calibri" ns0:eastAsia="Calibri"/>
         <ns0:b/>
         <ns0:bCs/>
       </ns0:rPr>
     </ns0:tblStylePr>
     <ns0:tblStylePr ns0:type="lastCol">
       <ns0:rPr>
-        <ns0:rFonts ns0:cstheme="majorBidi" ns0:ascii="Calibri" ns0:hAnsi="Calibri" ns0:cs="Calibri" ns0:eastAsia="Calibri"/>
+        <ns0:rFonts ns0:ascii="Calibri" ns0:hAnsi="Calibri" ns0:cs="Calibri" ns0:eastAsia="Calibri"/>
         <ns0:b/>
         <ns0:bCs/>
       </ns0:rPr>
@@ -4724,7 +4724,7 @@
         <ns0:spacing ns0:before="0" ns0:after="0" ns0:line="240" ns0:lineRule="auto"/>
       </ns0:pPr>
       <ns0:rPr>
-        <ns0:rFonts ns0:cstheme="majorBidi" ns0:ascii="Calibri" ns0:hAnsi="Calibri" ns0:cs="Calibri" ns0:eastAsia="Calibri"/>
+        <ns0:rFonts ns0:ascii="Calibri" ns0:hAnsi="Calibri" ns0:cs="Calibri" ns0:eastAsia="Calibri"/>
         <ns0:b/>
         <ns0:bCs/>
       </ns0:rPr>
@@ -4745,7 +4745,7 @@
         <ns0:spacing ns0:before="0" ns0:after="0" ns0:line="240" ns0:lineRule="auto"/>
       </ns0:pPr>
       <ns0:rPr>
-        <ns0:rFonts ns0:cstheme="majorBidi" ns0:ascii="Calibri" ns0:hAnsi="Calibri" ns0:cs="Calibri" ns0:eastAsia="Calibri"/>
+        <ns0:rFonts ns0:ascii="Calibri" ns0:hAnsi="Calibri" ns0:cs="Calibri" ns0:eastAsia="Calibri"/>
         <ns0:b/>
         <ns0:bCs/>
       </ns0:rPr>
@@ -4763,14 +4763,14 @@
     </ns0:tblStylePr>
     <ns0:tblStylePr ns0:type="firstCol">
       <ns0:rPr>
-        <ns0:rFonts ns0:cstheme="majorBidi" ns0:ascii="Calibri" ns0:hAnsi="Calibri" ns0:cs="Calibri" ns0:eastAsia="Calibri"/>
+        <ns0:rFonts ns0:ascii="Calibri" ns0:hAnsi="Calibri" ns0:cs="Calibri" ns0:eastAsia="Calibri"/>
         <ns0:b/>
         <ns0:bCs/>
       </ns0:rPr>
     </ns0:tblStylePr>
     <ns0:tblStylePr ns0:type="lastCol">
       <ns0:rPr>
-        <ns0:rFonts ns0:cstheme="majorBidi" ns0:ascii="Calibri" ns0:hAnsi="Calibri" ns0:cs="Calibri" ns0:eastAsia="Calibri"/>
+        <ns0:rFonts ns0:ascii="Calibri" ns0:hAnsi="Calibri" ns0:cs="Calibri" ns0:eastAsia="Calibri"/>
         <ns0:b/>
         <ns0:bCs/>
       </ns0:rPr>
@@ -4854,7 +4854,7 @@
         <ns0:spacing ns0:before="0" ns0:after="0" ns0:line="240" ns0:lineRule="auto"/>
       </ns0:pPr>
       <ns0:rPr>
-        <ns0:rFonts ns0:cstheme="majorBidi" ns0:ascii="Calibri" ns0:hAnsi="Calibri" ns0:cs="Calibri" ns0:eastAsia="Calibri"/>
+        <ns0:rFonts ns0:ascii="Calibri" ns0:hAnsi="Calibri" ns0:cs="Calibri" ns0:eastAsia="Calibri"/>
         <ns0:b/>
         <ns0:bCs/>
       </ns0:rPr>
@@ -4875,7 +4875,7 @@
         <ns0:spacing ns0:before="0" ns0:after="0" ns0:line="240" ns0:lineRule="auto"/>
       </ns0:pPr>
       <ns0:rPr>
-        <ns0:rFonts ns0:cstheme="majorBidi" ns0:ascii="Calibri" ns0:hAnsi="Calibri" ns0:cs="Calibri" ns0:eastAsia="Calibri"/>
+        <ns0:rFonts ns0:ascii="Calibri" ns0:hAnsi="Calibri" ns0:cs="Calibri" ns0:eastAsia="Calibri"/>
         <ns0:b/>
         <ns0:bCs/>
       </ns0:rPr>
@@ -4893,14 +4893,14 @@
     </ns0:tblStylePr>
     <ns0:tblStylePr ns0:type="firstCol">
       <ns0:rPr>
-        <ns0:rFonts ns0:cstheme="majorBidi" ns0:ascii="Calibri" ns0:hAnsi="Calibri" ns0:cs="Calibri" ns0:eastAsia="Calibri"/>
+        <ns0:rFonts ns0:ascii="Calibri" ns0:hAnsi="Calibri" ns0:cs="Calibri" ns0:eastAsia="Calibri"/>
         <ns0:b/>
         <ns0:bCs/>
       </ns0:rPr>
     </ns0:tblStylePr>
     <ns0:tblStylePr ns0:type="lastCol">
       <ns0:rPr>
-        <ns0:rFonts ns0:cstheme="majorBidi" ns0:ascii="Calibri" ns0:hAnsi="Calibri" ns0:cs="Calibri" ns0:eastAsia="Calibri"/>
+        <ns0:rFonts ns0:ascii="Calibri" ns0:hAnsi="Calibri" ns0:cs="Calibri" ns0:eastAsia="Calibri"/>
         <ns0:b/>
         <ns0:bCs/>
       </ns0:rPr>
@@ -6765,7 +6765,7 @@
     </ns0:tblPr>
     <ns0:tblStylePr ns0:type="firstRow">
       <ns0:rPr>
-        <ns0:rFonts ns0:cstheme="majorBidi" ns0:ascii="Calibri" ns0:hAnsi="Calibri" ns0:cs="Calibri" ns0:eastAsia="Calibri"/>
+        <ns0:rFonts ns0:ascii="Calibri" ns0:hAnsi="Calibri" ns0:cs="Calibri" ns0:eastAsia="Calibri"/>
       </ns0:rPr>
       <ns0:tblPr/>
       <ns0:tcPr>
@@ -6849,7 +6849,7 @@
     </ns0:tblPr>
     <ns0:tblStylePr ns0:type="firstRow">
       <ns0:rPr>
-        <ns0:rFonts ns0:cstheme="majorBidi" ns0:ascii="Calibri" ns0:hAnsi="Calibri" ns0:cs="Calibri" ns0:eastAsia="Calibri"/>
+        <ns0:rFonts ns0:ascii="Calibri" ns0:hAnsi="Calibri" ns0:cs="Calibri" ns0:eastAsia="Calibri"/>
       </ns0:rPr>
       <ns0:tblPr/>
       <ns0:tcPr>
@@ -6933,7 +6933,7 @@
     </ns0:tblPr>
     <ns0:tblStylePr ns0:type="firstRow">
       <ns0:rPr>
-        <ns0:rFonts ns0:cstheme="majorBidi" ns0:ascii="Calibri" ns0:hAnsi="Calibri" ns0:cs="Calibri" ns0:eastAsia="Calibri"/>
+        <ns0:rFonts ns0:ascii="Calibri" ns0:hAnsi="Calibri" ns0:cs="Calibri" ns0:eastAsia="Calibri"/>
       </ns0:rPr>
       <ns0:tblPr/>
       <ns0:tcPr>
@@ -7017,7 +7017,7 @@
     </ns0:tblPr>
     <ns0:tblStylePr ns0:type="firstRow">
       <ns0:rPr>
-        <ns0:rFonts ns0:cstheme="majorBidi" ns0:ascii="Calibri" ns0:hAnsi="Calibri" ns0:cs="Calibri" ns0:eastAsia="Calibri"/>
+        <ns0:rFonts ns0:ascii="Calibri" ns0:hAnsi="Calibri" ns0:cs="Calibri" ns0:eastAsia="Calibri"/>
       </ns0:rPr>
       <ns0:tblPr/>
       <ns0:tcPr>
@@ -7101,7 +7101,7 @@
     </ns0:tblPr>
     <ns0:tblStylePr ns0:type="firstRow">
       <ns0:rPr>
-        <ns0:rFonts ns0:cstheme="majorBidi" ns0:ascii="Calibri" ns0:hAnsi="Calibri" ns0:cs="Calibri" ns0:eastAsia="Calibri"/>
+        <ns0:rFonts ns0:ascii="Calibri" ns0:hAnsi="Calibri" ns0:cs="Calibri" ns0:eastAsia="Calibri"/>
       </ns0:rPr>
       <ns0:tblPr/>
       <ns0:tcPr>
@@ -7185,7 +7185,7 @@
     </ns0:tblPr>
     <ns0:tblStylePr ns0:type="firstRow">
       <ns0:rPr>
-        <ns0:rFonts ns0:cstheme="majorBidi" ns0:ascii="Calibri" ns0:hAnsi="Calibri" ns0:cs="Calibri" ns0:eastAsia="Calibri"/>
+        <ns0:rFonts ns0:ascii="Calibri" ns0:hAnsi="Calibri" ns0:cs="Calibri" ns0:eastAsia="Calibri"/>
       </ns0:rPr>
       <ns0:tblPr/>
       <ns0:tcPr>
@@ -7269,7 +7269,7 @@
     </ns0:tblPr>
     <ns0:tblStylePr ns0:type="firstRow">
       <ns0:rPr>
-        <ns0:rFonts ns0:cstheme="majorBidi" ns0:ascii="Calibri" ns0:hAnsi="Calibri" ns0:cs="Calibri" ns0:eastAsia="Calibri"/>
+        <ns0:rFonts ns0:ascii="Calibri" ns0:hAnsi="Calibri" ns0:cs="Calibri" ns0:eastAsia="Calibri"/>
       </ns0:rPr>
       <ns0:tblPr/>
       <ns0:tcPr>
@@ -7334,7 +7334,7 @@
       <ns0:spacing ns0:after="0" ns0:line="240" ns0:lineRule="auto"/>
     </ns0:pPr>
     <ns0:rPr>
-      <ns0:rFonts ns0:cstheme="majorBidi" ns0:ascii="Calibri" ns0:hAnsi="Calibri" ns0:cs="Calibri" ns0:eastAsia="Calibri"/>
+      <ns0:rFonts ns0:ascii="Calibri" ns0:hAnsi="Calibri" ns0:cs="Calibri" ns0:eastAsia="Calibri"/>
       <ns0:color ns0:val="000000" ns0:themeColor="text1"/>
     </ns0:rPr>
     <ns0:tblPr>
@@ -7462,7 +7462,7 @@
       <ns0:spacing ns0:after="0" ns0:line="240" ns0:lineRule="auto"/>
     </ns0:pPr>
     <ns0:rPr>
-      <ns0:rFonts ns0:cstheme="majorBidi" ns0:ascii="Calibri" ns0:hAnsi="Calibri" ns0:cs="Calibri" ns0:eastAsia="Calibri"/>
+      <ns0:rFonts ns0:ascii="Calibri" ns0:hAnsi="Calibri" ns0:cs="Calibri" ns0:eastAsia="Calibri"/>
       <ns0:color ns0:val="000000" ns0:themeColor="text1"/>
     </ns0:rPr>
     <ns0:tblPr>
@@ -7590,7 +7590,7 @@
       <ns0:spacing ns0:after="0" ns0:line="240" ns0:lineRule="auto"/>
     </ns0:pPr>
     <ns0:rPr>
-      <ns0:rFonts ns0:cstheme="majorBidi" ns0:ascii="Calibri" ns0:hAnsi="Calibri" ns0:cs="Calibri" ns0:eastAsia="Calibri"/>
+      <ns0:rFonts ns0:ascii="Calibri" ns0:hAnsi="Calibri" ns0:cs="Calibri" ns0:eastAsia="Calibri"/>
       <ns0:color ns0:val="000000" ns0:themeColor="text1"/>
     </ns0:rPr>
     <ns0:tblPr>
@@ -7718,7 +7718,7 @@
       <ns0:spacing ns0:after="0" ns0:line="240" ns0:lineRule="auto"/>
     </ns0:pPr>
     <ns0:rPr>
-      <ns0:rFonts ns0:cstheme="majorBidi" ns0:ascii="Calibri" ns0:hAnsi="Calibri" ns0:cs="Calibri" ns0:eastAsia="Calibri"/>
+      <ns0:rFonts ns0:ascii="Calibri" ns0:hAnsi="Calibri" ns0:cs="Calibri" ns0:eastAsia="Calibri"/>
       <ns0:color ns0:val="000000" ns0:themeColor="text1"/>
     </ns0:rPr>
     <ns0:tblPr>
@@ -7846,7 +7846,7 @@
       <ns0:spacing ns0:after="0" ns0:line="240" ns0:lineRule="auto"/>
     </ns0:pPr>
     <ns0:rPr>
-      <ns0:rFonts ns0:cstheme="majorBidi" ns0:ascii="Calibri" ns0:hAnsi="Calibri" ns0:cs="Calibri" ns0:eastAsia="Calibri"/>
+      <ns0:rFonts ns0:ascii="Calibri" ns0:hAnsi="Calibri" ns0:cs="Calibri" ns0:eastAsia="Calibri"/>
       <ns0:color ns0:val="000000" ns0:themeColor="text1"/>
     </ns0:rPr>
     <ns0:tblPr>
@@ -7974,7 +7974,7 @@
       <ns0:spacing ns0:after="0" ns0:line="240" ns0:lineRule="auto"/>
     </ns0:pPr>
     <ns0:rPr>
-      <ns0:rFonts ns0:cstheme="majorBidi" ns0:ascii="Calibri" ns0:hAnsi="Calibri" ns0:cs="Calibri" ns0:eastAsia="Calibri"/>
+      <ns0:rFonts ns0:ascii="Calibri" ns0:hAnsi="Calibri" ns0:cs="Calibri" ns0:eastAsia="Calibri"/>
       <ns0:color ns0:val="000000" ns0:themeColor="text1"/>
     </ns0:rPr>
     <ns0:tblPr>
@@ -8102,7 +8102,7 @@
       <ns0:spacing ns0:after="0" ns0:line="240" ns0:lineRule="auto"/>
     </ns0:pPr>
     <ns0:rPr>
-      <ns0:rFonts ns0:cstheme="majorBidi" ns0:ascii="Calibri" ns0:hAnsi="Calibri" ns0:cs="Calibri" ns0:eastAsia="Calibri"/>
+      <ns0:rFonts ns0:ascii="Calibri" ns0:hAnsi="Calibri" ns0:cs="Calibri" ns0:eastAsia="Calibri"/>
       <ns0:color ns0:val="000000" ns0:themeColor="text1"/>
     </ns0:rPr>
     <ns0:tblPr>
@@ -8741,7 +8741,7 @@
       <ns0:spacing ns0:after="0" ns0:line="240" ns0:lineRule="auto"/>
     </ns0:pPr>
     <ns0:rPr>
-      <ns0:rFonts ns0:cstheme="majorBidi" ns0:ascii="Calibri" ns0:hAnsi="Calibri" ns0:cs="Calibri" ns0:eastAsia="Calibri"/>
+      <ns0:rFonts ns0:ascii="Calibri" ns0:hAnsi="Calibri" ns0:cs="Calibri" ns0:eastAsia="Calibri"/>
       <ns0:color ns0:val="000000" ns0:themeColor="text1"/>
     </ns0:rPr>
     <ns0:tblPr>
@@ -8866,7 +8866,7 @@
       <ns0:spacing ns0:after="0" ns0:line="240" ns0:lineRule="auto"/>
     </ns0:pPr>
     <ns0:rPr>
-      <ns0:rFonts ns0:cstheme="majorBidi" ns0:ascii="Calibri" ns0:hAnsi="Calibri" ns0:cs="Calibri" ns0:eastAsia="Calibri"/>
+      <ns0:rFonts ns0:ascii="Calibri" ns0:hAnsi="Calibri" ns0:cs="Calibri" ns0:eastAsia="Calibri"/>
       <ns0:color ns0:val="000000" ns0:themeColor="text1"/>
     </ns0:rPr>
     <ns0:tblPr>
@@ -8991,7 +8991,7 @@
       <ns0:spacing ns0:after="0" ns0:line="240" ns0:lineRule="auto"/>
     </ns0:pPr>
     <ns0:rPr>
-      <ns0:rFonts ns0:cstheme="majorBidi" ns0:ascii="Calibri" ns0:hAnsi="Calibri" ns0:cs="Calibri" ns0:eastAsia="Calibri"/>
+      <ns0:rFonts ns0:ascii="Calibri" ns0:hAnsi="Calibri" ns0:cs="Calibri" ns0:eastAsia="Calibri"/>
       <ns0:color ns0:val="000000" ns0:themeColor="text1"/>
     </ns0:rPr>
     <ns0:tblPr>
@@ -9116,7 +9116,7 @@
       <ns0:spacing ns0:after="0" ns0:line="240" ns0:lineRule="auto"/>
     </ns0:pPr>
     <ns0:rPr>
-      <ns0:rFonts ns0:cstheme="majorBidi" ns0:ascii="Calibri" ns0:hAnsi="Calibri" ns0:cs="Calibri" ns0:eastAsia="Calibri"/>
+      <ns0:rFonts ns0:ascii="Calibri" ns0:hAnsi="Calibri" ns0:cs="Calibri" ns0:eastAsia="Calibri"/>
       <ns0:color ns0:val="000000" ns0:themeColor="text1"/>
     </ns0:rPr>
     <ns0:tblPr>
@@ -9241,7 +9241,7 @@
       <ns0:spacing ns0:after="0" ns0:line="240" ns0:lineRule="auto"/>
     </ns0:pPr>
     <ns0:rPr>
-      <ns0:rFonts ns0:cstheme="majorBidi" ns0:ascii="Calibri" ns0:hAnsi="Calibri" ns0:cs="Calibri" ns0:eastAsia="Calibri"/>
+      <ns0:rFonts ns0:ascii="Calibri" ns0:hAnsi="Calibri" ns0:cs="Calibri" ns0:eastAsia="Calibri"/>
       <ns0:color ns0:val="000000" ns0:themeColor="text1"/>
     </ns0:rPr>
     <ns0:tblPr>
@@ -9366,7 +9366,7 @@
       <ns0:spacing ns0:after="0" ns0:line="240" ns0:lineRule="auto"/>
     </ns0:pPr>
     <ns0:rPr>
-      <ns0:rFonts ns0:cstheme="majorBidi" ns0:ascii="Calibri" ns0:hAnsi="Calibri" ns0:cs="Calibri" ns0:eastAsia="Calibri"/>
+      <ns0:rFonts ns0:ascii="Calibri" ns0:hAnsi="Calibri" ns0:cs="Calibri" ns0:eastAsia="Calibri"/>
       <ns0:color ns0:val="000000" ns0:themeColor="text1"/>
     </ns0:rPr>
     <ns0:tblPr>
@@ -9491,7 +9491,7 @@
       <ns0:spacing ns0:after="0" ns0:line="240" ns0:lineRule="auto"/>
     </ns0:pPr>
     <ns0:rPr>
-      <ns0:rFonts ns0:cstheme="majorBidi" ns0:ascii="Calibri" ns0:hAnsi="Calibri" ns0:cs="Calibri" ns0:eastAsia="Calibri"/>
+      <ns0:rFonts ns0:ascii="Calibri" ns0:hAnsi="Calibri" ns0:cs="Calibri" ns0:eastAsia="Calibri"/>
       <ns0:color ns0:val="000000" ns0:themeColor="text1"/>
     </ns0:rPr>
     <ns0:tblPr>
@@ -13406,7 +13406,7 @@
   <ns0:docDefaults>
     <ns0:rPrDefault>
       <ns0:rPr>
-        <ns0:rFonts ns0:cstheme="minorBidi" ns0:ascii="Calibri" ns0:hAnsi="Calibri" ns0:cs="Calibri" ns0:eastAsia="Calibri"/>
+        <ns0:rFonts ns0:ascii="Calibri" ns0:hAnsi="Calibri" ns0:cs="Calibri" ns0:eastAsia="Calibri"/>
         <ns0:sz ns0:val="22"/>
         <ns0:szCs ns0:val="22"/>
         <ns0:lang ns0:val="en-US" ns0:eastAsia="en-US" ns0:bidi="ar-SA"/>
@@ -13577,7 +13577,7 @@
       <ns0:outlineLvl ns0:val="0"/>
     </ns0:pPr>
     <ns0:rPr>
-      <ns0:rFonts ns0:cstheme="majorBidi" ns0:ascii="Calibri" ns0:hAnsi="Calibri" ns0:cs="Calibri" ns0:eastAsia="Calibri"/>
+      <ns0:rFonts ns0:ascii="Calibri" ns0:hAnsi="Calibri" ns0:cs="Calibri" ns0:eastAsia="Calibri"/>
       <ns0:b/>
       <ns0:bCs/>
       <ns0:color ns0:val="365F91" ns0:themeColor="accent1" ns0:themeShade="BF"/>
@@ -13601,7 +13601,7 @@
       <ns0:outlineLvl ns0:val="1"/>
     </ns0:pPr>
     <ns0:rPr>
-      <ns0:rFonts ns0:cstheme="majorBidi" ns0:ascii="Calibri" ns0:hAnsi="Calibri" ns0:cs="Calibri" ns0:eastAsia="Calibri"/>
+      <ns0:rFonts ns0:ascii="Calibri" ns0:hAnsi="Calibri" ns0:cs="Calibri" ns0:eastAsia="Calibri"/>
       <ns0:b/>
       <ns0:bCs/>
       <ns0:color ns0:val="4F81BD" ns0:themeColor="accent1"/>
@@ -13625,7 +13625,7 @@
       <ns0:outlineLvl ns0:val="2"/>
     </ns0:pPr>
     <ns0:rPr>
-      <ns0:rFonts ns0:cstheme="majorBidi" ns0:ascii="Calibri" ns0:hAnsi="Calibri" ns0:cs="Calibri" ns0:eastAsia="Calibri"/>
+      <ns0:rFonts ns0:ascii="Calibri" ns0:hAnsi="Calibri" ns0:cs="Calibri" ns0:eastAsia="Calibri"/>
       <ns0:b/>
       <ns0:bCs/>
       <ns0:color ns0:val="4F81BD" ns0:themeColor="accent1"/>
@@ -13648,7 +13648,7 @@
       <ns0:outlineLvl ns0:val="3"/>
     </ns0:pPr>
     <ns0:rPr>
-      <ns0:rFonts ns0:cstheme="majorBidi" ns0:ascii="Calibri" ns0:hAnsi="Calibri" ns0:cs="Calibri" ns0:eastAsia="Calibri"/>
+      <ns0:rFonts ns0:ascii="Calibri" ns0:hAnsi="Calibri" ns0:cs="Calibri" ns0:eastAsia="Calibri"/>
       <ns0:b/>
       <ns0:bCs/>
       <ns0:i/>
@@ -13673,7 +13673,7 @@
       <ns0:outlineLvl ns0:val="4"/>
     </ns0:pPr>
     <ns0:rPr>
-      <ns0:rFonts ns0:cstheme="majorBidi" ns0:ascii="Calibri" ns0:hAnsi="Calibri" ns0:cs="Calibri" ns0:eastAsia="Calibri"/>
+      <ns0:rFonts ns0:ascii="Calibri" ns0:hAnsi="Calibri" ns0:cs="Calibri" ns0:eastAsia="Calibri"/>
       <ns0:color ns0:val="243F60" ns0:themeColor="accent1" ns0:themeShade="7F"/>
     </ns0:rPr>
   </ns0:style>
@@ -13694,7 +13694,7 @@
       <ns0:outlineLvl ns0:val="5"/>
     </ns0:pPr>
     <ns0:rPr>
-      <ns0:rFonts ns0:cstheme="majorBidi" ns0:ascii="Calibri" ns0:hAnsi="Calibri" ns0:cs="Calibri" ns0:eastAsia="Calibri"/>
+      <ns0:rFonts ns0:ascii="Calibri" ns0:hAnsi="Calibri" ns0:cs="Calibri" ns0:eastAsia="Calibri"/>
       <ns0:i/>
       <ns0:iCs/>
       <ns0:color ns0:val="243F60" ns0:themeColor="accent1" ns0:themeShade="7F"/>
@@ -13717,7 +13717,7 @@
       <ns0:outlineLvl ns0:val="6"/>
     </ns0:pPr>
     <ns0:rPr>
-      <ns0:rFonts ns0:cstheme="majorBidi" ns0:ascii="Calibri" ns0:hAnsi="Calibri" ns0:cs="Calibri" ns0:eastAsia="Calibri"/>
+      <ns0:rFonts ns0:ascii="Calibri" ns0:hAnsi="Calibri" ns0:cs="Calibri" ns0:eastAsia="Calibri"/>
       <ns0:i/>
       <ns0:iCs/>
       <ns0:color ns0:val="404040" ns0:themeColor="text1" ns0:themeTint="BF"/>
@@ -13740,7 +13740,7 @@
       <ns0:outlineLvl ns0:val="7"/>
     </ns0:pPr>
     <ns0:rPr>
-      <ns0:rFonts ns0:cstheme="majorBidi" ns0:ascii="Calibri" ns0:hAnsi="Calibri" ns0:cs="Calibri" ns0:eastAsia="Calibri"/>
+      <ns0:rFonts ns0:ascii="Calibri" ns0:hAnsi="Calibri" ns0:cs="Calibri" ns0:eastAsia="Calibri"/>
       <ns0:color ns0:val="4F81BD" ns0:themeColor="accent1"/>
       <ns0:sz ns0:val="20"/>
       <ns0:szCs ns0:val="20"/>
@@ -13763,7 +13763,7 @@
       <ns0:outlineLvl ns0:val="8"/>
     </ns0:pPr>
     <ns0:rPr>
-      <ns0:rFonts ns0:cstheme="majorBidi" ns0:ascii="Calibri" ns0:hAnsi="Calibri" ns0:cs="Calibri" ns0:eastAsia="Calibri"/>
+      <ns0:rFonts ns0:ascii="Calibri" ns0:hAnsi="Calibri" ns0:cs="Calibri" ns0:eastAsia="Calibri"/>
       <ns0:i/>
       <ns0:iCs/>
       <ns0:color ns0:val="404040" ns0:themeColor="text1" ns0:themeTint="BF"/>
@@ -13814,7 +13814,7 @@
     <ns0:uiPriority ns0:val="9"/>
     <ns0:rsid ns0:val="00FC693F"/>
     <ns0:rPr>
-      <ns0:rFonts ns0:cstheme="majorBidi" ns0:ascii="Calibri" ns0:hAnsi="Calibri" ns0:cs="Calibri" ns0:eastAsia="Calibri"/>
+      <ns0:rFonts ns0:ascii="Calibri" ns0:hAnsi="Calibri" ns0:cs="Calibri" ns0:eastAsia="Calibri"/>
       <ns0:b/>
       <ns0:bCs/>
       <ns0:color ns0:val="365F91" ns0:themeColor="accent1" ns0:themeShade="BF"/>
@@ -13829,7 +13829,7 @@
     <ns0:uiPriority ns0:val="9"/>
     <ns0:rsid ns0:val="00FC693F"/>
     <ns0:rPr>
-      <ns0:rFonts ns0:cstheme="majorBidi" ns0:ascii="Calibri" ns0:hAnsi="Calibri" ns0:cs="Calibri" ns0:eastAsia="Calibri"/>
+      <ns0:rFonts ns0:ascii="Calibri" ns0:hAnsi="Calibri" ns0:cs="Calibri" ns0:eastAsia="Calibri"/>
       <ns0:b/>
       <ns0:bCs/>
       <ns0:color ns0:val="4F81BD" ns0:themeColor="accent1"/>
@@ -13844,7 +13844,7 @@
     <ns0:uiPriority ns0:val="9"/>
     <ns0:rsid ns0:val="00FC693F"/>
     <ns0:rPr>
-      <ns0:rFonts ns0:cstheme="majorBidi" ns0:ascii="Calibri" ns0:hAnsi="Calibri" ns0:cs="Calibri" ns0:eastAsia="Calibri"/>
+      <ns0:rFonts ns0:ascii="Calibri" ns0:hAnsi="Calibri" ns0:cs="Calibri" ns0:eastAsia="Calibri"/>
       <ns0:b/>
       <ns0:bCs/>
       <ns0:color ns0:val="4F81BD" ns0:themeColor="accent1"/>
@@ -13866,7 +13866,7 @@
       <ns0:contextualSpacing/>
     </ns0:pPr>
     <ns0:rPr>
-      <ns0:rFonts ns0:cstheme="majorBidi" ns0:ascii="Calibri" ns0:hAnsi="Calibri" ns0:cs="Calibri" ns0:eastAsia="Calibri"/>
+      <ns0:rFonts ns0:ascii="Calibri" ns0:hAnsi="Calibri" ns0:cs="Calibri" ns0:eastAsia="Calibri"/>
       <ns0:color ns0:val="17365D" ns0:themeColor="text2" ns0:themeShade="BF"/>
       <ns0:spacing ns0:val="5"/>
       <ns0:kern ns0:val="28"/>
@@ -13881,7 +13881,7 @@
     <ns0:uiPriority ns0:val="10"/>
     <ns0:rsid ns0:val="00FC693F"/>
     <ns0:rPr>
-      <ns0:rFonts ns0:cstheme="majorBidi" ns0:ascii="Calibri" ns0:hAnsi="Calibri" ns0:cs="Calibri" ns0:eastAsia="Calibri"/>
+      <ns0:rFonts ns0:ascii="Calibri" ns0:hAnsi="Calibri" ns0:cs="Calibri" ns0:eastAsia="Calibri"/>
       <ns0:color ns0:val="17365D" ns0:themeColor="text2" ns0:themeShade="BF"/>
       <ns0:spacing ns0:val="5"/>
       <ns0:kern ns0:val="28"/>
@@ -13903,7 +13903,7 @@
       </ns0:numPr>
     </ns0:pPr>
     <ns0:rPr>
-      <ns0:rFonts ns0:cstheme="majorBidi" ns0:ascii="Calibri" ns0:hAnsi="Calibri" ns0:cs="Calibri" ns0:eastAsia="Calibri"/>
+      <ns0:rFonts ns0:ascii="Calibri" ns0:hAnsi="Calibri" ns0:cs="Calibri" ns0:eastAsia="Calibri"/>
       <ns0:i/>
       <ns0:iCs/>
       <ns0:color ns0:val="4F81BD" ns0:themeColor="accent1"/>
@@ -13919,7 +13919,7 @@
     <ns0:uiPriority ns0:val="11"/>
     <ns0:rsid ns0:val="00FC693F"/>
     <ns0:rPr>
-      <ns0:rFonts ns0:cstheme="majorBidi" ns0:ascii="Calibri" ns0:hAnsi="Calibri" ns0:cs="Calibri" ns0:eastAsia="Calibri"/>
+      <ns0:rFonts ns0:ascii="Calibri" ns0:hAnsi="Calibri" ns0:cs="Calibri" ns0:eastAsia="Calibri"/>
       <ns0:i/>
       <ns0:iCs/>
       <ns0:color ns0:val="4F81BD" ns0:themeColor="accent1"/>
@@ -14217,7 +14217,7 @@
     <ns0:semiHidden/>
     <ns0:rsid ns0:val="00FC693F"/>
     <ns0:rPr>
-      <ns0:rFonts ns0:cstheme="majorBidi" ns0:ascii="Calibri" ns0:hAnsi="Calibri" ns0:cs="Calibri" ns0:eastAsia="Calibri"/>
+      <ns0:rFonts ns0:ascii="Calibri" ns0:hAnsi="Calibri" ns0:cs="Calibri" ns0:eastAsia="Calibri"/>
       <ns0:b/>
       <ns0:bCs/>
       <ns0:i/>
@@ -14233,7 +14233,7 @@
     <ns0:semiHidden/>
     <ns0:rsid ns0:val="00FC693F"/>
     <ns0:rPr>
-      <ns0:rFonts ns0:cstheme="majorBidi" ns0:ascii="Calibri" ns0:hAnsi="Calibri" ns0:cs="Calibri" ns0:eastAsia="Calibri"/>
+      <ns0:rFonts ns0:ascii="Calibri" ns0:hAnsi="Calibri" ns0:cs="Calibri" ns0:eastAsia="Calibri"/>
       <ns0:color ns0:val="243F60" ns0:themeColor="accent1" ns0:themeShade="7F"/>
     </ns0:rPr>
   </ns0:style>
@@ -14245,7 +14245,7 @@
     <ns0:semiHidden/>
     <ns0:rsid ns0:val="00FC693F"/>
     <ns0:rPr>
-      <ns0:rFonts ns0:cstheme="majorBidi" ns0:ascii="Calibri" ns0:hAnsi="Calibri" ns0:cs="Calibri" ns0:eastAsia="Calibri"/>
+      <ns0:rFonts ns0:ascii="Calibri" ns0:hAnsi="Calibri" ns0:cs="Calibri" ns0:eastAsia="Calibri"/>
       <ns0:i/>
       <ns0:iCs/>
       <ns0:color ns0:val="243F60" ns0:themeColor="accent1" ns0:themeShade="7F"/>
@@ -14259,7 +14259,7 @@
     <ns0:semiHidden/>
     <ns0:rsid ns0:val="00FC693F"/>
     <ns0:rPr>
-      <ns0:rFonts ns0:cstheme="majorBidi" ns0:ascii="Calibri" ns0:hAnsi="Calibri" ns0:cs="Calibri" ns0:eastAsia="Calibri"/>
+      <ns0:rFonts ns0:ascii="Calibri" ns0:hAnsi="Calibri" ns0:cs="Calibri" ns0:eastAsia="Calibri"/>
       <ns0:i/>
       <ns0:iCs/>
       <ns0:color ns0:val="404040" ns0:themeColor="text1" ns0:themeTint="BF"/>
@@ -14273,7 +14273,7 @@
     <ns0:semiHidden/>
     <ns0:rsid ns0:val="00FC693F"/>
     <ns0:rPr>
-      <ns0:rFonts ns0:cstheme="majorBidi" ns0:ascii="Calibri" ns0:hAnsi="Calibri" ns0:cs="Calibri" ns0:eastAsia="Calibri"/>
+      <ns0:rFonts ns0:ascii="Calibri" ns0:hAnsi="Calibri" ns0:cs="Calibri" ns0:eastAsia="Calibri"/>
       <ns0:color ns0:val="4F81BD" ns0:themeColor="accent1"/>
       <ns0:sz ns0:val="20"/>
       <ns0:szCs ns0:val="20"/>
@@ -14287,7 +14287,7 @@
     <ns0:semiHidden/>
     <ns0:rsid ns0:val="00FC693F"/>
     <ns0:rPr>
-      <ns0:rFonts ns0:cstheme="majorBidi" ns0:ascii="Calibri" ns0:hAnsi="Calibri" ns0:cs="Calibri" ns0:eastAsia="Calibri"/>
+      <ns0:rFonts ns0:ascii="Calibri" ns0:hAnsi="Calibri" ns0:cs="Calibri" ns0:eastAsia="Calibri"/>
       <ns0:i/>
       <ns0:iCs/>
       <ns0:color ns0:val="404040" ns0:themeColor="text1" ns0:themeTint="BF"/>
@@ -15876,7 +15876,7 @@
         <ns0:spacing ns0:before="0" ns0:after="0" ns0:line="240" ns0:lineRule="auto"/>
       </ns0:pPr>
       <ns0:rPr>
-        <ns0:rFonts ns0:cstheme="majorBidi" ns0:ascii="Calibri" ns0:hAnsi="Calibri" ns0:cs="Calibri" ns0:eastAsia="Calibri"/>
+        <ns0:rFonts ns0:ascii="Calibri" ns0:hAnsi="Calibri" ns0:cs="Calibri" ns0:eastAsia="Calibri"/>
         <ns0:b/>
         <ns0:bCs/>
       </ns0:rPr>
@@ -15897,7 +15897,7 @@
         <ns0:spacing ns0:before="0" ns0:after="0" ns0:line="240" ns0:lineRule="auto"/>
       </ns0:pPr>
       <ns0:rPr>
-        <ns0:rFonts ns0:cstheme="majorBidi" ns0:ascii="Calibri" ns0:hAnsi="Calibri" ns0:cs="Calibri" ns0:eastAsia="Calibri"/>
+        <ns0:rFonts ns0:ascii="Calibri" ns0:hAnsi="Calibri" ns0:cs="Calibri" ns0:eastAsia="Calibri"/>
         <ns0:b/>
         <ns0:bCs/>
       </ns0:rPr>
@@ -15915,14 +15915,14 @@
     </ns0:tblStylePr>
     <ns0:tblStylePr ns0:type="firstCol">
       <ns0:rPr>
-        <ns0:rFonts ns0:cstheme="majorBidi" ns0:ascii="Calibri" ns0:hAnsi="Calibri" ns0:cs="Calibri" ns0:eastAsia="Calibri"/>
+        <ns0:rFonts ns0:ascii="Calibri" ns0:hAnsi="Calibri" ns0:cs="Calibri" ns0:eastAsia="Calibri"/>
         <ns0:b/>
         <ns0:bCs/>
       </ns0:rPr>
     </ns0:tblStylePr>
     <ns0:tblStylePr ns0:type="lastCol">
       <ns0:rPr>
-        <ns0:rFonts ns0:cstheme="majorBidi" ns0:ascii="Calibri" ns0:hAnsi="Calibri" ns0:cs="Calibri" ns0:eastAsia="Calibri"/>
+        <ns0:rFonts ns0:ascii="Calibri" ns0:hAnsi="Calibri" ns0:cs="Calibri" ns0:eastAsia="Calibri"/>
         <ns0:b/>
         <ns0:bCs/>
       </ns0:rPr>
@@ -16006,7 +16006,7 @@
         <ns0:spacing ns0:before="0" ns0:after="0" ns0:line="240" ns0:lineRule="auto"/>
       </ns0:pPr>
       <ns0:rPr>
-        <ns0:rFonts ns0:cstheme="majorBidi" ns0:ascii="Calibri" ns0:hAnsi="Calibri" ns0:cs="Calibri" ns0:eastAsia="Calibri"/>
+        <ns0:rFonts ns0:ascii="Calibri" ns0:hAnsi="Calibri" ns0:cs="Calibri" ns0:eastAsia="Calibri"/>
         <ns0:b/>
         <ns0:bCs/>
       </ns0:rPr>
@@ -16027,7 +16027,7 @@
         <ns0:spacing ns0:before="0" ns0:after="0" ns0:line="240" ns0:lineRule="auto"/>
       </ns0:pPr>
       <ns0:rPr>
-        <ns0:rFonts ns0:cstheme="majorBidi" ns0:ascii="Calibri" ns0:hAnsi="Calibri" ns0:cs="Calibri" ns0:eastAsia="Calibri"/>
+        <ns0:rFonts ns0:ascii="Calibri" ns0:hAnsi="Calibri" ns0:cs="Calibri" ns0:eastAsia="Calibri"/>
         <ns0:b/>
         <ns0:bCs/>
       </ns0:rPr>
@@ -16045,14 +16045,14 @@
     </ns0:tblStylePr>
     <ns0:tblStylePr ns0:type="firstCol">
       <ns0:rPr>
-        <ns0:rFonts ns0:cstheme="majorBidi" ns0:ascii="Calibri" ns0:hAnsi="Calibri" ns0:cs="Calibri" ns0:eastAsia="Calibri"/>
+        <ns0:rFonts ns0:ascii="Calibri" ns0:hAnsi="Calibri" ns0:cs="Calibri" ns0:eastAsia="Calibri"/>
         <ns0:b/>
         <ns0:bCs/>
       </ns0:rPr>
     </ns0:tblStylePr>
     <ns0:tblStylePr ns0:type="lastCol">
       <ns0:rPr>
-        <ns0:rFonts ns0:cstheme="majorBidi" ns0:ascii="Calibri" ns0:hAnsi="Calibri" ns0:cs="Calibri" ns0:eastAsia="Calibri"/>
+        <ns0:rFonts ns0:ascii="Calibri" ns0:hAnsi="Calibri" ns0:cs="Calibri" ns0:eastAsia="Calibri"/>
         <ns0:b/>
         <ns0:bCs/>
       </ns0:rPr>
@@ -16136,7 +16136,7 @@
         <ns0:spacing ns0:before="0" ns0:after="0" ns0:line="240" ns0:lineRule="auto"/>
       </ns0:pPr>
       <ns0:rPr>
-        <ns0:rFonts ns0:cstheme="majorBidi" ns0:ascii="Calibri" ns0:hAnsi="Calibri" ns0:cs="Calibri" ns0:eastAsia="Calibri"/>
+        <ns0:rFonts ns0:ascii="Calibri" ns0:hAnsi="Calibri" ns0:cs="Calibri" ns0:eastAsia="Calibri"/>
         <ns0:b/>
         <ns0:bCs/>
       </ns0:rPr>
@@ -16157,7 +16157,7 @@
         <ns0:spacing ns0:before="0" ns0:after="0" ns0:line="240" ns0:lineRule="auto"/>
       </ns0:pPr>
       <ns0:rPr>
-        <ns0:rFonts ns0:cstheme="majorBidi" ns0:ascii="Calibri" ns0:hAnsi="Calibri" ns0:cs="Calibri" ns0:eastAsia="Calibri"/>
+        <ns0:rFonts ns0:ascii="Calibri" ns0:hAnsi="Calibri" ns0:cs="Calibri" ns0:eastAsia="Calibri"/>
         <ns0:b/>
         <ns0:bCs/>
       </ns0:rPr>
@@ -16175,14 +16175,14 @@
     </ns0:tblStylePr>
     <ns0:tblStylePr ns0:type="firstCol">
       <ns0:rPr>
-        <ns0:rFonts ns0:cstheme="majorBidi" ns0:ascii="Calibri" ns0:hAnsi="Calibri" ns0:cs="Calibri" ns0:eastAsia="Calibri"/>
+        <ns0:rFonts ns0:ascii="Calibri" ns0:hAnsi="Calibri" ns0:cs="Calibri" ns0:eastAsia="Calibri"/>
         <ns0:b/>
         <ns0:bCs/>
       </ns0:rPr>
     </ns0:tblStylePr>
     <ns0:tblStylePr ns0:type="lastCol">
       <ns0:rPr>
-        <ns0:rFonts ns0:cstheme="majorBidi" ns0:ascii="Calibri" ns0:hAnsi="Calibri" ns0:cs="Calibri" ns0:eastAsia="Calibri"/>
+        <ns0:rFonts ns0:ascii="Calibri" ns0:hAnsi="Calibri" ns0:cs="Calibri" ns0:eastAsia="Calibri"/>
         <ns0:b/>
         <ns0:bCs/>
       </ns0:rPr>
@@ -16266,7 +16266,7 @@
         <ns0:spacing ns0:before="0" ns0:after="0" ns0:line="240" ns0:lineRule="auto"/>
       </ns0:pPr>
       <ns0:rPr>
-        <ns0:rFonts ns0:cstheme="majorBidi" ns0:ascii="Calibri" ns0:hAnsi="Calibri" ns0:cs="Calibri" ns0:eastAsia="Calibri"/>
+        <ns0:rFonts ns0:ascii="Calibri" ns0:hAnsi="Calibri" ns0:cs="Calibri" ns0:eastAsia="Calibri"/>
         <ns0:b/>
         <ns0:bCs/>
       </ns0:rPr>
@@ -16287,7 +16287,7 @@
         <ns0:spacing ns0:before="0" ns0:after="0" ns0:line="240" ns0:lineRule="auto"/>
       </ns0:pPr>
       <ns0:rPr>
-        <ns0:rFonts ns0:cstheme="majorBidi" ns0:ascii="Calibri" ns0:hAnsi="Calibri" ns0:cs="Calibri" ns0:eastAsia="Calibri"/>
+        <ns0:rFonts ns0:ascii="Calibri" ns0:hAnsi="Calibri" ns0:cs="Calibri" ns0:eastAsia="Calibri"/>
         <ns0:b/>
         <ns0:bCs/>
       </ns0:rPr>
@@ -16305,14 +16305,14 @@
     </ns0:tblStylePr>
     <ns0:tblStylePr ns0:type="firstCol">
       <ns0:rPr>
-        <ns0:rFonts ns0:cstheme="majorBidi" ns0:ascii="Calibri" ns0:hAnsi="Calibri" ns0:cs="Calibri" ns0:eastAsia="Calibri"/>
+        <ns0:rFonts ns0:ascii="Calibri" ns0:hAnsi="Calibri" ns0:cs="Calibri" ns0:eastAsia="Calibri"/>
         <ns0:b/>
         <ns0:bCs/>
       </ns0:rPr>
     </ns0:tblStylePr>
     <ns0:tblStylePr ns0:type="lastCol">
       <ns0:rPr>
-        <ns0:rFonts ns0:cstheme="majorBidi" ns0:ascii="Calibri" ns0:hAnsi="Calibri" ns0:cs="Calibri" ns0:eastAsia="Calibri"/>
+        <ns0:rFonts ns0:ascii="Calibri" ns0:hAnsi="Calibri" ns0:cs="Calibri" ns0:eastAsia="Calibri"/>
         <ns0:b/>
         <ns0:bCs/>
       </ns0:rPr>
@@ -16396,7 +16396,7 @@
         <ns0:spacing ns0:before="0" ns0:after="0" ns0:line="240" ns0:lineRule="auto"/>
       </ns0:pPr>
       <ns0:rPr>
-        <ns0:rFonts ns0:cstheme="majorBidi" ns0:ascii="Calibri" ns0:hAnsi="Calibri" ns0:cs="Calibri" ns0:eastAsia="Calibri"/>
+        <ns0:rFonts ns0:ascii="Calibri" ns0:hAnsi="Calibri" ns0:cs="Calibri" ns0:eastAsia="Calibri"/>
         <ns0:b/>
         <ns0:bCs/>
       </ns0:rPr>
@@ -16417,7 +16417,7 @@
         <ns0:spacing ns0:before="0" ns0:after="0" ns0:line="240" ns0:lineRule="auto"/>
       </ns0:pPr>
       <ns0:rPr>
-        <ns0:rFonts ns0:cstheme="majorBidi" ns0:ascii="Calibri" ns0:hAnsi="Calibri" ns0:cs="Calibri" ns0:eastAsia="Calibri"/>
+        <ns0:rFonts ns0:ascii="Calibri" ns0:hAnsi="Calibri" ns0:cs="Calibri" ns0:eastAsia="Calibri"/>
         <ns0:b/>
         <ns0:bCs/>
       </ns0:rPr>
@@ -16435,14 +16435,14 @@
     </ns0:tblStylePr>
     <ns0:tblStylePr ns0:type="firstCol">
       <ns0:rPr>
-        <ns0:rFonts ns0:cstheme="majorBidi" ns0:ascii="Calibri" ns0:hAnsi="Calibri" ns0:cs="Calibri" ns0:eastAsia="Calibri"/>
+        <ns0:rFonts ns0:ascii="Calibri" ns0:hAnsi="Calibri" ns0:cs="Calibri" ns0:eastAsia="Calibri"/>
         <ns0:b/>
         <ns0:bCs/>
       </ns0:rPr>
     </ns0:tblStylePr>
     <ns0:tblStylePr ns0:type="lastCol">
       <ns0:rPr>
-        <ns0:rFonts ns0:cstheme="majorBidi" ns0:ascii="Calibri" ns0:hAnsi="Calibri" ns0:cs="Calibri" ns0:eastAsia="Calibri"/>
+        <ns0:rFonts ns0:ascii="Calibri" ns0:hAnsi="Calibri" ns0:cs="Calibri" ns0:eastAsia="Calibri"/>
         <ns0:b/>
         <ns0:bCs/>
       </ns0:rPr>
@@ -16526,7 +16526,7 @@
         <ns0:spacing ns0:before="0" ns0:after="0" ns0:line="240" ns0:lineRule="auto"/>
       </ns0:pPr>
       <ns0:rPr>
-        <ns0:rFonts ns0:cstheme="majorBidi" ns0:ascii="Calibri" ns0:hAnsi="Calibri" ns0:cs="Calibri" ns0:eastAsia="Calibri"/>
+        <ns0:rFonts ns0:ascii="Calibri" ns0:hAnsi="Calibri" ns0:cs="Calibri" ns0:eastAsia="Calibri"/>
         <ns0:b/>
         <ns0:bCs/>
       </ns0:rPr>
@@ -16547,7 +16547,7 @@
         <ns0:spacing ns0:before="0" ns0:after="0" ns0:line="240" ns0:lineRule="auto"/>
       </ns0:pPr>
       <ns0:rPr>
-        <ns0:rFonts ns0:cstheme="majorBidi" ns0:ascii="Calibri" ns0:hAnsi="Calibri" ns0:cs="Calibri" ns0:eastAsia="Calibri"/>
+        <ns0:rFonts ns0:ascii="Calibri" ns0:hAnsi="Calibri" ns0:cs="Calibri" ns0:eastAsia="Calibri"/>
         <ns0:b/>
         <ns0:bCs/>
       </ns0:rPr>
@@ -16565,14 +16565,14 @@
     </ns0:tblStylePr>
     <ns0:tblStylePr ns0:type="firstCol">
       <ns0:rPr>
-        <ns0:rFonts ns0:cstheme="majorBidi" ns0:ascii="Calibri" ns0:hAnsi="Calibri" ns0:cs="Calibri" ns0:eastAsia="Calibri"/>
+        <ns0:rFonts ns0:ascii="Calibri" ns0:hAnsi="Calibri" ns0:cs="Calibri" ns0:eastAsia="Calibri"/>
         <ns0:b/>
         <ns0:bCs/>
       </ns0:rPr>
     </ns0:tblStylePr>
     <ns0:tblStylePr ns0:type="lastCol">
       <ns0:rPr>
-        <ns0:rFonts ns0:cstheme="majorBidi" ns0:ascii="Calibri" ns0:hAnsi="Calibri" ns0:cs="Calibri" ns0:eastAsia="Calibri"/>
+        <ns0:rFonts ns0:ascii="Calibri" ns0:hAnsi="Calibri" ns0:cs="Calibri" ns0:eastAsia="Calibri"/>
         <ns0:b/>
         <ns0:bCs/>
       </ns0:rPr>
@@ -16656,7 +16656,7 @@
         <ns0:spacing ns0:before="0" ns0:after="0" ns0:line="240" ns0:lineRule="auto"/>
       </ns0:pPr>
       <ns0:rPr>
-        <ns0:rFonts ns0:cstheme="majorBidi" ns0:ascii="Calibri" ns0:hAnsi="Calibri" ns0:cs="Calibri" ns0:eastAsia="Calibri"/>
+        <ns0:rFonts ns0:ascii="Calibri" ns0:hAnsi="Calibri" ns0:cs="Calibri" ns0:eastAsia="Calibri"/>
         <ns0:b/>
         <ns0:bCs/>
       </ns0:rPr>
@@ -16677,7 +16677,7 @@
         <ns0:spacing ns0:before="0" ns0:after="0" ns0:line="240" ns0:lineRule="auto"/>
       </ns0:pPr>
       <ns0:rPr>
-        <ns0:rFonts ns0:cstheme="majorBidi" ns0:ascii="Calibri" ns0:hAnsi="Calibri" ns0:cs="Calibri" ns0:eastAsia="Calibri"/>
+        <ns0:rFonts ns0:ascii="Calibri" ns0:hAnsi="Calibri" ns0:cs="Calibri" ns0:eastAsia="Calibri"/>
         <ns0:b/>
         <ns0:bCs/>
       </ns0:rPr>
@@ -16695,14 +16695,14 @@
     </ns0:tblStylePr>
     <ns0:tblStylePr ns0:type="firstCol">
       <ns0:rPr>
-        <ns0:rFonts ns0:cstheme="majorBidi" ns0:ascii="Calibri" ns0:hAnsi="Calibri" ns0:cs="Calibri" ns0:eastAsia="Calibri"/>
+        <ns0:rFonts ns0:ascii="Calibri" ns0:hAnsi="Calibri" ns0:cs="Calibri" ns0:eastAsia="Calibri"/>
         <ns0:b/>
         <ns0:bCs/>
       </ns0:rPr>
     </ns0:tblStylePr>
     <ns0:tblStylePr ns0:type="lastCol">
       <ns0:rPr>
-        <ns0:rFonts ns0:cstheme="majorBidi" ns0:ascii="Calibri" ns0:hAnsi="Calibri" ns0:cs="Calibri" ns0:eastAsia="Calibri"/>
+        <ns0:rFonts ns0:ascii="Calibri" ns0:hAnsi="Calibri" ns0:cs="Calibri" ns0:eastAsia="Calibri"/>
         <ns0:b/>
         <ns0:bCs/>
       </ns0:rPr>
@@ -18567,7 +18567,7 @@
     </ns0:tblPr>
     <ns0:tblStylePr ns0:type="firstRow">
       <ns0:rPr>
-        <ns0:rFonts ns0:cstheme="majorBidi" ns0:ascii="Calibri" ns0:hAnsi="Calibri" ns0:cs="Calibri" ns0:eastAsia="Calibri"/>
+        <ns0:rFonts ns0:ascii="Calibri" ns0:hAnsi="Calibri" ns0:cs="Calibri" ns0:eastAsia="Calibri"/>
       </ns0:rPr>
       <ns0:tblPr/>
       <ns0:tcPr>
@@ -18651,7 +18651,7 @@
     </ns0:tblPr>
     <ns0:tblStylePr ns0:type="firstRow">
       <ns0:rPr>
-        <ns0:rFonts ns0:cstheme="majorBidi" ns0:ascii="Calibri" ns0:hAnsi="Calibri" ns0:cs="Calibri" ns0:eastAsia="Calibri"/>
+        <ns0:rFonts ns0:ascii="Calibri" ns0:hAnsi="Calibri" ns0:cs="Calibri" ns0:eastAsia="Calibri"/>
       </ns0:rPr>
       <ns0:tblPr/>
       <ns0:tcPr>
@@ -18735,7 +18735,7 @@
     </ns0:tblPr>
     <ns0:tblStylePr ns0:type="firstRow">
       <ns0:rPr>
-        <ns0:rFonts ns0:cstheme="majorBidi" ns0:ascii="Calibri" ns0:hAnsi="Calibri" ns0:cs="Calibri" ns0:eastAsia="Calibri"/>
+        <ns0:rFonts ns0:ascii="Calibri" ns0:hAnsi="Calibri" ns0:cs="Calibri" ns0:eastAsia="Calibri"/>
       </ns0:rPr>
       <ns0:tblPr/>
       <ns0:tcPr>
@@ -18819,7 +18819,7 @@
     </ns0:tblPr>
     <ns0:tblStylePr ns0:type="firstRow">
       <ns0:rPr>
-        <ns0:rFonts ns0:cstheme="majorBidi" ns0:ascii="Calibri" ns0:hAnsi="Calibri" ns0:cs="Calibri" ns0:eastAsia="Calibri"/>
+        <ns0:rFonts ns0:ascii="Calibri" ns0:hAnsi="Calibri" ns0:cs="Calibri" ns0:eastAsia="Calibri"/>
       </ns0:rPr>
       <ns0:tblPr/>
       <ns0:tcPr>
@@ -18903,7 +18903,7 @@
     </ns0:tblPr>
     <ns0:tblStylePr ns0:type="firstRow">
       <ns0:rPr>
-        <ns0:rFonts ns0:cstheme="majorBidi" ns0:ascii="Calibri" ns0:hAnsi="Calibri" ns0:cs="Calibri" ns0:eastAsia="Calibri"/>
+        <ns0:rFonts ns0:ascii="Calibri" ns0:hAnsi="Calibri" ns0:cs="Calibri" ns0:eastAsia="Calibri"/>
       </ns0:rPr>
       <ns0:tblPr/>
       <ns0:tcPr>
@@ -18987,7 +18987,7 @@
     </ns0:tblPr>
     <ns0:tblStylePr ns0:type="firstRow">
       <ns0:rPr>
-        <ns0:rFonts ns0:cstheme="majorBidi" ns0:ascii="Calibri" ns0:hAnsi="Calibri" ns0:cs="Calibri" ns0:eastAsia="Calibri"/>
+        <ns0:rFonts ns0:ascii="Calibri" ns0:hAnsi="Calibri" ns0:cs="Calibri" ns0:eastAsia="Calibri"/>
       </ns0:rPr>
       <ns0:tblPr/>
       <ns0:tcPr>
@@ -19071,7 +19071,7 @@
     </ns0:tblPr>
     <ns0:tblStylePr ns0:type="firstRow">
       <ns0:rPr>
-        <ns0:rFonts ns0:cstheme="majorBidi" ns0:ascii="Calibri" ns0:hAnsi="Calibri" ns0:cs="Calibri" ns0:eastAsia="Calibri"/>
+        <ns0:rFonts ns0:ascii="Calibri" ns0:hAnsi="Calibri" ns0:cs="Calibri" ns0:eastAsia="Calibri"/>
       </ns0:rPr>
       <ns0:tblPr/>
       <ns0:tcPr>
@@ -19136,7 +19136,7 @@
       <ns0:spacing ns0:after="0" ns0:line="240" ns0:lineRule="auto"/>
     </ns0:pPr>
     <ns0:rPr>
-      <ns0:rFonts ns0:cstheme="majorBidi" ns0:ascii="Calibri" ns0:hAnsi="Calibri" ns0:cs="Calibri" ns0:eastAsia="Calibri"/>
+      <ns0:rFonts ns0:ascii="Calibri" ns0:hAnsi="Calibri" ns0:cs="Calibri" ns0:eastAsia="Calibri"/>
       <ns0:color ns0:val="000000" ns0:themeColor="text1"/>
     </ns0:rPr>
     <ns0:tblPr>
@@ -19264,7 +19264,7 @@
       <ns0:spacing ns0:after="0" ns0:line="240" ns0:lineRule="auto"/>
     </ns0:pPr>
     <ns0:rPr>
-      <ns0:rFonts ns0:cstheme="majorBidi" ns0:ascii="Calibri" ns0:hAnsi="Calibri" ns0:cs="Calibri" ns0:eastAsia="Calibri"/>
+      <ns0:rFonts ns0:ascii="Calibri" ns0:hAnsi="Calibri" ns0:cs="Calibri" ns0:eastAsia="Calibri"/>
       <ns0:color ns0:val="000000" ns0:themeColor="text1"/>
     </ns0:rPr>
     <ns0:tblPr>
@@ -19392,7 +19392,7 @@
       <ns0:spacing ns0:after="0" ns0:line="240" ns0:lineRule="auto"/>
     </ns0:pPr>
     <ns0:rPr>
-      <ns0:rFonts ns0:cstheme="majorBidi" ns0:ascii="Calibri" ns0:hAnsi="Calibri" ns0:cs="Calibri" ns0:eastAsia="Calibri"/>
+      <ns0:rFonts ns0:ascii="Calibri" ns0:hAnsi="Calibri" ns0:cs="Calibri" ns0:eastAsia="Calibri"/>
       <ns0:color ns0:val="000000" ns0:themeColor="text1"/>
     </ns0:rPr>
     <ns0:tblPr>
@@ -19520,7 +19520,7 @@
       <ns0:spacing ns0:after="0" ns0:line="240" ns0:lineRule="auto"/>
     </ns0:pPr>
     <ns0:rPr>
-      <ns0:rFonts ns0:cstheme="majorBidi" ns0:ascii="Calibri" ns0:hAnsi="Calibri" ns0:cs="Calibri" ns0:eastAsia="Calibri"/>
+      <ns0:rFonts ns0:ascii="Calibri" ns0:hAnsi="Calibri" ns0:cs="Calibri" ns0:eastAsia="Calibri"/>
       <ns0:color ns0:val="000000" ns0:themeColor="text1"/>
     </ns0:rPr>
     <ns0:tblPr>
@@ -19648,7 +19648,7 @@
       <ns0:spacing ns0:after="0" ns0:line="240" ns0:lineRule="auto"/>
     </ns0:pPr>
     <ns0:rPr>
-      <ns0:rFonts ns0:cstheme="majorBidi" ns0:ascii="Calibri" ns0:hAnsi="Calibri" ns0:cs="Calibri" ns0:eastAsia="Calibri"/>
+      <ns0:rFonts ns0:ascii="Calibri" ns0:hAnsi="Calibri" ns0:cs="Calibri" ns0:eastAsia="Calibri"/>
       <ns0:color ns0:val="000000" ns0:themeColor="text1"/>
     </ns0:rPr>
     <ns0:tblPr>
@@ -19776,7 +19776,7 @@
       <ns0:spacing ns0:after="0" ns0:line="240" ns0:lineRule="auto"/>
     </ns0:pPr>
     <ns0:rPr>
-      <ns0:rFonts ns0:cstheme="majorBidi" ns0:ascii="Calibri" ns0:hAnsi="Calibri" ns0:cs="Calibri" ns0:eastAsia="Calibri"/>
+      <ns0:rFonts ns0:ascii="Calibri" ns0:hAnsi="Calibri" ns0:cs="Calibri" ns0:eastAsia="Calibri"/>
       <ns0:color ns0:val="000000" ns0:themeColor="text1"/>
     </ns0:rPr>
     <ns0:tblPr>
@@ -19904,7 +19904,7 @@
       <ns0:spacing ns0:after="0" ns0:line="240" ns0:lineRule="auto"/>
     </ns0:pPr>
     <ns0:rPr>
-      <ns0:rFonts ns0:cstheme="majorBidi" ns0:ascii="Calibri" ns0:hAnsi="Calibri" ns0:cs="Calibri" ns0:eastAsia="Calibri"/>
+      <ns0:rFonts ns0:ascii="Calibri" ns0:hAnsi="Calibri" ns0:cs="Calibri" ns0:eastAsia="Calibri"/>
       <ns0:color ns0:val="000000" ns0:themeColor="text1"/>
     </ns0:rPr>
     <ns0:tblPr>
@@ -20543,7 +20543,7 @@
       <ns0:spacing ns0:after="0" ns0:line="240" ns0:lineRule="auto"/>
     </ns0:pPr>
     <ns0:rPr>
-      <ns0:rFonts ns0:cstheme="majorBidi" ns0:ascii="Calibri" ns0:hAnsi="Calibri" ns0:cs="Calibri" ns0:eastAsia="Calibri"/>
+      <ns0:rFonts ns0:ascii="Calibri" ns0:hAnsi="Calibri" ns0:cs="Calibri" ns0:eastAsia="Calibri"/>
       <ns0:color ns0:val="000000" ns0:themeColor="text1"/>
     </ns0:rPr>
     <ns0:tblPr>
@@ -20668,7 +20668,7 @@
       <ns0:spacing ns0:after="0" ns0:line="240" ns0:lineRule="auto"/>
     </ns0:pPr>
     <ns0:rPr>
-      <ns0:rFonts ns0:cstheme="majorBidi" ns0:ascii="Calibri" ns0:hAnsi="Calibri" ns0:cs="Calibri" ns0:eastAsia="Calibri"/>
+      <ns0:rFonts ns0:ascii="Calibri" ns0:hAnsi="Calibri" ns0:cs="Calibri" ns0:eastAsia="Calibri"/>
       <ns0:color ns0:val="000000" ns0:themeColor="text1"/>
     </ns0:rPr>
     <ns0:tblPr>
@@ -20793,7 +20793,7 @@
       <ns0:spacing ns0:after="0" ns0:line="240" ns0:lineRule="auto"/>
     </ns0:pPr>
     <ns0:rPr>
-      <ns0:rFonts ns0:cstheme="majorBidi" ns0:ascii="Calibri" ns0:hAnsi="Calibri" ns0:cs="Calibri" ns0:eastAsia="Calibri"/>
+      <ns0:rFonts ns0:ascii="Calibri" ns0:hAnsi="Calibri" ns0:cs="Calibri" ns0:eastAsia="Calibri"/>
       <ns0:color ns0:val="000000" ns0:themeColor="text1"/>
     </ns0:rPr>
     <ns0:tblPr>
@@ -20918,7 +20918,7 @@
       <ns0:spacing ns0:after="0" ns0:line="240" ns0:lineRule="auto"/>
     </ns0:pPr>
     <ns0:rPr>
-      <ns0:rFonts ns0:cstheme="majorBidi" ns0:ascii="Calibri" ns0:hAnsi="Calibri" ns0:cs="Calibri" ns0:eastAsia="Calibri"/>
+      <ns0:rFonts ns0:ascii="Calibri" ns0:hAnsi="Calibri" ns0:cs="Calibri" ns0:eastAsia="Calibri"/>
       <ns0:color ns0:val="000000" ns0:themeColor="text1"/>
     </ns0:rPr>
     <ns0:tblPr>
@@ -21043,7 +21043,7 @@
       <ns0:spacing ns0:after="0" ns0:line="240" ns0:lineRule="auto"/>
     </ns0:pPr>
     <ns0:rPr>
-      <ns0:rFonts ns0:cstheme="majorBidi" ns0:ascii="Calibri" ns0:hAnsi="Calibri" ns0:cs="Calibri" ns0:eastAsia="Calibri"/>
+      <ns0:rFonts ns0:ascii="Calibri" ns0:hAnsi="Calibri" ns0:cs="Calibri" ns0:eastAsia="Calibri"/>
       <ns0:color ns0:val="000000" ns0:themeColor="text1"/>
     </ns0:rPr>
     <ns0:tblPr>
@@ -21168,7 +21168,7 @@
       <ns0:spacing ns0:after="0" ns0:line="240" ns0:lineRule="auto"/>
     </ns0:pPr>
     <ns0:rPr>
-      <ns0:rFonts ns0:cstheme="majorBidi" ns0:ascii="Calibri" ns0:hAnsi="Calibri" ns0:cs="Calibri" ns0:eastAsia="Calibri"/>
+      <ns0:rFonts ns0:ascii="Calibri" ns0:hAnsi="Calibri" ns0:cs="Calibri" ns0:eastAsia="Calibri"/>
       <ns0:color ns0:val="000000" ns0:themeColor="text1"/>
     </ns0:rPr>
     <ns0:tblPr>
@@ -21293,7 +21293,7 @@
       <ns0:spacing ns0:after="0" ns0:line="240" ns0:lineRule="auto"/>
     </ns0:pPr>
     <ns0:rPr>
-      <ns0:rFonts ns0:cstheme="majorBidi" ns0:ascii="Calibri" ns0:hAnsi="Calibri" ns0:cs="Calibri" ns0:eastAsia="Calibri"/>
+      <ns0:rFonts ns0:ascii="Calibri" ns0:hAnsi="Calibri" ns0:cs="Calibri" ns0:eastAsia="Calibri"/>
       <ns0:color ns0:val="000000" ns0:themeColor="text1"/>
     </ns0:rPr>
     <ns0:tblPr>

</xml_diff>